<commit_message>
Board and files updated
</commit_message>
<xml_diff>
--- a/Misc documents  and software/thanks for buying Zen.docx
+++ b/Misc documents  and software/thanks for buying Zen.docx
@@ -4,7 +4,7 @@
   <w:body>
     <w:p>
       <w:pPr>
-        <w:pStyle w:val="629"/>
+        <w:pStyle w:val="660"/>
         <w:pBdr/>
         <w:bidi w:val="false"/>
         <w:spacing/>
@@ -30,7 +30,7 @@
     </w:p>
     <w:p>
       <w:pPr>
-        <w:pStyle w:val="629"/>
+        <w:pStyle w:val="660"/>
         <w:pBdr/>
         <w:bidi w:val="false"/>
         <w:spacing/>
@@ -115,7 +115,7 @@
                 <o:lock v:ext="edit" aspectratio="t"/>
               </v:shapetype>
               <v:shape id="_x0000_i0" o:spid="_x0000_s0" type="#_x0000_t75" style="position:absolute;z-index:-2;o:allowoverlap:true;o:allowincell:true;mso-position-horizontal-relative:text;margin-left:105.75pt;mso-position-horizontal:absolute;mso-position-vertical-relative:text;margin-top:0.40pt;mso-position-vertical:absolute;width:47.75pt;height:46.40pt;mso-wrap-distance-left:0.00pt;mso-wrap-distance-top:0.00pt;mso-wrap-distance-right:0.00pt;mso-wrap-distance-bottom:0.00pt;z-index:1;" stroked="false">
-                <v:imagedata r:id="rId8" o:title=""/>
+                <v:imagedata r:id="rId8" o:title="" croptop="0f" cropleft="0f" cropbottom="1380f" cropright="0f"/>
                 <o:lock v:ext="edit" rotation="t"/>
               </v:shape>
             </w:pict>
@@ -144,7 +144,7 @@
     </w:p>
     <w:p>
       <w:pPr>
-        <w:pStyle w:val="629"/>
+        <w:pStyle w:val="660"/>
         <w:pBdr/>
         <w:bidi w:val="false"/>
         <w:spacing/>
@@ -180,7 +180,7 @@
     </w:p>
     <w:p>
       <w:pPr>
-        <w:pStyle w:val="629"/>
+        <w:pStyle w:val="660"/>
         <w:pBdr/>
         <w:bidi w:val="false"/>
         <w:spacing/>
@@ -215,7 +215,7 @@
     </w:p>
     <w:p>
       <w:pPr>
-        <w:pStyle w:val="629"/>
+        <w:pStyle w:val="660"/>
         <w:pBdr/>
         <w:bidi w:val="false"/>
         <w:spacing/>
@@ -251,7 +251,7 @@
     </w:p>
     <w:p>
       <w:pPr>
-        <w:pStyle w:val="629"/>
+        <w:pStyle w:val="660"/>
         <w:widowControl w:val="true"/>
         <w:pBdr/>
         <w:bidi w:val="false"/>
@@ -288,7 +288,7 @@
     </w:p>
     <w:p>
       <w:pPr>
-        <w:pStyle w:val="629"/>
+        <w:pStyle w:val="660"/>
         <w:widowControl w:val="true"/>
         <w:pBdr/>
         <w:bidi w:val="false"/>
@@ -321,7 +321,50 @@
           <w:sz w:val="15"/>
           <w:szCs w:val="15"/>
         </w:rPr>
-        <w:t xml:space="preserve">2014-10-17</w:t>
+        <w:t xml:space="preserve">20</w:t>
+      </w:r>
+      <w:r>
+        <w:rPr>
+          <w:rFonts w:ascii="Liberation Sans" w:hAnsi="Liberation Sans"/>
+          <w:b w:val="0"/>
+          <w:bCs w:val="0"/>
+          <w:sz w:val="15"/>
+          <w:szCs w:val="15"/>
+          <w:lang w:val="ja-JP"/>
+        </w:rPr>
+        <w:t xml:space="preserve">25</w:t>
+      </w:r>
+      <w:r>
+        <w:rPr>
+          <w:rFonts w:ascii="Liberation Sans" w:hAnsi="Liberation Sans"/>
+          <w:b w:val="0"/>
+          <w:bCs w:val="0"/>
+          <w:sz w:val="15"/>
+          <w:szCs w:val="15"/>
+        </w:rPr>
+        <w:t xml:space="preserve">-</w:t>
+      </w:r>
+      <w:r>
+        <w:rPr>
+          <w:rFonts w:ascii="Liberation Sans" w:hAnsi="Liberation Sans"/>
+          <w:b w:val="0"/>
+          <w:bCs w:val="0"/>
+          <w:sz w:val="15"/>
+          <w:szCs w:val="15"/>
+          <w:lang w:val="ja-JP"/>
+        </w:rPr>
+        <w:t xml:space="preserve">03</w:t>
+      </w:r>
+      <w:r>
+        <w:rPr>
+          <w:rFonts w:ascii="Liberation Sans" w:hAnsi="Liberation Sans"/>
+          <w:b w:val="0"/>
+          <w:bCs w:val="0"/>
+          <w:sz w:val="15"/>
+          <w:szCs w:val="15"/>
+          <w:lang w:val="ja-JP"/>
+        </w:rPr>
+        <w:t xml:space="preserve">-04</w:t>
       </w:r>
       <w:r>
         <w:rPr>
@@ -30198,8 +30241,8 @@
   </w:style>
   <w:style w:type="paragraph" w:styleId="138">
     <w:name w:val="Heading 1"/>
-    <w:basedOn w:val="629"/>
-    <w:next w:val="629"/>
+    <w:basedOn w:val="660"/>
+    <w:next w:val="660"/>
     <w:link w:val="149"/>
     <w:uiPriority w:val="9"/>
     <w:qFormat/>
@@ -30220,8 +30263,8 @@
   </w:style>
   <w:style w:type="paragraph" w:styleId="139">
     <w:name w:val="Heading 2"/>
-    <w:basedOn w:val="629"/>
-    <w:next w:val="629"/>
+    <w:basedOn w:val="660"/>
+    <w:next w:val="660"/>
     <w:link w:val="150"/>
     <w:uiPriority w:val="9"/>
     <w:unhideWhenUsed/>
@@ -30243,8 +30286,8 @@
   </w:style>
   <w:style w:type="paragraph" w:styleId="140">
     <w:name w:val="Heading 3"/>
-    <w:basedOn w:val="629"/>
-    <w:next w:val="629"/>
+    <w:basedOn w:val="660"/>
+    <w:next w:val="660"/>
     <w:link w:val="151"/>
     <w:uiPriority w:val="9"/>
     <w:unhideWhenUsed/>
@@ -30266,8 +30309,8 @@
   </w:style>
   <w:style w:type="paragraph" w:styleId="141">
     <w:name w:val="Heading 4"/>
-    <w:basedOn w:val="629"/>
-    <w:next w:val="629"/>
+    <w:basedOn w:val="660"/>
+    <w:next w:val="660"/>
     <w:link w:val="152"/>
     <w:uiPriority w:val="9"/>
     <w:unhideWhenUsed/>
@@ -30289,8 +30332,8 @@
   </w:style>
   <w:style w:type="paragraph" w:styleId="142">
     <w:name w:val="Heading 5"/>
-    <w:basedOn w:val="629"/>
-    <w:next w:val="629"/>
+    <w:basedOn w:val="660"/>
+    <w:next w:val="660"/>
     <w:link w:val="153"/>
     <w:uiPriority w:val="9"/>
     <w:unhideWhenUsed/>
@@ -30310,8 +30353,8 @@
   </w:style>
   <w:style w:type="paragraph" w:styleId="143">
     <w:name w:val="Heading 6"/>
-    <w:basedOn w:val="629"/>
-    <w:next w:val="629"/>
+    <w:basedOn w:val="660"/>
+    <w:next w:val="660"/>
     <w:link w:val="154"/>
     <w:uiPriority w:val="9"/>
     <w:unhideWhenUsed/>
@@ -30333,8 +30376,8 @@
   </w:style>
   <w:style w:type="paragraph" w:styleId="144">
     <w:name w:val="Heading 7"/>
-    <w:basedOn w:val="629"/>
-    <w:next w:val="629"/>
+    <w:basedOn w:val="660"/>
+    <w:next w:val="660"/>
     <w:link w:val="155"/>
     <w:uiPriority w:val="9"/>
     <w:unhideWhenUsed/>
@@ -30354,8 +30397,8 @@
   </w:style>
   <w:style w:type="paragraph" w:styleId="145">
     <w:name w:val="Heading 8"/>
-    <w:basedOn w:val="629"/>
-    <w:next w:val="629"/>
+    <w:basedOn w:val="660"/>
+    <w:next w:val="660"/>
     <w:link w:val="156"/>
     <w:uiPriority w:val="9"/>
     <w:unhideWhenUsed/>
@@ -30377,8 +30420,8 @@
   </w:style>
   <w:style w:type="paragraph" w:styleId="146">
     <w:name w:val="Heading 9"/>
-    <w:basedOn w:val="629"/>
-    <w:next w:val="629"/>
+    <w:basedOn w:val="660"/>
+    <w:next w:val="660"/>
     <w:link w:val="157"/>
     <w:uiPriority w:val="9"/>
     <w:unhideWhenUsed/>
@@ -30571,8 +30614,8 @@
   </w:style>
   <w:style w:type="paragraph" w:styleId="158">
     <w:name w:val="Title"/>
-    <w:basedOn w:val="629"/>
-    <w:next w:val="629"/>
+    <w:basedOn w:val="660"/>
+    <w:next w:val="660"/>
     <w:link w:val="159"/>
     <w:uiPriority w:val="10"/>
     <w:qFormat/>
@@ -30608,8 +30651,8 @@
   </w:style>
   <w:style w:type="paragraph" w:styleId="160">
     <w:name w:val="Subtitle"/>
-    <w:basedOn w:val="629"/>
-    <w:next w:val="629"/>
+    <w:basedOn w:val="660"/>
+    <w:next w:val="660"/>
     <w:link w:val="161"/>
     <w:uiPriority w:val="11"/>
     <w:qFormat/>
@@ -30647,8 +30690,8 @@
   </w:style>
   <w:style w:type="paragraph" w:styleId="162">
     <w:name w:val="Quote"/>
-    <w:basedOn w:val="629"/>
-    <w:next w:val="629"/>
+    <w:basedOn w:val="660"/>
+    <w:next w:val="660"/>
     <w:link w:val="163"/>
     <w:uiPriority w:val="29"/>
     <w:qFormat/>
@@ -30682,7 +30725,7 @@
   </w:style>
   <w:style w:type="paragraph" w:styleId="164">
     <w:name w:val="List Paragraph"/>
-    <w:basedOn w:val="629"/>
+    <w:basedOn w:val="660"/>
     <w:uiPriority w:val="34"/>
     <w:qFormat/>
     <w:pPr>
@@ -30710,8 +30753,8 @@
   </w:style>
   <w:style w:type="paragraph" w:styleId="166">
     <w:name w:val="Intense Quote"/>
-    <w:basedOn w:val="629"/>
-    <w:next w:val="629"/>
+    <w:basedOn w:val="660"/>
+    <w:next w:val="660"/>
     <w:link w:val="167"/>
     <w:uiPriority w:val="30"/>
     <w:qFormat/>
@@ -30766,7 +30809,7 @@
   </w:style>
   <w:style w:type="paragraph" w:styleId="169">
     <w:name w:val="No Spacing"/>
-    <w:basedOn w:val="629"/>
+    <w:basedOn w:val="660"/>
     <w:uiPriority w:val="1"/>
     <w:qFormat/>
     <w:pPr>
@@ -30856,7 +30899,7 @@
   </w:style>
   <w:style w:type="paragraph" w:styleId="175">
     <w:name w:val="Header"/>
-    <w:basedOn w:val="629"/>
+    <w:basedOn w:val="660"/>
     <w:link w:val="176"/>
     <w:uiPriority w:val="99"/>
     <w:unhideWhenUsed/>
@@ -30883,7 +30926,7 @@
   </w:style>
   <w:style w:type="paragraph" w:styleId="177">
     <w:name w:val="Footer"/>
-    <w:basedOn w:val="629"/>
+    <w:basedOn w:val="660"/>
     <w:link w:val="178"/>
     <w:uiPriority w:val="99"/>
     <w:unhideWhenUsed/>
@@ -30910,7 +30953,7 @@
   </w:style>
   <w:style w:type="paragraph" w:styleId="180">
     <w:name w:val="footnote text"/>
-    <w:basedOn w:val="629"/>
+    <w:basedOn w:val="660"/>
     <w:link w:val="181"/>
     <w:uiPriority w:val="99"/>
     <w:semiHidden/>
@@ -30958,7 +31001,7 @@
   </w:style>
   <w:style w:type="paragraph" w:styleId="183">
     <w:name w:val="endnote text"/>
-    <w:basedOn w:val="629"/>
+    <w:basedOn w:val="660"/>
     <w:link w:val="184"/>
     <w:uiPriority w:val="99"/>
     <w:semiHidden/>
@@ -31004,7 +31047,115 @@
       <w:vertAlign w:val="superscript"/>
     </w:rPr>
   </w:style>
-  <w:style w:type="paragraph" w:styleId="197">
+  <w:style w:type="paragraph" w:styleId="188">
+    <w:name w:val="toc 1"/>
+    <w:basedOn w:val="660"/>
+    <w:next w:val="660"/>
+    <w:uiPriority w:val="39"/>
+    <w:unhideWhenUsed/>
+    <w:pPr>
+      <w:pBdr/>
+      <w:spacing w:after="100"/>
+      <w:ind/>
+    </w:pPr>
+  </w:style>
+  <w:style w:type="paragraph" w:styleId="189">
+    <w:name w:val="toc 2"/>
+    <w:basedOn w:val="660"/>
+    <w:next w:val="660"/>
+    <w:uiPriority w:val="39"/>
+    <w:unhideWhenUsed/>
+    <w:pPr>
+      <w:pBdr/>
+      <w:spacing w:after="100"/>
+      <w:ind w:left="220"/>
+    </w:pPr>
+  </w:style>
+  <w:style w:type="paragraph" w:styleId="190">
+    <w:name w:val="toc 3"/>
+    <w:basedOn w:val="660"/>
+    <w:next w:val="660"/>
+    <w:uiPriority w:val="39"/>
+    <w:unhideWhenUsed/>
+    <w:pPr>
+      <w:pBdr/>
+      <w:spacing w:after="100"/>
+      <w:ind w:left="440"/>
+    </w:pPr>
+  </w:style>
+  <w:style w:type="paragraph" w:styleId="191">
+    <w:name w:val="toc 4"/>
+    <w:basedOn w:val="660"/>
+    <w:next w:val="660"/>
+    <w:uiPriority w:val="39"/>
+    <w:unhideWhenUsed/>
+    <w:pPr>
+      <w:pBdr/>
+      <w:spacing w:after="100"/>
+      <w:ind w:left="660"/>
+    </w:pPr>
+  </w:style>
+  <w:style w:type="paragraph" w:styleId="192">
+    <w:name w:val="toc 5"/>
+    <w:basedOn w:val="660"/>
+    <w:next w:val="660"/>
+    <w:uiPriority w:val="39"/>
+    <w:unhideWhenUsed/>
+    <w:pPr>
+      <w:pBdr/>
+      <w:spacing w:after="100"/>
+      <w:ind w:left="880"/>
+    </w:pPr>
+  </w:style>
+  <w:style w:type="paragraph" w:styleId="193">
+    <w:name w:val="toc 6"/>
+    <w:basedOn w:val="660"/>
+    <w:next w:val="660"/>
+    <w:uiPriority w:val="39"/>
+    <w:unhideWhenUsed/>
+    <w:pPr>
+      <w:pBdr/>
+      <w:spacing w:after="100"/>
+      <w:ind w:left="1100"/>
+    </w:pPr>
+  </w:style>
+  <w:style w:type="paragraph" w:styleId="194">
+    <w:name w:val="toc 7"/>
+    <w:basedOn w:val="660"/>
+    <w:next w:val="660"/>
+    <w:uiPriority w:val="39"/>
+    <w:unhideWhenUsed/>
+    <w:pPr>
+      <w:pBdr/>
+      <w:spacing w:after="100"/>
+      <w:ind w:left="1320"/>
+    </w:pPr>
+  </w:style>
+  <w:style w:type="paragraph" w:styleId="195">
+    <w:name w:val="toc 8"/>
+    <w:basedOn w:val="660"/>
+    <w:next w:val="660"/>
+    <w:uiPriority w:val="39"/>
+    <w:unhideWhenUsed/>
+    <w:pPr>
+      <w:pBdr/>
+      <w:spacing w:after="100"/>
+      <w:ind w:left="1540"/>
+    </w:pPr>
+  </w:style>
+  <w:style w:type="paragraph" w:styleId="196">
+    <w:name w:val="toc 9"/>
+    <w:basedOn w:val="660"/>
+    <w:next w:val="660"/>
+    <w:uiPriority w:val="39"/>
+    <w:unhideWhenUsed/>
+    <w:pPr>
+      <w:pBdr/>
+      <w:spacing w:after="100"/>
+      <w:ind w:left="1760"/>
+    </w:pPr>
+  </w:style>
+  <w:style w:type="paragraph" w:styleId="206">
     <w:name w:val="TOC Heading"/>
     <w:uiPriority w:val="39"/>
     <w:unhideWhenUsed/>
@@ -31014,10 +31165,10 @@
       <w:ind/>
     </w:pPr>
   </w:style>
-  <w:style w:type="paragraph" w:styleId="198">
+  <w:style w:type="paragraph" w:styleId="207">
     <w:name w:val="table of figures"/>
-    <w:basedOn w:val="629"/>
-    <w:next w:val="629"/>
+    <w:basedOn w:val="660"/>
+    <w:next w:val="660"/>
     <w:uiPriority w:val="99"/>
     <w:unhideWhenUsed/>
     <w:pPr>
@@ -31026,7 +31177,7 @@
       <w:ind/>
     </w:pPr>
   </w:style>
-  <w:style w:type="paragraph" w:styleId="629" w:default="1">
+  <w:style w:type="paragraph" w:styleId="660" w:default="1">
     <w:name w:val="Normal"/>
     <w:qFormat/>
     <w:pPr>
@@ -31045,7 +31196,7 @@
       <w:lang w:val="en-US" w:eastAsia="zh-CN" w:bidi="hi-IN"/>
     </w:rPr>
   </w:style>
-  <w:style w:type="character" w:styleId="630">
+  <w:style w:type="character" w:styleId="661">
     <w:name w:val="Hyperlink"/>
     <w:pPr>
       <w:pBdr/>
@@ -31057,7 +31208,7 @@
       <w:u w:val="single"/>
     </w:rPr>
   </w:style>
-  <w:style w:type="character" w:styleId="631">
+  <w:style w:type="character" w:styleId="662">
     <w:name w:val="FollowedHyperlink"/>
     <w:pPr>
       <w:pBdr/>
@@ -31069,10 +31220,10 @@
       <w:u w:val="single"/>
     </w:rPr>
   </w:style>
-  <w:style w:type="paragraph" w:styleId="632">
+  <w:style w:type="paragraph" w:styleId="663">
     <w:name w:val="Heading"/>
-    <w:basedOn w:val="629"/>
-    <w:next w:val="633"/>
+    <w:basedOn w:val="660"/>
+    <w:next w:val="664"/>
     <w:qFormat/>
     <w:pPr>
       <w:keepNext w:val="true"/>
@@ -31086,18 +31237,18 @@
       <w:szCs w:val="28"/>
     </w:rPr>
   </w:style>
-  <w:style w:type="paragraph" w:styleId="633">
+  <w:style w:type="paragraph" w:styleId="664">
     <w:name w:val="Body Text"/>
-    <w:basedOn w:val="629"/>
+    <w:basedOn w:val="660"/>
     <w:pPr>
       <w:pBdr/>
       <w:spacing w:after="140" w:before="0" w:line="276" w:lineRule="auto"/>
       <w:ind/>
     </w:pPr>
   </w:style>
-  <w:style w:type="paragraph" w:styleId="634">
+  <w:style w:type="paragraph" w:styleId="665">
     <w:name w:val="List"/>
-    <w:basedOn w:val="633"/>
+    <w:basedOn w:val="664"/>
     <w:pPr>
       <w:pBdr/>
       <w:spacing/>
@@ -31107,9 +31258,9 @@
       <w:rFonts w:cs="Lohit Devanagari"/>
     </w:rPr>
   </w:style>
-  <w:style w:type="paragraph" w:styleId="635">
+  <w:style w:type="paragraph" w:styleId="666">
     <w:name w:val="Caption"/>
-    <w:basedOn w:val="629"/>
+    <w:basedOn w:val="660"/>
     <w:qFormat/>
     <w:pPr>
       <w:suppressLineNumbers w:val="true"/>
@@ -31125,9 +31276,9 @@
       <w:szCs w:val="24"/>
     </w:rPr>
   </w:style>
-  <w:style w:type="paragraph" w:styleId="636">
+  <w:style w:type="paragraph" w:styleId="667">
     <w:name w:val="Index"/>
-    <w:basedOn w:val="629"/>
+    <w:basedOn w:val="660"/>
     <w:qFormat/>
     <w:pPr>
       <w:suppressLineNumbers w:val="true"/>

</xml_diff>

<commit_message>
Update bGeigieZen configuration and settings * Modified thanks for buying Zen.docx * Updated bGeigieZen V4.2.x.kicad_prl with new prototype zone fills and git integration settings * Updated bGeigieZen V4.2.x.kicad_pro with new design settings and error checking rules * Added new component class settings and tuning profile options * Updated error checking rules for footprints, symbols, and tracks * Added new warnings for missing tuning profiles, ground pins, and isolated pin labels
</commit_message>
<xml_diff>
--- a/Misc documents  and software/thanks for buying Zen.docx
+++ b/Misc documents  and software/thanks for buying Zen.docx
@@ -4,7 +4,7 @@
   <w:body>
     <w:p>
       <w:pPr>
-        <w:pStyle w:val="660"/>
+        <w:pStyle w:val="886"/>
         <w:pBdr/>
         <w:bidi w:val="false"/>
         <w:spacing/>
@@ -15,6 +15,12 @@
           <w:szCs w:val="12"/>
         </w:rPr>
       </w:pPr>
+      <w:r>
+        <w:rPr>
+          <w:sz w:val="12"/>
+          <w:szCs w:val="12"/>
+        </w:rPr>
+      </w:r>
       <w:r>
         <w:rPr>
           <w:sz w:val="12"/>
@@ -30,7 +36,7 @@
     </w:p>
     <w:p>
       <w:pPr>
-        <w:pStyle w:val="660"/>
+        <w:pStyle w:val="886"/>
         <w:pBdr/>
         <w:bidi w:val="false"/>
         <w:spacing/>
@@ -73,9 +79,9 @@
                         </pic:cNvPicPr>
                         <pic:nvPr/>
                       </pic:nvPicPr>
-                      <pic:blipFill>
+                      <pic:blipFill rotWithShape="1">
                         <a:blip r:embed="rId8"/>
-                        <a:srcRect l="0" t="0" r="0" b="2106"/>
+                        <a:srcRect l="0" t="0" r="0" b="2105"/>
                         <a:stretch/>
                       </pic:blipFill>
                       <pic:spPr bwMode="auto">
@@ -141,10 +147,19 @@
           <w:szCs w:val="15"/>
         </w:rPr>
       </w:r>
+      <w:r>
+        <w:rPr>
+          <w:rFonts w:ascii="Liberation Sans" w:hAnsi="Liberation Sans"/>
+          <w:b/>
+          <w:bCs/>
+          <w:sz w:val="15"/>
+          <w:szCs w:val="15"/>
+        </w:rPr>
+      </w:r>
     </w:p>
     <w:p>
       <w:pPr>
-        <w:pStyle w:val="660"/>
+        <w:pStyle w:val="886"/>
         <w:pBdr/>
         <w:bidi w:val="false"/>
         <w:spacing/>
@@ -177,10 +192,19 @@
           <w:szCs w:val="15"/>
         </w:rPr>
       </w:r>
+      <w:r>
+        <w:rPr>
+          <w:rFonts w:ascii="Liberation Sans" w:hAnsi="Liberation Sans"/>
+          <w:b/>
+          <w:bCs/>
+          <w:sz w:val="15"/>
+          <w:szCs w:val="15"/>
+        </w:rPr>
+      </w:r>
     </w:p>
     <w:p>
       <w:pPr>
-        <w:pStyle w:val="660"/>
+        <w:pStyle w:val="886"/>
         <w:pBdr/>
         <w:bidi w:val="false"/>
         <w:spacing/>
@@ -194,6 +218,15 @@
           <w:szCs w:val="4"/>
         </w:rPr>
       </w:pPr>
+      <w:r>
+        <w:rPr>
+          <w:rFonts w:ascii="Liberation Sans" w:hAnsi="Liberation Sans"/>
+          <w:b w:val="0"/>
+          <w:bCs w:val="0"/>
+          <w:sz w:val="4"/>
+          <w:szCs w:val="4"/>
+        </w:rPr>
+      </w:r>
       <w:r>
         <w:rPr>
           <w:rFonts w:ascii="Liberation Sans" w:hAnsi="Liberation Sans"/>
@@ -215,7 +248,7 @@
     </w:p>
     <w:p>
       <w:pPr>
-        <w:pStyle w:val="660"/>
+        <w:pStyle w:val="886"/>
         <w:pBdr/>
         <w:bidi w:val="false"/>
         <w:spacing/>
@@ -248,10 +281,19 @@
           <w:szCs w:val="15"/>
         </w:rPr>
       </w:r>
+      <w:r>
+        <w:rPr>
+          <w:rFonts w:ascii="Liberation Sans" w:hAnsi="Liberation Sans"/>
+          <w:b w:val="0"/>
+          <w:bCs w:val="0"/>
+          <w:sz w:val="15"/>
+          <w:szCs w:val="15"/>
+        </w:rPr>
+      </w:r>
     </w:p>
     <w:p>
       <w:pPr>
-        <w:pStyle w:val="660"/>
+        <w:pStyle w:val="886"/>
         <w:widowControl w:val="true"/>
         <w:pBdr/>
         <w:bidi w:val="false"/>
@@ -285,10 +327,19 @@
           <w:szCs w:val="15"/>
         </w:rPr>
       </w:r>
+      <w:r>
+        <w:rPr>
+          <w:rFonts w:ascii="Liberation Sans" w:hAnsi="Liberation Sans"/>
+          <w:b w:val="0"/>
+          <w:bCs w:val="0"/>
+          <w:sz w:val="15"/>
+          <w:szCs w:val="15"/>
+        </w:rPr>
+      </w:r>
     </w:p>
     <w:p>
       <w:pPr>
-        <w:pStyle w:val="660"/>
+        <w:pStyle w:val="886"/>
         <w:widowControl w:val="true"/>
         <w:pBdr/>
         <w:bidi w:val="false"/>
@@ -332,7 +383,7 @@
           <w:szCs w:val="15"/>
           <w:lang w:val="ja-JP"/>
         </w:rPr>
-        <w:t xml:space="preserve">25</w:t>
+        <w:t xml:space="preserve">26</w:t>
       </w:r>
       <w:r>
         <w:rPr>
@@ -353,7 +404,7 @@
           <w:szCs w:val="15"/>
           <w:lang w:val="ja-JP"/>
         </w:rPr>
-        <w:t xml:space="preserve">03</w:t>
+        <w:t xml:space="preserve">01</w:t>
       </w:r>
       <w:r>
         <w:rPr>
@@ -364,7 +415,16 @@
           <w:szCs w:val="15"/>
           <w:lang w:val="ja-JP"/>
         </w:rPr>
-        <w:t xml:space="preserve">-04</w:t>
+        <w:t xml:space="preserve">-31</w:t>
+      </w:r>
+      <w:r>
+        <w:rPr>
+          <w:rFonts w:ascii="Liberation Sans" w:hAnsi="Liberation Sans"/>
+          <w:b w:val="0"/>
+          <w:bCs w:val="0"/>
+          <w:sz w:val="15"/>
+          <w:szCs w:val="15"/>
+        </w:rPr>
       </w:r>
       <w:r>
         <w:rPr>
@@ -398,7 +458,6 @@
         <w:ind/>
         <w:rPr/>
       </w:pPr>
-      <w:r/>
       <w:r>
         <w:separator/>
       </w:r>
@@ -413,7 +472,6 @@
         <w:ind/>
         <w:rPr/>
       </w:pPr>
-      <w:r/>
       <w:r>
         <w:continuationSeparator/>
       </w:r>
@@ -433,7 +491,6 @@
         <w:ind/>
         <w:rPr/>
       </w:pPr>
-      <w:r/>
       <w:r>
         <w:separator/>
       </w:r>
@@ -448,7 +505,6 @@
         <w:ind/>
         <w:rPr/>
       </w:pPr>
-      <w:r/>
       <w:r>
         <w:continuationSeparator/>
       </w:r>
@@ -616,7 +672,21 @@
     <w:lsdException w:name="Bibliography" w:uiPriority="37"/>
     <w:lsdException w:name="TOC Heading" w:uiPriority="39" w:qFormat="1"/>
   </w:latentStyles>
-  <w:style w:type="table" w:styleId="10" w:default="1">
+  <w:style w:type="character" w:styleId="198">
+    <w:name w:val="Placeholder Text"/>
+    <w:basedOn w:val="837"/>
+    <w:uiPriority w:val="99"/>
+    <w:semiHidden/>
+    <w:pPr>
+      <w:pBdr/>
+      <w:spacing/>
+      <w:ind/>
+    </w:pPr>
+    <w:rPr>
+      <w:color w:val="666666"/>
+    </w:rPr>
+  </w:style>
+  <w:style w:type="table" w:styleId="701" w:default="1">
     <w:name w:val="Normal Table"/>
     <w:uiPriority w:val="99"/>
     <w:semiHidden/>
@@ -628,13 +698,13 @@
     </w:pPr>
     <w:tblPr>
       <w:tblInd w:w="0" w:type="dxa"/>
-      <w:tblBorders/>
       <w:tblCellMar>
         <w:left w:w="108" w:type="dxa"/>
         <w:top w:w="0" w:type="dxa"/>
         <w:right w:w="108" w:type="dxa"/>
         <w:bottom w:w="0" w:type="dxa"/>
       </w:tblCellMar>
+      <w:tblBorders/>
     </w:tblPr>
     <w:tcPr>
       <w:tcBorders/>
@@ -809,9 +879,9 @@
       </w:tcPr>
     </w:tblStylePr>
   </w:style>
-  <w:style w:type="table" w:styleId="11">
+  <w:style w:type="table" w:styleId="702">
     <w:name w:val="Table Grid"/>
-    <w:basedOn w:val="10"/>
+    <w:basedOn w:val="701"/>
     <w:uiPriority w:val="59"/>
     <w:pPr>
       <w:pBdr/>
@@ -820,6 +890,12 @@
     </w:pPr>
     <w:tblPr>
       <w:tblInd w:w="0" w:type="dxa"/>
+      <w:tblCellMar>
+        <w:left w:w="108" w:type="dxa"/>
+        <w:top w:w="0" w:type="dxa"/>
+        <w:right w:w="108" w:type="dxa"/>
+        <w:bottom w:w="0" w:type="dxa"/>
+      </w:tblCellMar>
       <w:tblBorders>
         <w:top w:val="single" w:color="000000" w:sz="4" w:space="0"/>
         <w:left w:val="single" w:color="000000" w:sz="4" w:space="0"/>
@@ -828,12 +904,6 @@
         <w:insideH w:val="single" w:color="000000" w:sz="4" w:space="0"/>
         <w:insideV w:val="single" w:color="000000" w:sz="4" w:space="0"/>
       </w:tblBorders>
-      <w:tblCellMar>
-        <w:left w:w="108" w:type="dxa"/>
-        <w:top w:w="0" w:type="dxa"/>
-        <w:right w:w="108" w:type="dxa"/>
-        <w:bottom w:w="0" w:type="dxa"/>
-      </w:tblCellMar>
     </w:tblPr>
     <w:tcPr>
       <w:tcBorders/>
@@ -1008,9 +1078,9 @@
       </w:tcPr>
     </w:tblStylePr>
   </w:style>
-  <w:style w:type="table" w:styleId="12">
+  <w:style w:type="table" w:styleId="703">
     <w:name w:val="Table Grid Light"/>
-    <w:basedOn w:val="10"/>
+    <w:basedOn w:val="701"/>
     <w:uiPriority w:val="59"/>
     <w:pPr>
       <w:pBdr/>
@@ -1019,6 +1089,12 @@
     </w:pPr>
     <w:tblPr>
       <w:tblInd w:w="0" w:type="dxa"/>
+      <w:tblCellMar>
+        <w:left w:w="108" w:type="dxa"/>
+        <w:top w:w="0" w:type="dxa"/>
+        <w:right w:w="108" w:type="dxa"/>
+        <w:bottom w:w="0" w:type="dxa"/>
+      </w:tblCellMar>
       <w:tblBorders>
         <w:top w:val="single" w:color="000000" w:themeColor="text1" w:themeTint="50" w:sz="4" w:space="0"/>
         <w:left w:val="single" w:color="000000" w:themeColor="text1" w:themeTint="50" w:sz="4" w:space="0"/>
@@ -1027,12 +1103,6 @@
         <w:insideH w:val="single" w:color="000000" w:themeColor="text1" w:themeTint="50" w:sz="4" w:space="0"/>
         <w:insideV w:val="single" w:color="000000" w:themeColor="text1" w:themeTint="50" w:sz="4" w:space="0"/>
       </w:tblBorders>
-      <w:tblCellMar>
-        <w:left w:w="108" w:type="dxa"/>
-        <w:top w:w="0" w:type="dxa"/>
-        <w:right w:w="108" w:type="dxa"/>
-        <w:bottom w:w="0" w:type="dxa"/>
-      </w:tblCellMar>
     </w:tblPr>
     <w:tcPr>
       <w:tcBorders/>
@@ -1207,9 +1277,9 @@
       </w:tcPr>
     </w:tblStylePr>
   </w:style>
-  <w:style w:type="table" w:styleId="13">
+  <w:style w:type="table" w:styleId="704">
     <w:name w:val="Plain Table 1"/>
-    <w:basedOn w:val="10"/>
+    <w:basedOn w:val="701"/>
     <w:uiPriority w:val="59"/>
     <w:pPr>
       <w:pBdr/>
@@ -1218,6 +1288,12 @@
     </w:pPr>
     <w:tblPr>
       <w:tblInd w:w="0" w:type="dxa"/>
+      <w:tblCellMar>
+        <w:left w:w="108" w:type="dxa"/>
+        <w:top w:w="0" w:type="dxa"/>
+        <w:right w:w="108" w:type="dxa"/>
+        <w:bottom w:w="0" w:type="dxa"/>
+      </w:tblCellMar>
       <w:tblBorders>
         <w:top w:val="single" w:color="000000" w:themeColor="text1" w:themeTint="50" w:sz="4" w:space="0"/>
         <w:left w:val="single" w:color="000000" w:themeColor="text1" w:themeTint="50" w:sz="4" w:space="0"/>
@@ -1226,12 +1302,6 @@
         <w:insideH w:val="single" w:color="000000" w:themeColor="text1" w:themeTint="50" w:sz="4" w:space="0"/>
         <w:insideV w:val="single" w:color="000000" w:themeColor="text1" w:themeTint="50" w:sz="4" w:space="0"/>
       </w:tblBorders>
-      <w:tblCellMar>
-        <w:left w:w="108" w:type="dxa"/>
-        <w:top w:w="0" w:type="dxa"/>
-        <w:right w:w="108" w:type="dxa"/>
-        <w:bottom w:w="0" w:type="dxa"/>
-      </w:tblCellMar>
     </w:tblPr>
     <w:tcPr>
       <w:tcBorders/>
@@ -1432,9 +1502,9 @@
       </w:tcPr>
     </w:tblStylePr>
   </w:style>
-  <w:style w:type="table" w:styleId="14">
+  <w:style w:type="table" w:styleId="705">
     <w:name w:val="Plain Table 2"/>
-    <w:basedOn w:val="10"/>
+    <w:basedOn w:val="701"/>
     <w:uiPriority w:val="59"/>
     <w:pPr>
       <w:pBdr/>
@@ -1443,18 +1513,18 @@
     </w:pPr>
     <w:tblPr>
       <w:tblInd w:w="0" w:type="dxa"/>
+      <w:tblCellMar>
+        <w:left w:w="108" w:type="dxa"/>
+        <w:top w:w="0" w:type="dxa"/>
+        <w:right w:w="108" w:type="dxa"/>
+        <w:bottom w:w="0" w:type="dxa"/>
+      </w:tblCellMar>
       <w:tblBorders>
         <w:top w:val="single" w:color="000000" w:themeColor="text1" w:sz="4" w:space="0"/>
         <w:left w:val="none" w:color="000000" w:themeColor="text1" w:sz="4" w:space="0"/>
         <w:bottom w:val="single" w:color="000000" w:themeColor="text1" w:sz="4" w:space="0"/>
         <w:right w:val="none" w:color="000000" w:themeColor="text1" w:sz="4" w:space="0"/>
       </w:tblBorders>
-      <w:tblCellMar>
-        <w:left w:w="108" w:type="dxa"/>
-        <w:top w:w="0" w:type="dxa"/>
-        <w:right w:w="108" w:type="dxa"/>
-        <w:bottom w:w="0" w:type="dxa"/>
-      </w:tblCellMar>
     </w:tblPr>
     <w:tcPr>
       <w:tcBorders/>
@@ -1665,9 +1735,9 @@
       </w:tcPr>
     </w:tblStylePr>
   </w:style>
-  <w:style w:type="table" w:styleId="15">
+  <w:style w:type="table" w:styleId="706">
     <w:name w:val="Plain Table 3"/>
-    <w:basedOn w:val="10"/>
+    <w:basedOn w:val="701"/>
     <w:uiPriority w:val="99"/>
     <w:pPr>
       <w:pBdr/>
@@ -1895,9 +1965,9 @@
       </w:tcPr>
     </w:tblStylePr>
   </w:style>
-  <w:style w:type="table" w:styleId="16">
+  <w:style w:type="table" w:styleId="707">
     <w:name w:val="Plain Table 4"/>
-    <w:basedOn w:val="10"/>
+    <w:basedOn w:val="701"/>
     <w:uiPriority w:val="99"/>
     <w:pPr>
       <w:pBdr/>
@@ -2111,9 +2181,9 @@
       </w:tcPr>
     </w:tblStylePr>
   </w:style>
-  <w:style w:type="table" w:styleId="17">
+  <w:style w:type="table" w:styleId="708">
     <w:name w:val="Plain Table 5"/>
-    <w:basedOn w:val="10"/>
+    <w:basedOn w:val="701"/>
     <w:uiPriority w:val="99"/>
     <w:pPr>
       <w:pBdr/>
@@ -2344,9 +2414,9 @@
       </w:tcPr>
     </w:tblStylePr>
   </w:style>
-  <w:style w:type="table" w:styleId="18">
+  <w:style w:type="table" w:styleId="709">
     <w:name w:val="Grid Table 1 Light"/>
-    <w:basedOn w:val="10"/>
+    <w:basedOn w:val="701"/>
     <w:uiPriority w:val="99"/>
     <w:pPr>
       <w:pBdr/>
@@ -2567,9 +2637,9 @@
       </w:tcPr>
     </w:tblStylePr>
   </w:style>
-  <w:style w:type="table" w:styleId="19">
+  <w:style w:type="table" w:styleId="710">
     <w:name w:val="Grid Table 1 Light - Accent 1"/>
-    <w:basedOn w:val="10"/>
+    <w:basedOn w:val="701"/>
     <w:uiPriority w:val="99"/>
     <w:pPr>
       <w:pBdr/>
@@ -2790,9 +2860,9 @@
       </w:tcPr>
     </w:tblStylePr>
   </w:style>
-  <w:style w:type="table" w:styleId="20">
+  <w:style w:type="table" w:styleId="711">
     <w:name w:val="Grid Table 1 Light - Accent 2"/>
-    <w:basedOn w:val="10"/>
+    <w:basedOn w:val="701"/>
     <w:uiPriority w:val="99"/>
     <w:pPr>
       <w:pBdr/>
@@ -3013,9 +3083,9 @@
       </w:tcPr>
     </w:tblStylePr>
   </w:style>
-  <w:style w:type="table" w:styleId="21">
+  <w:style w:type="table" w:styleId="712">
     <w:name w:val="Grid Table 1 Light - Accent 3"/>
-    <w:basedOn w:val="10"/>
+    <w:basedOn w:val="701"/>
     <w:uiPriority w:val="99"/>
     <w:pPr>
       <w:pBdr/>
@@ -3236,9 +3306,9 @@
       </w:tcPr>
     </w:tblStylePr>
   </w:style>
-  <w:style w:type="table" w:styleId="22">
+  <w:style w:type="table" w:styleId="713">
     <w:name w:val="Grid Table 1 Light - Accent 4"/>
-    <w:basedOn w:val="10"/>
+    <w:basedOn w:val="701"/>
     <w:uiPriority w:val="99"/>
     <w:pPr>
       <w:pBdr/>
@@ -3459,9 +3529,9 @@
       </w:tcPr>
     </w:tblStylePr>
   </w:style>
-  <w:style w:type="table" w:styleId="23">
+  <w:style w:type="table" w:styleId="714">
     <w:name w:val="Grid Table 1 Light - Accent 5"/>
-    <w:basedOn w:val="10"/>
+    <w:basedOn w:val="701"/>
     <w:uiPriority w:val="99"/>
     <w:pPr>
       <w:pBdr/>
@@ -3682,9 +3752,9 @@
       </w:tcPr>
     </w:tblStylePr>
   </w:style>
-  <w:style w:type="table" w:styleId="24">
+  <w:style w:type="table" w:styleId="715">
     <w:name w:val="Grid Table 1 Light - Accent 6"/>
-    <w:basedOn w:val="10"/>
+    <w:basedOn w:val="701"/>
     <w:uiPriority w:val="99"/>
     <w:pPr>
       <w:pBdr/>
@@ -3905,9 +3975,9 @@
       </w:tcPr>
     </w:tblStylePr>
   </w:style>
-  <w:style w:type="table" w:styleId="25">
+  <w:style w:type="table" w:styleId="716">
     <w:name w:val="Grid Table 2"/>
-    <w:basedOn w:val="10"/>
+    <w:basedOn w:val="701"/>
     <w:uiPriority w:val="99"/>
     <w:pPr>
       <w:pBdr/>
@@ -4137,9 +4207,9 @@
       </w:tcPr>
     </w:tblStylePr>
   </w:style>
-  <w:style w:type="table" w:styleId="26">
+  <w:style w:type="table" w:styleId="717">
     <w:name w:val="Grid Table 2 - Accent 1"/>
-    <w:basedOn w:val="10"/>
+    <w:basedOn w:val="701"/>
     <w:uiPriority w:val="99"/>
     <w:pPr>
       <w:pBdr/>
@@ -4369,9 +4439,9 @@
       </w:tcPr>
     </w:tblStylePr>
   </w:style>
-  <w:style w:type="table" w:styleId="27">
+  <w:style w:type="table" w:styleId="718">
     <w:name w:val="Grid Table 2 - Accent 2"/>
-    <w:basedOn w:val="10"/>
+    <w:basedOn w:val="701"/>
     <w:uiPriority w:val="99"/>
     <w:pPr>
       <w:pBdr/>
@@ -4601,9 +4671,9 @@
       </w:tcPr>
     </w:tblStylePr>
   </w:style>
-  <w:style w:type="table" w:styleId="28">
+  <w:style w:type="table" w:styleId="719">
     <w:name w:val="Grid Table 2 - Accent 3"/>
-    <w:basedOn w:val="10"/>
+    <w:basedOn w:val="701"/>
     <w:uiPriority w:val="99"/>
     <w:pPr>
       <w:pBdr/>
@@ -4833,9 +4903,9 @@
       </w:tcPr>
     </w:tblStylePr>
   </w:style>
-  <w:style w:type="table" w:styleId="29">
+  <w:style w:type="table" w:styleId="720">
     <w:name w:val="Grid Table 2 - Accent 4"/>
-    <w:basedOn w:val="10"/>
+    <w:basedOn w:val="701"/>
     <w:uiPriority w:val="99"/>
     <w:pPr>
       <w:pBdr/>
@@ -5065,9 +5135,9 @@
       </w:tcPr>
     </w:tblStylePr>
   </w:style>
-  <w:style w:type="table" w:styleId="30">
+  <w:style w:type="table" w:styleId="721">
     <w:name w:val="Grid Table 2 - Accent 5"/>
-    <w:basedOn w:val="10"/>
+    <w:basedOn w:val="701"/>
     <w:uiPriority w:val="99"/>
     <w:pPr>
       <w:pBdr/>
@@ -5297,9 +5367,9 @@
       </w:tcPr>
     </w:tblStylePr>
   </w:style>
-  <w:style w:type="table" w:styleId="31">
+  <w:style w:type="table" w:styleId="722">
     <w:name w:val="Grid Table 2 - Accent 6"/>
-    <w:basedOn w:val="10"/>
+    <w:basedOn w:val="701"/>
     <w:uiPriority w:val="99"/>
     <w:pPr>
       <w:pBdr/>
@@ -5529,9 +5599,9 @@
       </w:tcPr>
     </w:tblStylePr>
   </w:style>
-  <w:style w:type="table" w:styleId="32">
+  <w:style w:type="table" w:styleId="723">
     <w:name w:val="Grid Table 3"/>
-    <w:basedOn w:val="10"/>
+    <w:basedOn w:val="701"/>
     <w:uiPriority w:val="99"/>
     <w:pPr>
       <w:pBdr/>
@@ -5630,29 +5700,6 @@
         <w:tblBorders/>
       </w:tblPr>
       <w:tcPr>
-        <w:shd w:color="ffffff"/>
-        <w:tcBorders>
-          <w:top w:val="none" w:color="000000" w:sz="4" w:space="0"/>
-          <w:left w:val="none" w:color="000000" w:sz="4" w:space="0"/>
-          <w:bottom w:val="none" w:color="000000" w:sz="4" w:space="0"/>
-          <w:right w:val="none" w:color="000000" w:sz="4" w:space="0"/>
-        </w:tcBorders>
-      </w:tcPr>
-    </w:tblStylePr>
-    <w:tblStylePr w:type="firstRow">
-      <w:rPr>
-        <w:b/>
-        <w:color w:val="404040"/>
-      </w:rPr>
-      <w:pPr>
-        <w:pBdr/>
-        <w:spacing/>
-        <w:ind/>
-      </w:pPr>
-      <w:tblPr>
-        <w:tblBorders/>
-      </w:tblPr>
-      <w:tcPr>
         <w:shd w:val="clear" w:color="ffffff"/>
         <w:tcBorders>
           <w:top w:val="none" w:color="000000" w:sz="4" w:space="0"/>
@@ -5662,30 +5709,7 @@
         </w:tcBorders>
       </w:tcPr>
     </w:tblStylePr>
-    <w:tblStylePr w:type="lastCol">
-      <w:rPr>
-        <w:i/>
-        <w:color w:val="404040"/>
-      </w:rPr>
-      <w:pPr>
-        <w:pBdr/>
-        <w:spacing/>
-        <w:ind/>
-      </w:pPr>
-      <w:tblPr>
-        <w:tblBorders/>
-      </w:tblPr>
-      <w:tcPr>
-        <w:shd w:color="ffffff"/>
-        <w:tcBorders>
-          <w:top w:val="none" w:color="000000" w:sz="4" w:space="0"/>
-          <w:left w:val="none" w:color="000000" w:sz="4" w:space="0"/>
-          <w:bottom w:val="none" w:color="000000" w:sz="4" w:space="0"/>
-          <w:right w:val="none" w:color="000000" w:sz="4" w:space="0"/>
-        </w:tcBorders>
-      </w:tcPr>
-    </w:tblStylePr>
-    <w:tblStylePr w:type="lastRow">
+    <w:tblStylePr w:type="firstRow">
       <w:rPr>
         <w:b/>
         <w:color w:val="404040"/>
@@ -5708,6 +5732,52 @@
         </w:tcBorders>
       </w:tcPr>
     </w:tblStylePr>
+    <w:tblStylePr w:type="lastCol">
+      <w:rPr>
+        <w:i/>
+        <w:color w:val="404040"/>
+      </w:rPr>
+      <w:pPr>
+        <w:pBdr/>
+        <w:spacing/>
+        <w:ind/>
+      </w:pPr>
+      <w:tblPr>
+        <w:tblBorders/>
+      </w:tblPr>
+      <w:tcPr>
+        <w:shd w:val="clear" w:color="ffffff"/>
+        <w:tcBorders>
+          <w:top w:val="none" w:color="000000" w:sz="4" w:space="0"/>
+          <w:left w:val="none" w:color="000000" w:sz="4" w:space="0"/>
+          <w:bottom w:val="none" w:color="000000" w:sz="4" w:space="0"/>
+          <w:right w:val="none" w:color="000000" w:sz="4" w:space="0"/>
+        </w:tcBorders>
+      </w:tcPr>
+    </w:tblStylePr>
+    <w:tblStylePr w:type="lastRow">
+      <w:rPr>
+        <w:b/>
+        <w:color w:val="404040"/>
+      </w:rPr>
+      <w:pPr>
+        <w:pBdr/>
+        <w:spacing/>
+        <w:ind/>
+      </w:pPr>
+      <w:tblPr>
+        <w:tblBorders/>
+      </w:tblPr>
+      <w:tcPr>
+        <w:shd w:val="clear" w:color="ffffff"/>
+        <w:tcBorders>
+          <w:top w:val="none" w:color="000000" w:sz="4" w:space="0"/>
+          <w:left w:val="none" w:color="000000" w:sz="4" w:space="0"/>
+          <w:bottom w:val="none" w:color="000000" w:sz="4" w:space="0"/>
+          <w:right w:val="none" w:color="000000" w:sz="4" w:space="0"/>
+        </w:tcBorders>
+      </w:tcPr>
+    </w:tblStylePr>
     <w:tblStylePr w:type="nwCell">
       <w:pPr>
         <w:pBdr/>
@@ -5774,9 +5844,9 @@
       </w:tcPr>
     </w:tblStylePr>
   </w:style>
-  <w:style w:type="table" w:styleId="33">
+  <w:style w:type="table" w:styleId="724">
     <w:name w:val="Grid Table 3 - Accent 1"/>
-    <w:basedOn w:val="10"/>
+    <w:basedOn w:val="701"/>
     <w:uiPriority w:val="99"/>
     <w:pPr>
       <w:pBdr/>
@@ -5875,29 +5945,6 @@
         <w:tblBorders/>
       </w:tblPr>
       <w:tcPr>
-        <w:shd w:color="ffffff"/>
-        <w:tcBorders>
-          <w:top w:val="none" w:color="000000" w:sz="4" w:space="0"/>
-          <w:left w:val="none" w:color="000000" w:sz="4" w:space="0"/>
-          <w:bottom w:val="none" w:color="000000" w:sz="4" w:space="0"/>
-          <w:right w:val="none" w:color="000000" w:sz="4" w:space="0"/>
-        </w:tcBorders>
-      </w:tcPr>
-    </w:tblStylePr>
-    <w:tblStylePr w:type="firstRow">
-      <w:rPr>
-        <w:b/>
-        <w:color w:val="404040"/>
-      </w:rPr>
-      <w:pPr>
-        <w:pBdr/>
-        <w:spacing/>
-        <w:ind/>
-      </w:pPr>
-      <w:tblPr>
-        <w:tblBorders/>
-      </w:tblPr>
-      <w:tcPr>
         <w:shd w:val="clear" w:color="ffffff"/>
         <w:tcBorders>
           <w:top w:val="none" w:color="000000" w:sz="4" w:space="0"/>
@@ -5907,30 +5954,7 @@
         </w:tcBorders>
       </w:tcPr>
     </w:tblStylePr>
-    <w:tblStylePr w:type="lastCol">
-      <w:rPr>
-        <w:i/>
-        <w:color w:val="404040"/>
-      </w:rPr>
-      <w:pPr>
-        <w:pBdr/>
-        <w:spacing/>
-        <w:ind/>
-      </w:pPr>
-      <w:tblPr>
-        <w:tblBorders/>
-      </w:tblPr>
-      <w:tcPr>
-        <w:shd w:color="ffffff"/>
-        <w:tcBorders>
-          <w:top w:val="none" w:color="000000" w:sz="4" w:space="0"/>
-          <w:left w:val="none" w:color="000000" w:sz="4" w:space="0"/>
-          <w:bottom w:val="none" w:color="000000" w:sz="4" w:space="0"/>
-          <w:right w:val="none" w:color="000000" w:sz="4" w:space="0"/>
-        </w:tcBorders>
-      </w:tcPr>
-    </w:tblStylePr>
-    <w:tblStylePr w:type="lastRow">
+    <w:tblStylePr w:type="firstRow">
       <w:rPr>
         <w:b/>
         <w:color w:val="404040"/>
@@ -5953,6 +5977,52 @@
         </w:tcBorders>
       </w:tcPr>
     </w:tblStylePr>
+    <w:tblStylePr w:type="lastCol">
+      <w:rPr>
+        <w:i/>
+        <w:color w:val="404040"/>
+      </w:rPr>
+      <w:pPr>
+        <w:pBdr/>
+        <w:spacing/>
+        <w:ind/>
+      </w:pPr>
+      <w:tblPr>
+        <w:tblBorders/>
+      </w:tblPr>
+      <w:tcPr>
+        <w:shd w:val="clear" w:color="ffffff"/>
+        <w:tcBorders>
+          <w:top w:val="none" w:color="000000" w:sz="4" w:space="0"/>
+          <w:left w:val="none" w:color="000000" w:sz="4" w:space="0"/>
+          <w:bottom w:val="none" w:color="000000" w:sz="4" w:space="0"/>
+          <w:right w:val="none" w:color="000000" w:sz="4" w:space="0"/>
+        </w:tcBorders>
+      </w:tcPr>
+    </w:tblStylePr>
+    <w:tblStylePr w:type="lastRow">
+      <w:rPr>
+        <w:b/>
+        <w:color w:val="404040"/>
+      </w:rPr>
+      <w:pPr>
+        <w:pBdr/>
+        <w:spacing/>
+        <w:ind/>
+      </w:pPr>
+      <w:tblPr>
+        <w:tblBorders/>
+      </w:tblPr>
+      <w:tcPr>
+        <w:shd w:val="clear" w:color="ffffff"/>
+        <w:tcBorders>
+          <w:top w:val="none" w:color="000000" w:sz="4" w:space="0"/>
+          <w:left w:val="none" w:color="000000" w:sz="4" w:space="0"/>
+          <w:bottom w:val="none" w:color="000000" w:sz="4" w:space="0"/>
+          <w:right w:val="none" w:color="000000" w:sz="4" w:space="0"/>
+        </w:tcBorders>
+      </w:tcPr>
+    </w:tblStylePr>
     <w:tblStylePr w:type="nwCell">
       <w:pPr>
         <w:pBdr/>
@@ -6019,9 +6089,9 @@
       </w:tcPr>
     </w:tblStylePr>
   </w:style>
-  <w:style w:type="table" w:styleId="34">
+  <w:style w:type="table" w:styleId="725">
     <w:name w:val="Grid Table 3 - Accent 2"/>
-    <w:basedOn w:val="10"/>
+    <w:basedOn w:val="701"/>
     <w:uiPriority w:val="99"/>
     <w:pPr>
       <w:pBdr/>
@@ -6120,29 +6190,6 @@
         <w:tblBorders/>
       </w:tblPr>
       <w:tcPr>
-        <w:shd w:color="ffffff"/>
-        <w:tcBorders>
-          <w:top w:val="none" w:color="000000" w:sz="4" w:space="0"/>
-          <w:left w:val="none" w:color="000000" w:sz="4" w:space="0"/>
-          <w:bottom w:val="none" w:color="000000" w:sz="4" w:space="0"/>
-          <w:right w:val="none" w:color="000000" w:sz="4" w:space="0"/>
-        </w:tcBorders>
-      </w:tcPr>
-    </w:tblStylePr>
-    <w:tblStylePr w:type="firstRow">
-      <w:rPr>
-        <w:b/>
-        <w:color w:val="404040"/>
-      </w:rPr>
-      <w:pPr>
-        <w:pBdr/>
-        <w:spacing/>
-        <w:ind/>
-      </w:pPr>
-      <w:tblPr>
-        <w:tblBorders/>
-      </w:tblPr>
-      <w:tcPr>
         <w:shd w:val="clear" w:color="ffffff"/>
         <w:tcBorders>
           <w:top w:val="none" w:color="000000" w:sz="4" w:space="0"/>
@@ -6152,30 +6199,7 @@
         </w:tcBorders>
       </w:tcPr>
     </w:tblStylePr>
-    <w:tblStylePr w:type="lastCol">
-      <w:rPr>
-        <w:i/>
-        <w:color w:val="404040"/>
-      </w:rPr>
-      <w:pPr>
-        <w:pBdr/>
-        <w:spacing/>
-        <w:ind/>
-      </w:pPr>
-      <w:tblPr>
-        <w:tblBorders/>
-      </w:tblPr>
-      <w:tcPr>
-        <w:shd w:color="ffffff"/>
-        <w:tcBorders>
-          <w:top w:val="none" w:color="000000" w:sz="4" w:space="0"/>
-          <w:left w:val="none" w:color="000000" w:sz="4" w:space="0"/>
-          <w:bottom w:val="none" w:color="000000" w:sz="4" w:space="0"/>
-          <w:right w:val="none" w:color="000000" w:sz="4" w:space="0"/>
-        </w:tcBorders>
-      </w:tcPr>
-    </w:tblStylePr>
-    <w:tblStylePr w:type="lastRow">
+    <w:tblStylePr w:type="firstRow">
       <w:rPr>
         <w:b/>
         <w:color w:val="404040"/>
@@ -6198,6 +6222,52 @@
         </w:tcBorders>
       </w:tcPr>
     </w:tblStylePr>
+    <w:tblStylePr w:type="lastCol">
+      <w:rPr>
+        <w:i/>
+        <w:color w:val="404040"/>
+      </w:rPr>
+      <w:pPr>
+        <w:pBdr/>
+        <w:spacing/>
+        <w:ind/>
+      </w:pPr>
+      <w:tblPr>
+        <w:tblBorders/>
+      </w:tblPr>
+      <w:tcPr>
+        <w:shd w:val="clear" w:color="ffffff"/>
+        <w:tcBorders>
+          <w:top w:val="none" w:color="000000" w:sz="4" w:space="0"/>
+          <w:left w:val="none" w:color="000000" w:sz="4" w:space="0"/>
+          <w:bottom w:val="none" w:color="000000" w:sz="4" w:space="0"/>
+          <w:right w:val="none" w:color="000000" w:sz="4" w:space="0"/>
+        </w:tcBorders>
+      </w:tcPr>
+    </w:tblStylePr>
+    <w:tblStylePr w:type="lastRow">
+      <w:rPr>
+        <w:b/>
+        <w:color w:val="404040"/>
+      </w:rPr>
+      <w:pPr>
+        <w:pBdr/>
+        <w:spacing/>
+        <w:ind/>
+      </w:pPr>
+      <w:tblPr>
+        <w:tblBorders/>
+      </w:tblPr>
+      <w:tcPr>
+        <w:shd w:val="clear" w:color="ffffff"/>
+        <w:tcBorders>
+          <w:top w:val="none" w:color="000000" w:sz="4" w:space="0"/>
+          <w:left w:val="none" w:color="000000" w:sz="4" w:space="0"/>
+          <w:bottom w:val="none" w:color="000000" w:sz="4" w:space="0"/>
+          <w:right w:val="none" w:color="000000" w:sz="4" w:space="0"/>
+        </w:tcBorders>
+      </w:tcPr>
+    </w:tblStylePr>
     <w:tblStylePr w:type="nwCell">
       <w:pPr>
         <w:pBdr/>
@@ -6264,9 +6334,9 @@
       </w:tcPr>
     </w:tblStylePr>
   </w:style>
-  <w:style w:type="table" w:styleId="35">
+  <w:style w:type="table" w:styleId="726">
     <w:name w:val="Grid Table 3 - Accent 3"/>
-    <w:basedOn w:val="10"/>
+    <w:basedOn w:val="701"/>
     <w:uiPriority w:val="99"/>
     <w:pPr>
       <w:pBdr/>
@@ -6365,29 +6435,6 @@
         <w:tblBorders/>
       </w:tblPr>
       <w:tcPr>
-        <w:shd w:color="ffffff"/>
-        <w:tcBorders>
-          <w:top w:val="none" w:color="000000" w:sz="4" w:space="0"/>
-          <w:left w:val="none" w:color="000000" w:sz="4" w:space="0"/>
-          <w:bottom w:val="none" w:color="000000" w:sz="4" w:space="0"/>
-          <w:right w:val="none" w:color="000000" w:sz="4" w:space="0"/>
-        </w:tcBorders>
-      </w:tcPr>
-    </w:tblStylePr>
-    <w:tblStylePr w:type="firstRow">
-      <w:rPr>
-        <w:b/>
-        <w:color w:val="404040"/>
-      </w:rPr>
-      <w:pPr>
-        <w:pBdr/>
-        <w:spacing/>
-        <w:ind/>
-      </w:pPr>
-      <w:tblPr>
-        <w:tblBorders/>
-      </w:tblPr>
-      <w:tcPr>
         <w:shd w:val="clear" w:color="ffffff"/>
         <w:tcBorders>
           <w:top w:val="none" w:color="000000" w:sz="4" w:space="0"/>
@@ -6397,30 +6444,7 @@
         </w:tcBorders>
       </w:tcPr>
     </w:tblStylePr>
-    <w:tblStylePr w:type="lastCol">
-      <w:rPr>
-        <w:i/>
-        <w:color w:val="404040"/>
-      </w:rPr>
-      <w:pPr>
-        <w:pBdr/>
-        <w:spacing/>
-        <w:ind/>
-      </w:pPr>
-      <w:tblPr>
-        <w:tblBorders/>
-      </w:tblPr>
-      <w:tcPr>
-        <w:shd w:color="ffffff"/>
-        <w:tcBorders>
-          <w:top w:val="none" w:color="000000" w:sz="4" w:space="0"/>
-          <w:left w:val="none" w:color="000000" w:sz="4" w:space="0"/>
-          <w:bottom w:val="none" w:color="000000" w:sz="4" w:space="0"/>
-          <w:right w:val="none" w:color="000000" w:sz="4" w:space="0"/>
-        </w:tcBorders>
-      </w:tcPr>
-    </w:tblStylePr>
-    <w:tblStylePr w:type="lastRow">
+    <w:tblStylePr w:type="firstRow">
       <w:rPr>
         <w:b/>
         <w:color w:val="404040"/>
@@ -6443,6 +6467,52 @@
         </w:tcBorders>
       </w:tcPr>
     </w:tblStylePr>
+    <w:tblStylePr w:type="lastCol">
+      <w:rPr>
+        <w:i/>
+        <w:color w:val="404040"/>
+      </w:rPr>
+      <w:pPr>
+        <w:pBdr/>
+        <w:spacing/>
+        <w:ind/>
+      </w:pPr>
+      <w:tblPr>
+        <w:tblBorders/>
+      </w:tblPr>
+      <w:tcPr>
+        <w:shd w:val="clear" w:color="ffffff"/>
+        <w:tcBorders>
+          <w:top w:val="none" w:color="000000" w:sz="4" w:space="0"/>
+          <w:left w:val="none" w:color="000000" w:sz="4" w:space="0"/>
+          <w:bottom w:val="none" w:color="000000" w:sz="4" w:space="0"/>
+          <w:right w:val="none" w:color="000000" w:sz="4" w:space="0"/>
+        </w:tcBorders>
+      </w:tcPr>
+    </w:tblStylePr>
+    <w:tblStylePr w:type="lastRow">
+      <w:rPr>
+        <w:b/>
+        <w:color w:val="404040"/>
+      </w:rPr>
+      <w:pPr>
+        <w:pBdr/>
+        <w:spacing/>
+        <w:ind/>
+      </w:pPr>
+      <w:tblPr>
+        <w:tblBorders/>
+      </w:tblPr>
+      <w:tcPr>
+        <w:shd w:val="clear" w:color="ffffff"/>
+        <w:tcBorders>
+          <w:top w:val="none" w:color="000000" w:sz="4" w:space="0"/>
+          <w:left w:val="none" w:color="000000" w:sz="4" w:space="0"/>
+          <w:bottom w:val="none" w:color="000000" w:sz="4" w:space="0"/>
+          <w:right w:val="none" w:color="000000" w:sz="4" w:space="0"/>
+        </w:tcBorders>
+      </w:tcPr>
+    </w:tblStylePr>
     <w:tblStylePr w:type="nwCell">
       <w:pPr>
         <w:pBdr/>
@@ -6509,9 +6579,9 @@
       </w:tcPr>
     </w:tblStylePr>
   </w:style>
-  <w:style w:type="table" w:styleId="36">
+  <w:style w:type="table" w:styleId="727">
     <w:name w:val="Grid Table 3 - Accent 4"/>
-    <w:basedOn w:val="10"/>
+    <w:basedOn w:val="701"/>
     <w:uiPriority w:val="99"/>
     <w:pPr>
       <w:pBdr/>
@@ -6610,29 +6680,6 @@
         <w:tblBorders/>
       </w:tblPr>
       <w:tcPr>
-        <w:shd w:color="ffffff"/>
-        <w:tcBorders>
-          <w:top w:val="none" w:color="000000" w:sz="4" w:space="0"/>
-          <w:left w:val="none" w:color="000000" w:sz="4" w:space="0"/>
-          <w:bottom w:val="none" w:color="000000" w:sz="4" w:space="0"/>
-          <w:right w:val="none" w:color="000000" w:sz="4" w:space="0"/>
-        </w:tcBorders>
-      </w:tcPr>
-    </w:tblStylePr>
-    <w:tblStylePr w:type="firstRow">
-      <w:rPr>
-        <w:b/>
-        <w:color w:val="404040"/>
-      </w:rPr>
-      <w:pPr>
-        <w:pBdr/>
-        <w:spacing/>
-        <w:ind/>
-      </w:pPr>
-      <w:tblPr>
-        <w:tblBorders/>
-      </w:tblPr>
-      <w:tcPr>
         <w:shd w:val="clear" w:color="ffffff"/>
         <w:tcBorders>
           <w:top w:val="none" w:color="000000" w:sz="4" w:space="0"/>
@@ -6642,30 +6689,7 @@
         </w:tcBorders>
       </w:tcPr>
     </w:tblStylePr>
-    <w:tblStylePr w:type="lastCol">
-      <w:rPr>
-        <w:i/>
-        <w:color w:val="404040"/>
-      </w:rPr>
-      <w:pPr>
-        <w:pBdr/>
-        <w:spacing/>
-        <w:ind/>
-      </w:pPr>
-      <w:tblPr>
-        <w:tblBorders/>
-      </w:tblPr>
-      <w:tcPr>
-        <w:shd w:color="ffffff"/>
-        <w:tcBorders>
-          <w:top w:val="none" w:color="000000" w:sz="4" w:space="0"/>
-          <w:left w:val="none" w:color="000000" w:sz="4" w:space="0"/>
-          <w:bottom w:val="none" w:color="000000" w:sz="4" w:space="0"/>
-          <w:right w:val="none" w:color="000000" w:sz="4" w:space="0"/>
-        </w:tcBorders>
-      </w:tcPr>
-    </w:tblStylePr>
-    <w:tblStylePr w:type="lastRow">
+    <w:tblStylePr w:type="firstRow">
       <w:rPr>
         <w:b/>
         <w:color w:val="404040"/>
@@ -6688,6 +6712,52 @@
         </w:tcBorders>
       </w:tcPr>
     </w:tblStylePr>
+    <w:tblStylePr w:type="lastCol">
+      <w:rPr>
+        <w:i/>
+        <w:color w:val="404040"/>
+      </w:rPr>
+      <w:pPr>
+        <w:pBdr/>
+        <w:spacing/>
+        <w:ind/>
+      </w:pPr>
+      <w:tblPr>
+        <w:tblBorders/>
+      </w:tblPr>
+      <w:tcPr>
+        <w:shd w:val="clear" w:color="ffffff"/>
+        <w:tcBorders>
+          <w:top w:val="none" w:color="000000" w:sz="4" w:space="0"/>
+          <w:left w:val="none" w:color="000000" w:sz="4" w:space="0"/>
+          <w:bottom w:val="none" w:color="000000" w:sz="4" w:space="0"/>
+          <w:right w:val="none" w:color="000000" w:sz="4" w:space="0"/>
+        </w:tcBorders>
+      </w:tcPr>
+    </w:tblStylePr>
+    <w:tblStylePr w:type="lastRow">
+      <w:rPr>
+        <w:b/>
+        <w:color w:val="404040"/>
+      </w:rPr>
+      <w:pPr>
+        <w:pBdr/>
+        <w:spacing/>
+        <w:ind/>
+      </w:pPr>
+      <w:tblPr>
+        <w:tblBorders/>
+      </w:tblPr>
+      <w:tcPr>
+        <w:shd w:val="clear" w:color="ffffff"/>
+        <w:tcBorders>
+          <w:top w:val="none" w:color="000000" w:sz="4" w:space="0"/>
+          <w:left w:val="none" w:color="000000" w:sz="4" w:space="0"/>
+          <w:bottom w:val="none" w:color="000000" w:sz="4" w:space="0"/>
+          <w:right w:val="none" w:color="000000" w:sz="4" w:space="0"/>
+        </w:tcBorders>
+      </w:tcPr>
+    </w:tblStylePr>
     <w:tblStylePr w:type="nwCell">
       <w:pPr>
         <w:pBdr/>
@@ -6754,9 +6824,9 @@
       </w:tcPr>
     </w:tblStylePr>
   </w:style>
-  <w:style w:type="table" w:styleId="37">
+  <w:style w:type="table" w:styleId="728">
     <w:name w:val="Grid Table 3 - Accent 5"/>
-    <w:basedOn w:val="10"/>
+    <w:basedOn w:val="701"/>
     <w:uiPriority w:val="99"/>
     <w:pPr>
       <w:pBdr/>
@@ -6855,29 +6925,6 @@
         <w:tblBorders/>
       </w:tblPr>
       <w:tcPr>
-        <w:shd w:color="ffffff"/>
-        <w:tcBorders>
-          <w:top w:val="none" w:color="000000" w:sz="4" w:space="0"/>
-          <w:left w:val="none" w:color="000000" w:sz="4" w:space="0"/>
-          <w:bottom w:val="none" w:color="000000" w:sz="4" w:space="0"/>
-          <w:right w:val="none" w:color="000000" w:sz="4" w:space="0"/>
-        </w:tcBorders>
-      </w:tcPr>
-    </w:tblStylePr>
-    <w:tblStylePr w:type="firstRow">
-      <w:rPr>
-        <w:b/>
-        <w:color w:val="404040"/>
-      </w:rPr>
-      <w:pPr>
-        <w:pBdr/>
-        <w:spacing/>
-        <w:ind/>
-      </w:pPr>
-      <w:tblPr>
-        <w:tblBorders/>
-      </w:tblPr>
-      <w:tcPr>
         <w:shd w:val="clear" w:color="ffffff"/>
         <w:tcBorders>
           <w:top w:val="none" w:color="000000" w:sz="4" w:space="0"/>
@@ -6887,30 +6934,7 @@
         </w:tcBorders>
       </w:tcPr>
     </w:tblStylePr>
-    <w:tblStylePr w:type="lastCol">
-      <w:rPr>
-        <w:i/>
-        <w:color w:val="404040"/>
-      </w:rPr>
-      <w:pPr>
-        <w:pBdr/>
-        <w:spacing/>
-        <w:ind/>
-      </w:pPr>
-      <w:tblPr>
-        <w:tblBorders/>
-      </w:tblPr>
-      <w:tcPr>
-        <w:shd w:color="ffffff"/>
-        <w:tcBorders>
-          <w:top w:val="none" w:color="000000" w:sz="4" w:space="0"/>
-          <w:left w:val="none" w:color="000000" w:sz="4" w:space="0"/>
-          <w:bottom w:val="none" w:color="000000" w:sz="4" w:space="0"/>
-          <w:right w:val="none" w:color="000000" w:sz="4" w:space="0"/>
-        </w:tcBorders>
-      </w:tcPr>
-    </w:tblStylePr>
-    <w:tblStylePr w:type="lastRow">
+    <w:tblStylePr w:type="firstRow">
       <w:rPr>
         <w:b/>
         <w:color w:val="404040"/>
@@ -6933,6 +6957,52 @@
         </w:tcBorders>
       </w:tcPr>
     </w:tblStylePr>
+    <w:tblStylePr w:type="lastCol">
+      <w:rPr>
+        <w:i/>
+        <w:color w:val="404040"/>
+      </w:rPr>
+      <w:pPr>
+        <w:pBdr/>
+        <w:spacing/>
+        <w:ind/>
+      </w:pPr>
+      <w:tblPr>
+        <w:tblBorders/>
+      </w:tblPr>
+      <w:tcPr>
+        <w:shd w:val="clear" w:color="ffffff"/>
+        <w:tcBorders>
+          <w:top w:val="none" w:color="000000" w:sz="4" w:space="0"/>
+          <w:left w:val="none" w:color="000000" w:sz="4" w:space="0"/>
+          <w:bottom w:val="none" w:color="000000" w:sz="4" w:space="0"/>
+          <w:right w:val="none" w:color="000000" w:sz="4" w:space="0"/>
+        </w:tcBorders>
+      </w:tcPr>
+    </w:tblStylePr>
+    <w:tblStylePr w:type="lastRow">
+      <w:rPr>
+        <w:b/>
+        <w:color w:val="404040"/>
+      </w:rPr>
+      <w:pPr>
+        <w:pBdr/>
+        <w:spacing/>
+        <w:ind/>
+      </w:pPr>
+      <w:tblPr>
+        <w:tblBorders/>
+      </w:tblPr>
+      <w:tcPr>
+        <w:shd w:val="clear" w:color="ffffff"/>
+        <w:tcBorders>
+          <w:top w:val="none" w:color="000000" w:sz="4" w:space="0"/>
+          <w:left w:val="none" w:color="000000" w:sz="4" w:space="0"/>
+          <w:bottom w:val="none" w:color="000000" w:sz="4" w:space="0"/>
+          <w:right w:val="none" w:color="000000" w:sz="4" w:space="0"/>
+        </w:tcBorders>
+      </w:tcPr>
+    </w:tblStylePr>
     <w:tblStylePr w:type="nwCell">
       <w:pPr>
         <w:pBdr/>
@@ -6999,9 +7069,9 @@
       </w:tcPr>
     </w:tblStylePr>
   </w:style>
-  <w:style w:type="table" w:styleId="38">
+  <w:style w:type="table" w:styleId="729">
     <w:name w:val="Grid Table 3 - Accent 6"/>
-    <w:basedOn w:val="10"/>
+    <w:basedOn w:val="701"/>
     <w:uiPriority w:val="99"/>
     <w:pPr>
       <w:pBdr/>
@@ -7100,29 +7170,6 @@
         <w:tblBorders/>
       </w:tblPr>
       <w:tcPr>
-        <w:shd w:color="ffffff"/>
-        <w:tcBorders>
-          <w:top w:val="none" w:color="000000" w:sz="4" w:space="0"/>
-          <w:left w:val="none" w:color="000000" w:sz="4" w:space="0"/>
-          <w:bottom w:val="none" w:color="000000" w:sz="4" w:space="0"/>
-          <w:right w:val="none" w:color="000000" w:sz="4" w:space="0"/>
-        </w:tcBorders>
-      </w:tcPr>
-    </w:tblStylePr>
-    <w:tblStylePr w:type="firstRow">
-      <w:rPr>
-        <w:b/>
-        <w:color w:val="404040"/>
-      </w:rPr>
-      <w:pPr>
-        <w:pBdr/>
-        <w:spacing/>
-        <w:ind/>
-      </w:pPr>
-      <w:tblPr>
-        <w:tblBorders/>
-      </w:tblPr>
-      <w:tcPr>
         <w:shd w:val="clear" w:color="ffffff"/>
         <w:tcBorders>
           <w:top w:val="none" w:color="000000" w:sz="4" w:space="0"/>
@@ -7132,30 +7179,7 @@
         </w:tcBorders>
       </w:tcPr>
     </w:tblStylePr>
-    <w:tblStylePr w:type="lastCol">
-      <w:rPr>
-        <w:i/>
-        <w:color w:val="404040"/>
-      </w:rPr>
-      <w:pPr>
-        <w:pBdr/>
-        <w:spacing/>
-        <w:ind/>
-      </w:pPr>
-      <w:tblPr>
-        <w:tblBorders/>
-      </w:tblPr>
-      <w:tcPr>
-        <w:shd w:color="ffffff"/>
-        <w:tcBorders>
-          <w:top w:val="none" w:color="000000" w:sz="4" w:space="0"/>
-          <w:left w:val="none" w:color="000000" w:sz="4" w:space="0"/>
-          <w:bottom w:val="none" w:color="000000" w:sz="4" w:space="0"/>
-          <w:right w:val="none" w:color="000000" w:sz="4" w:space="0"/>
-        </w:tcBorders>
-      </w:tcPr>
-    </w:tblStylePr>
-    <w:tblStylePr w:type="lastRow">
+    <w:tblStylePr w:type="firstRow">
       <w:rPr>
         <w:b/>
         <w:color w:val="404040"/>
@@ -7178,6 +7202,52 @@
         </w:tcBorders>
       </w:tcPr>
     </w:tblStylePr>
+    <w:tblStylePr w:type="lastCol">
+      <w:rPr>
+        <w:i/>
+        <w:color w:val="404040"/>
+      </w:rPr>
+      <w:pPr>
+        <w:pBdr/>
+        <w:spacing/>
+        <w:ind/>
+      </w:pPr>
+      <w:tblPr>
+        <w:tblBorders/>
+      </w:tblPr>
+      <w:tcPr>
+        <w:shd w:val="clear" w:color="ffffff"/>
+        <w:tcBorders>
+          <w:top w:val="none" w:color="000000" w:sz="4" w:space="0"/>
+          <w:left w:val="none" w:color="000000" w:sz="4" w:space="0"/>
+          <w:bottom w:val="none" w:color="000000" w:sz="4" w:space="0"/>
+          <w:right w:val="none" w:color="000000" w:sz="4" w:space="0"/>
+        </w:tcBorders>
+      </w:tcPr>
+    </w:tblStylePr>
+    <w:tblStylePr w:type="lastRow">
+      <w:rPr>
+        <w:b/>
+        <w:color w:val="404040"/>
+      </w:rPr>
+      <w:pPr>
+        <w:pBdr/>
+        <w:spacing/>
+        <w:ind/>
+      </w:pPr>
+      <w:tblPr>
+        <w:tblBorders/>
+      </w:tblPr>
+      <w:tcPr>
+        <w:shd w:val="clear" w:color="ffffff"/>
+        <w:tcBorders>
+          <w:top w:val="none" w:color="000000" w:sz="4" w:space="0"/>
+          <w:left w:val="none" w:color="000000" w:sz="4" w:space="0"/>
+          <w:bottom w:val="none" w:color="000000" w:sz="4" w:space="0"/>
+          <w:right w:val="none" w:color="000000" w:sz="4" w:space="0"/>
+        </w:tcBorders>
+      </w:tcPr>
+    </w:tblStylePr>
     <w:tblStylePr w:type="nwCell">
       <w:pPr>
         <w:pBdr/>
@@ -7244,9 +7314,9 @@
       </w:tcPr>
     </w:tblStylePr>
   </w:style>
-  <w:style w:type="table" w:styleId="39">
+  <w:style w:type="table" w:styleId="730">
     <w:name w:val="Grid Table 4"/>
-    <w:basedOn w:val="10"/>
+    <w:basedOn w:val="701"/>
     <w:uiPriority w:val="59"/>
     <w:pPr>
       <w:pBdr/>
@@ -7477,9 +7547,9 @@
       </w:tcPr>
     </w:tblStylePr>
   </w:style>
-  <w:style w:type="table" w:styleId="40">
+  <w:style w:type="table" w:styleId="731">
     <w:name w:val="Grid Table 4 - Accent 1"/>
-    <w:basedOn w:val="10"/>
+    <w:basedOn w:val="701"/>
     <w:uiPriority w:val="59"/>
     <w:pPr>
       <w:pBdr/>
@@ -7710,9 +7780,9 @@
       </w:tcPr>
     </w:tblStylePr>
   </w:style>
-  <w:style w:type="table" w:styleId="41">
+  <w:style w:type="table" w:styleId="732">
     <w:name w:val="Grid Table 4 - Accent 2"/>
-    <w:basedOn w:val="10"/>
+    <w:basedOn w:val="701"/>
     <w:uiPriority w:val="59"/>
     <w:pPr>
       <w:pBdr/>
@@ -7943,9 +8013,9 @@
       </w:tcPr>
     </w:tblStylePr>
   </w:style>
-  <w:style w:type="table" w:styleId="42">
+  <w:style w:type="table" w:styleId="733">
     <w:name w:val="Grid Table 4 - Accent 3"/>
-    <w:basedOn w:val="10"/>
+    <w:basedOn w:val="701"/>
     <w:uiPriority w:val="59"/>
     <w:pPr>
       <w:pBdr/>
@@ -8176,9 +8246,9 @@
       </w:tcPr>
     </w:tblStylePr>
   </w:style>
-  <w:style w:type="table" w:styleId="43">
+  <w:style w:type="table" w:styleId="734">
     <w:name w:val="Grid Table 4 - Accent 4"/>
-    <w:basedOn w:val="10"/>
+    <w:basedOn w:val="701"/>
     <w:uiPriority w:val="59"/>
     <w:pPr>
       <w:pBdr/>
@@ -8409,9 +8479,9 @@
       </w:tcPr>
     </w:tblStylePr>
   </w:style>
-  <w:style w:type="table" w:styleId="44">
+  <w:style w:type="table" w:styleId="735">
     <w:name w:val="Grid Table 4 - Accent 5"/>
-    <w:basedOn w:val="10"/>
+    <w:basedOn w:val="701"/>
     <w:uiPriority w:val="59"/>
     <w:pPr>
       <w:pBdr/>
@@ -8642,9 +8712,9 @@
       </w:tcPr>
     </w:tblStylePr>
   </w:style>
-  <w:style w:type="table" w:styleId="45">
+  <w:style w:type="table" w:styleId="736">
     <w:name w:val="Grid Table 4 - Accent 6"/>
-    <w:basedOn w:val="10"/>
+    <w:basedOn w:val="701"/>
     <w:uiPriority w:val="59"/>
     <w:pPr>
       <w:pBdr/>
@@ -8875,9 +8945,9 @@
       </w:tcPr>
     </w:tblStylePr>
   </w:style>
-  <w:style w:type="table" w:styleId="46">
+  <w:style w:type="table" w:styleId="737">
     <w:name w:val="Grid Table 5 Dark"/>
-    <w:basedOn w:val="10"/>
+    <w:basedOn w:val="701"/>
     <w:uiPriority w:val="99"/>
     <w:pPr>
       <w:pBdr/>
@@ -9103,9 +9173,9 @@
       </w:tcPr>
     </w:tblStylePr>
   </w:style>
-  <w:style w:type="table" w:styleId="47">
+  <w:style w:type="table" w:styleId="738">
     <w:name w:val="Grid Table 5 Dark- Accent 1"/>
-    <w:basedOn w:val="10"/>
+    <w:basedOn w:val="701"/>
     <w:uiPriority w:val="99"/>
     <w:pPr>
       <w:pBdr/>
@@ -9331,9 +9401,9 @@
       </w:tcPr>
     </w:tblStylePr>
   </w:style>
-  <w:style w:type="table" w:styleId="48">
+  <w:style w:type="table" w:styleId="739">
     <w:name w:val="Grid Table 5 Dark - Accent 2"/>
-    <w:basedOn w:val="10"/>
+    <w:basedOn w:val="701"/>
     <w:uiPriority w:val="99"/>
     <w:pPr>
       <w:pBdr/>
@@ -9559,9 +9629,9 @@
       </w:tcPr>
     </w:tblStylePr>
   </w:style>
-  <w:style w:type="table" w:styleId="49">
+  <w:style w:type="table" w:styleId="740">
     <w:name w:val="Grid Table 5 Dark - Accent 3"/>
-    <w:basedOn w:val="10"/>
+    <w:basedOn w:val="701"/>
     <w:uiPriority w:val="99"/>
     <w:pPr>
       <w:pBdr/>
@@ -9787,9 +9857,9 @@
       </w:tcPr>
     </w:tblStylePr>
   </w:style>
-  <w:style w:type="table" w:styleId="50">
+  <w:style w:type="table" w:styleId="741">
     <w:name w:val="Grid Table 5 Dark- Accent 4"/>
-    <w:basedOn w:val="10"/>
+    <w:basedOn w:val="701"/>
     <w:uiPriority w:val="99"/>
     <w:pPr>
       <w:pBdr/>
@@ -10015,9 +10085,9 @@
       </w:tcPr>
     </w:tblStylePr>
   </w:style>
-  <w:style w:type="table" w:styleId="51">
+  <w:style w:type="table" w:styleId="742">
     <w:name w:val="Grid Table 5 Dark - Accent 5"/>
-    <w:basedOn w:val="10"/>
+    <w:basedOn w:val="701"/>
     <w:uiPriority w:val="99"/>
     <w:pPr>
       <w:pBdr/>
@@ -10243,9 +10313,9 @@
       </w:tcPr>
     </w:tblStylePr>
   </w:style>
-  <w:style w:type="table" w:styleId="52">
+  <w:style w:type="table" w:styleId="743">
     <w:name w:val="Grid Table 5 Dark - Accent 6"/>
-    <w:basedOn w:val="10"/>
+    <w:basedOn w:val="701"/>
     <w:uiPriority w:val="99"/>
     <w:pPr>
       <w:pBdr/>
@@ -10471,9 +10541,9 @@
       </w:tcPr>
     </w:tblStylePr>
   </w:style>
-  <w:style w:type="table" w:styleId="53">
+  <w:style w:type="table" w:styleId="744">
     <w:name w:val="Grid Table 6 Colorful"/>
-    <w:basedOn w:val="10"/>
+    <w:basedOn w:val="701"/>
     <w:uiPriority w:val="99"/>
     <w:pPr>
       <w:pBdr/>
@@ -10701,9 +10771,9 @@
       </w:tcPr>
     </w:tblStylePr>
   </w:style>
-  <w:style w:type="table" w:styleId="54">
+  <w:style w:type="table" w:styleId="745">
     <w:name w:val="Grid Table 6 Colorful - Accent 1"/>
-    <w:basedOn w:val="10"/>
+    <w:basedOn w:val="701"/>
     <w:uiPriority w:val="99"/>
     <w:pPr>
       <w:pBdr/>
@@ -10931,9 +11001,9 @@
       </w:tcPr>
     </w:tblStylePr>
   </w:style>
-  <w:style w:type="table" w:styleId="55">
+  <w:style w:type="table" w:styleId="746">
     <w:name w:val="Grid Table 6 Colorful - Accent 2"/>
-    <w:basedOn w:val="10"/>
+    <w:basedOn w:val="701"/>
     <w:uiPriority w:val="99"/>
     <w:pPr>
       <w:pBdr/>
@@ -11161,9 +11231,9 @@
       </w:tcPr>
     </w:tblStylePr>
   </w:style>
-  <w:style w:type="table" w:styleId="56">
+  <w:style w:type="table" w:styleId="747">
     <w:name w:val="Grid Table 6 Colorful - Accent 3"/>
-    <w:basedOn w:val="10"/>
+    <w:basedOn w:val="701"/>
     <w:uiPriority w:val="99"/>
     <w:pPr>
       <w:pBdr/>
@@ -11391,9 +11461,9 @@
       </w:tcPr>
     </w:tblStylePr>
   </w:style>
-  <w:style w:type="table" w:styleId="57">
+  <w:style w:type="table" w:styleId="748">
     <w:name w:val="Grid Table 6 Colorful - Accent 4"/>
-    <w:basedOn w:val="10"/>
+    <w:basedOn w:val="701"/>
     <w:uiPriority w:val="99"/>
     <w:pPr>
       <w:pBdr/>
@@ -11621,9 +11691,9 @@
       </w:tcPr>
     </w:tblStylePr>
   </w:style>
-  <w:style w:type="table" w:styleId="58">
+  <w:style w:type="table" w:styleId="749">
     <w:name w:val="Grid Table 6 Colorful - Accent 5"/>
-    <w:basedOn w:val="10"/>
+    <w:basedOn w:val="701"/>
     <w:uiPriority w:val="99"/>
     <w:pPr>
       <w:pBdr/>
@@ -11851,9 +11921,9 @@
       </w:tcPr>
     </w:tblStylePr>
   </w:style>
-  <w:style w:type="table" w:styleId="59">
+  <w:style w:type="table" w:styleId="750">
     <w:name w:val="Grid Table 6 Colorful - Accent 6"/>
-    <w:basedOn w:val="10"/>
+    <w:basedOn w:val="701"/>
     <w:uiPriority w:val="99"/>
     <w:pPr>
       <w:pBdr/>
@@ -12081,9 +12151,9 @@
       </w:tcPr>
     </w:tblStylePr>
   </w:style>
-  <w:style w:type="table" w:styleId="60">
+  <w:style w:type="table" w:styleId="751">
     <w:name w:val="Grid Table 7 Colorful"/>
-    <w:basedOn w:val="10"/>
+    <w:basedOn w:val="701"/>
     <w:uiPriority w:val="99"/>
     <w:pPr>
       <w:pBdr/>
@@ -12185,11 +12255,11 @@
         <w:tblBorders/>
       </w:tblPr>
       <w:tcPr>
-        <w:shd w:color="ffffff"/>
+        <w:shd w:val="clear" w:color="ffffff"/>
         <w:tcBorders>
-          <w:top w:val="none"/>
-          <w:left w:val="none"/>
-          <w:bottom w:val="none"/>
+          <w:top w:val="none" w:color="000000" w:sz="4" w:space="0"/>
+          <w:left w:val="none" w:color="000000" w:sz="4" w:space="0"/>
+          <w:bottom w:val="none" w:color="000000" w:sz="4" w:space="0"/>
           <w:right w:val="single" w:color="000000" w:themeColor="text1" w:themeTint="80" w:sz="4" w:space="0"/>
         </w:tcBorders>
       </w:tcPr>
@@ -12212,10 +12282,10 @@
       <w:tcPr>
         <w:shd w:val="clear" w:color="ffffff" w:themeColor="light1" w:fill="ffffff" w:themeFill="light1"/>
         <w:tcBorders>
-          <w:top w:val="none"/>
-          <w:left w:val="none"/>
+          <w:top w:val="none" w:color="000000" w:sz="4" w:space="0"/>
+          <w:left w:val="none" w:color="000000" w:sz="4" w:space="0"/>
           <w:bottom w:val="single" w:color="000000" w:themeColor="text1" w:themeTint="80" w:sz="4" w:space="0"/>
-          <w:right w:val="none"/>
+          <w:right w:val="none" w:color="000000" w:sz="4" w:space="0"/>
         </w:tcBorders>
       </w:tcPr>
     </w:tblStylePr>
@@ -12235,12 +12305,12 @@
         <w:tblBorders/>
       </w:tblPr>
       <w:tcPr>
-        <w:shd w:color="ffffff"/>
+        <w:shd w:val="clear" w:color="ffffff"/>
         <w:tcBorders>
-          <w:top w:val="none"/>
+          <w:top w:val="none" w:color="000000" w:sz="4" w:space="0"/>
           <w:left w:val="single" w:color="000000" w:themeColor="text1" w:themeTint="80" w:sz="4" w:space="0"/>
-          <w:bottom w:val="none"/>
-          <w:right w:val="none"/>
+          <w:bottom w:val="none" w:color="000000" w:sz="4" w:space="0"/>
+          <w:right w:val="none" w:color="000000" w:sz="4" w:space="0"/>
         </w:tcBorders>
       </w:tcPr>
     </w:tblStylePr>
@@ -12263,9 +12333,9 @@
         <w:shd w:val="clear" w:color="ffffff" w:themeColor="light1" w:fill="ffffff" w:themeFill="light1"/>
         <w:tcBorders>
           <w:top w:val="single" w:color="000000" w:themeColor="text1" w:themeTint="80" w:sz="4" w:space="0"/>
-          <w:left w:val="none"/>
-          <w:bottom w:val="none"/>
-          <w:right w:val="none"/>
+          <w:left w:val="none" w:color="000000" w:sz="4" w:space="0"/>
+          <w:bottom w:val="none" w:color="000000" w:sz="4" w:space="0"/>
+          <w:right w:val="none" w:color="000000" w:sz="4" w:space="0"/>
         </w:tcBorders>
       </w:tcPr>
     </w:tblStylePr>
@@ -12335,9 +12405,9 @@
       </w:tcPr>
     </w:tblStylePr>
   </w:style>
-  <w:style w:type="table" w:styleId="61">
+  <w:style w:type="table" w:styleId="752">
     <w:name w:val="Grid Table 7 Colorful - Accent 1"/>
-    <w:basedOn w:val="10"/>
+    <w:basedOn w:val="701"/>
     <w:uiPriority w:val="99"/>
     <w:pPr>
       <w:pBdr/>
@@ -12439,11 +12509,11 @@
         <w:tblBorders/>
       </w:tblPr>
       <w:tcPr>
-        <w:shd w:color="ffffff"/>
+        <w:shd w:val="clear" w:color="ffffff"/>
         <w:tcBorders>
-          <w:top w:val="none"/>
-          <w:left w:val="none"/>
-          <w:bottom w:val="none"/>
+          <w:top w:val="none" w:color="000000" w:sz="4" w:space="0"/>
+          <w:left w:val="none" w:color="000000" w:sz="4" w:space="0"/>
+          <w:bottom w:val="none" w:color="000000" w:sz="4" w:space="0"/>
           <w:right w:val="single" w:color="000000" w:themeColor="accent1" w:themeTint="80" w:sz="4" w:space="0"/>
         </w:tcBorders>
       </w:tcPr>
@@ -12466,10 +12536,10 @@
       <w:tcPr>
         <w:shd w:val="clear" w:color="ffffff" w:themeColor="light1" w:fill="ffffff" w:themeFill="light1"/>
         <w:tcBorders>
-          <w:top w:val="none"/>
-          <w:left w:val="none"/>
+          <w:top w:val="none" w:color="000000" w:sz="4" w:space="0"/>
+          <w:left w:val="none" w:color="000000" w:sz="4" w:space="0"/>
           <w:bottom w:val="single" w:color="000000" w:themeColor="accent1" w:themeTint="80" w:sz="4" w:space="0"/>
-          <w:right w:val="none"/>
+          <w:right w:val="none" w:color="000000" w:sz="4" w:space="0"/>
         </w:tcBorders>
       </w:tcPr>
     </w:tblStylePr>
@@ -12489,12 +12559,12 @@
         <w:tblBorders/>
       </w:tblPr>
       <w:tcPr>
-        <w:shd w:color="ffffff"/>
+        <w:shd w:val="clear" w:color="ffffff"/>
         <w:tcBorders>
-          <w:top w:val="none"/>
+          <w:top w:val="none" w:color="000000" w:sz="4" w:space="0"/>
           <w:left w:val="single" w:color="000000" w:themeColor="accent1" w:themeTint="80" w:sz="4" w:space="0"/>
-          <w:bottom w:val="none"/>
-          <w:right w:val="none"/>
+          <w:bottom w:val="none" w:color="000000" w:sz="4" w:space="0"/>
+          <w:right w:val="none" w:color="000000" w:sz="4" w:space="0"/>
         </w:tcBorders>
       </w:tcPr>
     </w:tblStylePr>
@@ -12517,9 +12587,9 @@
         <w:shd w:val="clear" w:color="ffffff" w:themeColor="light1" w:fill="ffffff" w:themeFill="light1"/>
         <w:tcBorders>
           <w:top w:val="single" w:color="000000" w:themeColor="accent1" w:themeTint="80" w:sz="4" w:space="0"/>
-          <w:left w:val="none"/>
-          <w:bottom w:val="none"/>
-          <w:right w:val="none"/>
+          <w:left w:val="none" w:color="000000" w:sz="4" w:space="0"/>
+          <w:bottom w:val="none" w:color="000000" w:sz="4" w:space="0"/>
+          <w:right w:val="none" w:color="000000" w:sz="4" w:space="0"/>
         </w:tcBorders>
       </w:tcPr>
     </w:tblStylePr>
@@ -12589,9 +12659,9 @@
       </w:tcPr>
     </w:tblStylePr>
   </w:style>
-  <w:style w:type="table" w:styleId="62">
+  <w:style w:type="table" w:styleId="753">
     <w:name w:val="Grid Table 7 Colorful - Accent 2"/>
-    <w:basedOn w:val="10"/>
+    <w:basedOn w:val="701"/>
     <w:uiPriority w:val="99"/>
     <w:pPr>
       <w:pBdr/>
@@ -12693,11 +12763,11 @@
         <w:tblBorders/>
       </w:tblPr>
       <w:tcPr>
-        <w:shd w:color="ffffff"/>
+        <w:shd w:val="clear" w:color="ffffff"/>
         <w:tcBorders>
-          <w:top w:val="none"/>
-          <w:left w:val="none"/>
-          <w:bottom w:val="none"/>
+          <w:top w:val="none" w:color="000000" w:sz="4" w:space="0"/>
+          <w:left w:val="none" w:color="000000" w:sz="4" w:space="0"/>
+          <w:bottom w:val="none" w:color="000000" w:sz="4" w:space="0"/>
           <w:right w:val="single" w:color="000000" w:themeColor="accent2" w:themeTint="97" w:sz="4" w:space="0"/>
         </w:tcBorders>
       </w:tcPr>
@@ -12720,10 +12790,10 @@
       <w:tcPr>
         <w:shd w:val="clear" w:color="ffffff" w:themeColor="light1" w:fill="ffffff" w:themeFill="light1"/>
         <w:tcBorders>
-          <w:top w:val="none"/>
-          <w:left w:val="none"/>
+          <w:top w:val="none" w:color="000000" w:sz="4" w:space="0"/>
+          <w:left w:val="none" w:color="000000" w:sz="4" w:space="0"/>
           <w:bottom w:val="single" w:color="000000" w:themeColor="accent2" w:themeTint="97" w:sz="4" w:space="0"/>
-          <w:right w:val="none"/>
+          <w:right w:val="none" w:color="000000" w:sz="4" w:space="0"/>
         </w:tcBorders>
       </w:tcPr>
     </w:tblStylePr>
@@ -12743,12 +12813,12 @@
         <w:tblBorders/>
       </w:tblPr>
       <w:tcPr>
-        <w:shd w:color="ffffff"/>
+        <w:shd w:val="clear" w:color="ffffff"/>
         <w:tcBorders>
-          <w:top w:val="none"/>
+          <w:top w:val="none" w:color="000000" w:sz="4" w:space="0"/>
           <w:left w:val="single" w:color="000000" w:themeColor="accent2" w:themeTint="97" w:sz="4" w:space="0"/>
-          <w:bottom w:val="none"/>
-          <w:right w:val="none"/>
+          <w:bottom w:val="none" w:color="000000" w:sz="4" w:space="0"/>
+          <w:right w:val="none" w:color="000000" w:sz="4" w:space="0"/>
         </w:tcBorders>
       </w:tcPr>
     </w:tblStylePr>
@@ -12771,9 +12841,9 @@
         <w:shd w:val="clear" w:color="ffffff" w:themeColor="light1" w:fill="ffffff" w:themeFill="light1"/>
         <w:tcBorders>
           <w:top w:val="single" w:color="000000" w:themeColor="accent2" w:themeTint="97" w:sz="4" w:space="0"/>
-          <w:left w:val="none"/>
-          <w:bottom w:val="none"/>
-          <w:right w:val="none"/>
+          <w:left w:val="none" w:color="000000" w:sz="4" w:space="0"/>
+          <w:bottom w:val="none" w:color="000000" w:sz="4" w:space="0"/>
+          <w:right w:val="none" w:color="000000" w:sz="4" w:space="0"/>
         </w:tcBorders>
       </w:tcPr>
     </w:tblStylePr>
@@ -12843,9 +12913,9 @@
       </w:tcPr>
     </w:tblStylePr>
   </w:style>
-  <w:style w:type="table" w:styleId="63">
+  <w:style w:type="table" w:styleId="754">
     <w:name w:val="Grid Table 7 Colorful - Accent 3"/>
-    <w:basedOn w:val="10"/>
+    <w:basedOn w:val="701"/>
     <w:uiPriority w:val="99"/>
     <w:pPr>
       <w:pBdr/>
@@ -12947,11 +13017,11 @@
         <w:tblBorders/>
       </w:tblPr>
       <w:tcPr>
-        <w:shd w:color="ffffff"/>
+        <w:shd w:val="clear" w:color="ffffff"/>
         <w:tcBorders>
-          <w:top w:val="none"/>
-          <w:left w:val="none"/>
-          <w:bottom w:val="none"/>
+          <w:top w:val="none" w:color="000000" w:sz="4" w:space="0"/>
+          <w:left w:val="none" w:color="000000" w:sz="4" w:space="0"/>
+          <w:bottom w:val="none" w:color="000000" w:sz="4" w:space="0"/>
           <w:right w:val="single" w:color="000000" w:themeColor="accent3" w:themeTint="FE" w:sz="4" w:space="0"/>
         </w:tcBorders>
       </w:tcPr>
@@ -12974,10 +13044,10 @@
       <w:tcPr>
         <w:shd w:val="clear" w:color="ffffff" w:themeColor="light1" w:fill="ffffff" w:themeFill="light1"/>
         <w:tcBorders>
-          <w:top w:val="none"/>
-          <w:left w:val="none"/>
+          <w:top w:val="none" w:color="000000" w:sz="4" w:space="0"/>
+          <w:left w:val="none" w:color="000000" w:sz="4" w:space="0"/>
           <w:bottom w:val="single" w:color="000000" w:themeColor="accent3" w:themeTint="FE" w:sz="4" w:space="0"/>
-          <w:right w:val="none"/>
+          <w:right w:val="none" w:color="000000" w:sz="4" w:space="0"/>
         </w:tcBorders>
       </w:tcPr>
     </w:tblStylePr>
@@ -12997,12 +13067,12 @@
         <w:tblBorders/>
       </w:tblPr>
       <w:tcPr>
-        <w:shd w:color="ffffff"/>
+        <w:shd w:val="clear" w:color="ffffff"/>
         <w:tcBorders>
-          <w:top w:val="none"/>
+          <w:top w:val="none" w:color="000000" w:sz="4" w:space="0"/>
           <w:left w:val="single" w:color="000000" w:themeColor="accent3" w:themeTint="FE" w:sz="4" w:space="0"/>
-          <w:bottom w:val="none"/>
-          <w:right w:val="none"/>
+          <w:bottom w:val="none" w:color="000000" w:sz="4" w:space="0"/>
+          <w:right w:val="none" w:color="000000" w:sz="4" w:space="0"/>
         </w:tcBorders>
       </w:tcPr>
     </w:tblStylePr>
@@ -13025,9 +13095,9 @@
         <w:shd w:val="clear" w:color="ffffff" w:themeColor="light1" w:fill="ffffff" w:themeFill="light1"/>
         <w:tcBorders>
           <w:top w:val="single" w:color="000000" w:themeColor="accent3" w:themeTint="FE" w:sz="4" w:space="0"/>
-          <w:left w:val="none"/>
-          <w:bottom w:val="none"/>
-          <w:right w:val="none"/>
+          <w:left w:val="none" w:color="000000" w:sz="4" w:space="0"/>
+          <w:bottom w:val="none" w:color="000000" w:sz="4" w:space="0"/>
+          <w:right w:val="none" w:color="000000" w:sz="4" w:space="0"/>
         </w:tcBorders>
       </w:tcPr>
     </w:tblStylePr>
@@ -13097,9 +13167,9 @@
       </w:tcPr>
     </w:tblStylePr>
   </w:style>
-  <w:style w:type="table" w:styleId="64">
+  <w:style w:type="table" w:styleId="755">
     <w:name w:val="Grid Table 7 Colorful - Accent 4"/>
-    <w:basedOn w:val="10"/>
+    <w:basedOn w:val="701"/>
     <w:uiPriority w:val="99"/>
     <w:pPr>
       <w:pBdr/>
@@ -13201,11 +13271,11 @@
         <w:tblBorders/>
       </w:tblPr>
       <w:tcPr>
-        <w:shd w:color="ffffff"/>
+        <w:shd w:val="clear" w:color="ffffff"/>
         <w:tcBorders>
-          <w:top w:val="none"/>
-          <w:left w:val="none"/>
-          <w:bottom w:val="none"/>
+          <w:top w:val="none" w:color="000000" w:sz="4" w:space="0"/>
+          <w:left w:val="none" w:color="000000" w:sz="4" w:space="0"/>
+          <w:bottom w:val="none" w:color="000000" w:sz="4" w:space="0"/>
           <w:right w:val="single" w:color="000000" w:themeColor="accent4" w:themeTint="9A" w:sz="4" w:space="0"/>
         </w:tcBorders>
       </w:tcPr>
@@ -13228,10 +13298,10 @@
       <w:tcPr>
         <w:shd w:val="clear" w:color="ffffff" w:themeColor="light1" w:fill="ffffff" w:themeFill="light1"/>
         <w:tcBorders>
-          <w:top w:val="none"/>
-          <w:left w:val="none"/>
+          <w:top w:val="none" w:color="000000" w:sz="4" w:space="0"/>
+          <w:left w:val="none" w:color="000000" w:sz="4" w:space="0"/>
           <w:bottom w:val="single" w:color="000000" w:themeColor="accent4" w:themeTint="9A" w:sz="4" w:space="0"/>
-          <w:right w:val="none"/>
+          <w:right w:val="none" w:color="000000" w:sz="4" w:space="0"/>
         </w:tcBorders>
       </w:tcPr>
     </w:tblStylePr>
@@ -13251,12 +13321,12 @@
         <w:tblBorders/>
       </w:tblPr>
       <w:tcPr>
-        <w:shd w:color="ffffff"/>
+        <w:shd w:val="clear" w:color="ffffff"/>
         <w:tcBorders>
-          <w:top w:val="none"/>
+          <w:top w:val="none" w:color="000000" w:sz="4" w:space="0"/>
           <w:left w:val="single" w:color="000000" w:themeColor="accent4" w:themeTint="9A" w:sz="4" w:space="0"/>
-          <w:bottom w:val="none"/>
-          <w:right w:val="none"/>
+          <w:bottom w:val="none" w:color="000000" w:sz="4" w:space="0"/>
+          <w:right w:val="none" w:color="000000" w:sz="4" w:space="0"/>
         </w:tcBorders>
       </w:tcPr>
     </w:tblStylePr>
@@ -13279,9 +13349,9 @@
         <w:shd w:val="clear" w:color="ffffff" w:themeColor="light1" w:fill="ffffff" w:themeFill="light1"/>
         <w:tcBorders>
           <w:top w:val="single" w:color="000000" w:themeColor="accent4" w:themeTint="9A" w:sz="4" w:space="0"/>
-          <w:left w:val="none"/>
-          <w:bottom w:val="none"/>
-          <w:right w:val="none"/>
+          <w:left w:val="none" w:color="000000" w:sz="4" w:space="0"/>
+          <w:bottom w:val="none" w:color="000000" w:sz="4" w:space="0"/>
+          <w:right w:val="none" w:color="000000" w:sz="4" w:space="0"/>
         </w:tcBorders>
       </w:tcPr>
     </w:tblStylePr>
@@ -13351,9 +13421,9 @@
       </w:tcPr>
     </w:tblStylePr>
   </w:style>
-  <w:style w:type="table" w:styleId="65">
+  <w:style w:type="table" w:styleId="756">
     <w:name w:val="Grid Table 7 Colorful - Accent 5"/>
-    <w:basedOn w:val="10"/>
+    <w:basedOn w:val="701"/>
     <w:uiPriority w:val="99"/>
     <w:pPr>
       <w:pBdr/>
@@ -13455,11 +13525,11 @@
         <w:tblBorders/>
       </w:tblPr>
       <w:tcPr>
-        <w:shd w:color="ffffff"/>
+        <w:shd w:val="clear" w:color="ffffff"/>
         <w:tcBorders>
-          <w:top w:val="none"/>
-          <w:left w:val="none"/>
-          <w:bottom w:val="none"/>
+          <w:top w:val="none" w:color="000000" w:sz="4" w:space="0"/>
+          <w:left w:val="none" w:color="000000" w:sz="4" w:space="0"/>
+          <w:bottom w:val="none" w:color="000000" w:sz="4" w:space="0"/>
           <w:right w:val="single" w:color="000000" w:themeColor="accent5" w:themeTint="90" w:sz="4" w:space="0"/>
         </w:tcBorders>
       </w:tcPr>
@@ -13482,10 +13552,10 @@
       <w:tcPr>
         <w:shd w:val="clear" w:color="ffffff" w:themeColor="light1" w:fill="ffffff" w:themeFill="light1"/>
         <w:tcBorders>
-          <w:top w:val="none"/>
-          <w:left w:val="none"/>
+          <w:top w:val="none" w:color="000000" w:sz="4" w:space="0"/>
+          <w:left w:val="none" w:color="000000" w:sz="4" w:space="0"/>
           <w:bottom w:val="single" w:color="000000" w:themeColor="accent5" w:themeTint="90" w:sz="4" w:space="0"/>
-          <w:right w:val="none"/>
+          <w:right w:val="none" w:color="000000" w:sz="4" w:space="0"/>
         </w:tcBorders>
       </w:tcPr>
     </w:tblStylePr>
@@ -13505,12 +13575,12 @@
         <w:tblBorders/>
       </w:tblPr>
       <w:tcPr>
-        <w:shd w:color="ffffff"/>
+        <w:shd w:val="clear" w:color="ffffff"/>
         <w:tcBorders>
-          <w:top w:val="none"/>
+          <w:top w:val="none" w:color="000000" w:sz="4" w:space="0"/>
           <w:left w:val="single" w:color="000000" w:themeColor="accent5" w:themeTint="90" w:sz="4" w:space="0"/>
-          <w:bottom w:val="none"/>
-          <w:right w:val="none"/>
+          <w:bottom w:val="none" w:color="000000" w:sz="4" w:space="0"/>
+          <w:right w:val="none" w:color="000000" w:sz="4" w:space="0"/>
         </w:tcBorders>
       </w:tcPr>
     </w:tblStylePr>
@@ -13533,9 +13603,9 @@
         <w:shd w:val="clear" w:color="ffffff" w:themeColor="light1" w:fill="ffffff" w:themeFill="light1"/>
         <w:tcBorders>
           <w:top w:val="single" w:color="000000" w:themeColor="accent5" w:themeTint="90" w:sz="4" w:space="0"/>
-          <w:left w:val="none"/>
-          <w:bottom w:val="none"/>
-          <w:right w:val="none"/>
+          <w:left w:val="none" w:color="000000" w:sz="4" w:space="0"/>
+          <w:bottom w:val="none" w:color="000000" w:sz="4" w:space="0"/>
+          <w:right w:val="none" w:color="000000" w:sz="4" w:space="0"/>
         </w:tcBorders>
       </w:tcPr>
     </w:tblStylePr>
@@ -13605,9 +13675,9 @@
       </w:tcPr>
     </w:tblStylePr>
   </w:style>
-  <w:style w:type="table" w:styleId="66">
+  <w:style w:type="table" w:styleId="757">
     <w:name w:val="Grid Table 7 Colorful - Accent 6"/>
-    <w:basedOn w:val="10"/>
+    <w:basedOn w:val="701"/>
     <w:uiPriority w:val="99"/>
     <w:pPr>
       <w:pBdr/>
@@ -13709,11 +13779,11 @@
         <w:tblBorders/>
       </w:tblPr>
       <w:tcPr>
-        <w:shd w:color="ffffff"/>
+        <w:shd w:val="clear" w:color="ffffff"/>
         <w:tcBorders>
-          <w:top w:val="none"/>
-          <w:left w:val="none"/>
-          <w:bottom w:val="none"/>
+          <w:top w:val="none" w:color="000000" w:sz="4" w:space="0"/>
+          <w:left w:val="none" w:color="000000" w:sz="4" w:space="0"/>
+          <w:bottom w:val="none" w:color="000000" w:sz="4" w:space="0"/>
           <w:right w:val="single" w:color="000000" w:themeColor="accent6" w:themeTint="90" w:sz="4" w:space="0"/>
         </w:tcBorders>
       </w:tcPr>
@@ -13736,10 +13806,10 @@
       <w:tcPr>
         <w:shd w:val="clear" w:color="ffffff" w:themeColor="light1" w:fill="ffffff" w:themeFill="light1"/>
         <w:tcBorders>
-          <w:top w:val="none"/>
-          <w:left w:val="none"/>
+          <w:top w:val="none" w:color="000000" w:sz="4" w:space="0"/>
+          <w:left w:val="none" w:color="000000" w:sz="4" w:space="0"/>
           <w:bottom w:val="single" w:color="000000" w:themeColor="accent6" w:themeTint="90" w:sz="4" w:space="0"/>
-          <w:right w:val="none"/>
+          <w:right w:val="none" w:color="000000" w:sz="4" w:space="0"/>
         </w:tcBorders>
       </w:tcPr>
     </w:tblStylePr>
@@ -13759,12 +13829,12 @@
         <w:tblBorders/>
       </w:tblPr>
       <w:tcPr>
-        <w:shd w:color="ffffff"/>
+        <w:shd w:val="clear" w:color="ffffff"/>
         <w:tcBorders>
-          <w:top w:val="none"/>
+          <w:top w:val="none" w:color="000000" w:sz="4" w:space="0"/>
           <w:left w:val="single" w:color="000000" w:themeColor="accent6" w:themeTint="90" w:sz="4" w:space="0"/>
-          <w:bottom w:val="none"/>
-          <w:right w:val="none"/>
+          <w:bottom w:val="none" w:color="000000" w:sz="4" w:space="0"/>
+          <w:right w:val="none" w:color="000000" w:sz="4" w:space="0"/>
         </w:tcBorders>
       </w:tcPr>
     </w:tblStylePr>
@@ -13787,9 +13857,9 @@
         <w:shd w:val="clear" w:color="ffffff" w:themeColor="light1" w:fill="ffffff" w:themeFill="light1"/>
         <w:tcBorders>
           <w:top w:val="single" w:color="000000" w:themeColor="accent6" w:themeTint="90" w:sz="4" w:space="0"/>
-          <w:left w:val="none"/>
-          <w:bottom w:val="none"/>
-          <w:right w:val="none"/>
+          <w:left w:val="none" w:color="000000" w:sz="4" w:space="0"/>
+          <w:bottom w:val="none" w:color="000000" w:sz="4" w:space="0"/>
+          <w:right w:val="none" w:color="000000" w:sz="4" w:space="0"/>
         </w:tcBorders>
       </w:tcPr>
     </w:tblStylePr>
@@ -13859,9 +13929,9 @@
       </w:tcPr>
     </w:tblStylePr>
   </w:style>
-  <w:style w:type="table" w:styleId="67">
+  <w:style w:type="table" w:styleId="758">
     <w:name w:val="List Table 1 Light"/>
-    <w:basedOn w:val="10"/>
+    <w:basedOn w:val="701"/>
     <w:uiPriority w:val="99"/>
     <w:pPr>
       <w:pBdr/>
@@ -14075,9 +14145,9 @@
       </w:tcPr>
     </w:tblStylePr>
   </w:style>
-  <w:style w:type="table" w:styleId="68">
+  <w:style w:type="table" w:styleId="759">
     <w:name w:val="List Table 1 Light - Accent 1"/>
-    <w:basedOn w:val="10"/>
+    <w:basedOn w:val="701"/>
     <w:uiPriority w:val="99"/>
     <w:pPr>
       <w:pBdr/>
@@ -14291,9 +14361,9 @@
       </w:tcPr>
     </w:tblStylePr>
   </w:style>
-  <w:style w:type="table" w:styleId="69">
+  <w:style w:type="table" w:styleId="760">
     <w:name w:val="List Table 1 Light - Accent 2"/>
-    <w:basedOn w:val="10"/>
+    <w:basedOn w:val="701"/>
     <w:uiPriority w:val="99"/>
     <w:pPr>
       <w:pBdr/>
@@ -14507,9 +14577,9 @@
       </w:tcPr>
     </w:tblStylePr>
   </w:style>
-  <w:style w:type="table" w:styleId="70">
+  <w:style w:type="table" w:styleId="761">
     <w:name w:val="List Table 1 Light - Accent 3"/>
-    <w:basedOn w:val="10"/>
+    <w:basedOn w:val="701"/>
     <w:uiPriority w:val="99"/>
     <w:pPr>
       <w:pBdr/>
@@ -14723,9 +14793,9 @@
       </w:tcPr>
     </w:tblStylePr>
   </w:style>
-  <w:style w:type="table" w:styleId="71">
+  <w:style w:type="table" w:styleId="762">
     <w:name w:val="List Table 1 Light - Accent 4"/>
-    <w:basedOn w:val="10"/>
+    <w:basedOn w:val="701"/>
     <w:uiPriority w:val="99"/>
     <w:pPr>
       <w:pBdr/>
@@ -14939,9 +15009,9 @@
       </w:tcPr>
     </w:tblStylePr>
   </w:style>
-  <w:style w:type="table" w:styleId="72">
+  <w:style w:type="table" w:styleId="763">
     <w:name w:val="List Table 1 Light - Accent 5"/>
-    <w:basedOn w:val="10"/>
+    <w:basedOn w:val="701"/>
     <w:uiPriority w:val="99"/>
     <w:pPr>
       <w:pBdr/>
@@ -15155,9 +15225,9 @@
       </w:tcPr>
     </w:tblStylePr>
   </w:style>
-  <w:style w:type="table" w:styleId="73">
+  <w:style w:type="table" w:styleId="764">
     <w:name w:val="List Table 1 Light - Accent 6"/>
-    <w:basedOn w:val="10"/>
+    <w:basedOn w:val="701"/>
     <w:uiPriority w:val="99"/>
     <w:pPr>
       <w:pBdr/>
@@ -15371,9 +15441,9 @@
       </w:tcPr>
     </w:tblStylePr>
   </w:style>
-  <w:style w:type="table" w:styleId="74">
+  <w:style w:type="table" w:styleId="765">
     <w:name w:val="List Table 2"/>
-    <w:basedOn w:val="10"/>
+    <w:basedOn w:val="701"/>
     <w:uiPriority w:val="99"/>
     <w:pPr>
       <w:pBdr/>
@@ -15609,9 +15679,9 @@
       </w:tcPr>
     </w:tblStylePr>
   </w:style>
-  <w:style w:type="table" w:styleId="75">
+  <w:style w:type="table" w:styleId="766">
     <w:name w:val="List Table 2 - Accent 1"/>
-    <w:basedOn w:val="10"/>
+    <w:basedOn w:val="701"/>
     <w:uiPriority w:val="99"/>
     <w:pPr>
       <w:pBdr/>
@@ -15847,9 +15917,9 @@
       </w:tcPr>
     </w:tblStylePr>
   </w:style>
-  <w:style w:type="table" w:styleId="76">
+  <w:style w:type="table" w:styleId="767">
     <w:name w:val="List Table 2 - Accent 2"/>
-    <w:basedOn w:val="10"/>
+    <w:basedOn w:val="701"/>
     <w:uiPriority w:val="99"/>
     <w:pPr>
       <w:pBdr/>
@@ -16085,9 +16155,9 @@
       </w:tcPr>
     </w:tblStylePr>
   </w:style>
-  <w:style w:type="table" w:styleId="77">
+  <w:style w:type="table" w:styleId="768">
     <w:name w:val="List Table 2 - Accent 3"/>
-    <w:basedOn w:val="10"/>
+    <w:basedOn w:val="701"/>
     <w:uiPriority w:val="99"/>
     <w:pPr>
       <w:pBdr/>
@@ -16323,9 +16393,9 @@
       </w:tcPr>
     </w:tblStylePr>
   </w:style>
-  <w:style w:type="table" w:styleId="78">
+  <w:style w:type="table" w:styleId="769">
     <w:name w:val="List Table 2 - Accent 4"/>
-    <w:basedOn w:val="10"/>
+    <w:basedOn w:val="701"/>
     <w:uiPriority w:val="99"/>
     <w:pPr>
       <w:pBdr/>
@@ -16561,9 +16631,9 @@
       </w:tcPr>
     </w:tblStylePr>
   </w:style>
-  <w:style w:type="table" w:styleId="79">
+  <w:style w:type="table" w:styleId="770">
     <w:name w:val="List Table 2 - Accent 5"/>
-    <w:basedOn w:val="10"/>
+    <w:basedOn w:val="701"/>
     <w:uiPriority w:val="99"/>
     <w:pPr>
       <w:pBdr/>
@@ -16799,9 +16869,9 @@
       </w:tcPr>
     </w:tblStylePr>
   </w:style>
-  <w:style w:type="table" w:styleId="80">
+  <w:style w:type="table" w:styleId="771">
     <w:name w:val="List Table 2 - Accent 6"/>
-    <w:basedOn w:val="10"/>
+    <w:basedOn w:val="701"/>
     <w:uiPriority w:val="99"/>
     <w:pPr>
       <w:pBdr/>
@@ -17037,9 +17107,9 @@
       </w:tcPr>
     </w:tblStylePr>
   </w:style>
-  <w:style w:type="table" w:styleId="81">
+  <w:style w:type="table" w:styleId="772">
     <w:name w:val="List Table 3"/>
-    <w:basedOn w:val="10"/>
+    <w:basedOn w:val="701"/>
     <w:uiPriority w:val="99"/>
     <w:pPr>
       <w:pBdr/>
@@ -17265,9 +17335,9 @@
       </w:tcPr>
     </w:tblStylePr>
   </w:style>
-  <w:style w:type="table" w:styleId="82">
+  <w:style w:type="table" w:styleId="773">
     <w:name w:val="List Table 3 - Accent 1"/>
-    <w:basedOn w:val="10"/>
+    <w:basedOn w:val="701"/>
     <w:uiPriority w:val="99"/>
     <w:pPr>
       <w:pBdr/>
@@ -17493,9 +17563,9 @@
       </w:tcPr>
     </w:tblStylePr>
   </w:style>
-  <w:style w:type="table" w:styleId="83">
+  <w:style w:type="table" w:styleId="774">
     <w:name w:val="List Table 3 - Accent 2"/>
-    <w:basedOn w:val="10"/>
+    <w:basedOn w:val="701"/>
     <w:uiPriority w:val="99"/>
     <w:pPr>
       <w:pBdr/>
@@ -17721,9 +17791,9 @@
       </w:tcPr>
     </w:tblStylePr>
   </w:style>
-  <w:style w:type="table" w:styleId="84">
+  <w:style w:type="table" w:styleId="775">
     <w:name w:val="List Table 3 - Accent 3"/>
-    <w:basedOn w:val="10"/>
+    <w:basedOn w:val="701"/>
     <w:uiPriority w:val="99"/>
     <w:pPr>
       <w:pBdr/>
@@ -17949,9 +18019,9 @@
       </w:tcPr>
     </w:tblStylePr>
   </w:style>
-  <w:style w:type="table" w:styleId="85">
+  <w:style w:type="table" w:styleId="776">
     <w:name w:val="List Table 3 - Accent 4"/>
-    <w:basedOn w:val="10"/>
+    <w:basedOn w:val="701"/>
     <w:uiPriority w:val="99"/>
     <w:pPr>
       <w:pBdr/>
@@ -18177,9 +18247,9 @@
       </w:tcPr>
     </w:tblStylePr>
   </w:style>
-  <w:style w:type="table" w:styleId="86">
+  <w:style w:type="table" w:styleId="777">
     <w:name w:val="List Table 3 - Accent 5"/>
-    <w:basedOn w:val="10"/>
+    <w:basedOn w:val="701"/>
     <w:uiPriority w:val="99"/>
     <w:pPr>
       <w:pBdr/>
@@ -18405,9 +18475,9 @@
       </w:tcPr>
     </w:tblStylePr>
   </w:style>
-  <w:style w:type="table" w:styleId="87">
+  <w:style w:type="table" w:styleId="778">
     <w:name w:val="List Table 3 - Accent 6"/>
-    <w:basedOn w:val="10"/>
+    <w:basedOn w:val="701"/>
     <w:uiPriority w:val="99"/>
     <w:pPr>
       <w:pBdr/>
@@ -18633,9 +18703,9 @@
       </w:tcPr>
     </w:tblStylePr>
   </w:style>
-  <w:style w:type="table" w:styleId="88">
+  <w:style w:type="table" w:styleId="779">
     <w:name w:val="List Table 4"/>
-    <w:basedOn w:val="10"/>
+    <w:basedOn w:val="701"/>
     <w:uiPriority w:val="99"/>
     <w:pPr>
       <w:pBdr/>
@@ -18858,9 +18928,9 @@
       </w:tcPr>
     </w:tblStylePr>
   </w:style>
-  <w:style w:type="table" w:styleId="89">
+  <w:style w:type="table" w:styleId="780">
     <w:name w:val="List Table 4 - Accent 1"/>
-    <w:basedOn w:val="10"/>
+    <w:basedOn w:val="701"/>
     <w:uiPriority w:val="99"/>
     <w:pPr>
       <w:pBdr/>
@@ -19083,9 +19153,9 @@
       </w:tcPr>
     </w:tblStylePr>
   </w:style>
-  <w:style w:type="table" w:styleId="90">
+  <w:style w:type="table" w:styleId="781">
     <w:name w:val="List Table 4 - Accent 2"/>
-    <w:basedOn w:val="10"/>
+    <w:basedOn w:val="701"/>
     <w:uiPriority w:val="99"/>
     <w:pPr>
       <w:pBdr/>
@@ -19308,9 +19378,9 @@
       </w:tcPr>
     </w:tblStylePr>
   </w:style>
-  <w:style w:type="table" w:styleId="91">
+  <w:style w:type="table" w:styleId="782">
     <w:name w:val="List Table 4 - Accent 3"/>
-    <w:basedOn w:val="10"/>
+    <w:basedOn w:val="701"/>
     <w:uiPriority w:val="99"/>
     <w:pPr>
       <w:pBdr/>
@@ -19533,9 +19603,9 @@
       </w:tcPr>
     </w:tblStylePr>
   </w:style>
-  <w:style w:type="table" w:styleId="92">
+  <w:style w:type="table" w:styleId="783">
     <w:name w:val="List Table 4 - Accent 4"/>
-    <w:basedOn w:val="10"/>
+    <w:basedOn w:val="701"/>
     <w:uiPriority w:val="99"/>
     <w:pPr>
       <w:pBdr/>
@@ -19758,9 +19828,9 @@
       </w:tcPr>
     </w:tblStylePr>
   </w:style>
-  <w:style w:type="table" w:styleId="93">
+  <w:style w:type="table" w:styleId="784">
     <w:name w:val="List Table 4 - Accent 5"/>
-    <w:basedOn w:val="10"/>
+    <w:basedOn w:val="701"/>
     <w:uiPriority w:val="99"/>
     <w:pPr>
       <w:pBdr/>
@@ -19983,9 +20053,9 @@
       </w:tcPr>
     </w:tblStylePr>
   </w:style>
-  <w:style w:type="table" w:styleId="94">
+  <w:style w:type="table" w:styleId="785">
     <w:name w:val="List Table 4 - Accent 6"/>
-    <w:basedOn w:val="10"/>
+    <w:basedOn w:val="701"/>
     <w:uiPriority w:val="99"/>
     <w:pPr>
       <w:pBdr/>
@@ -20208,9 +20278,9 @@
       </w:tcPr>
     </w:tblStylePr>
   </w:style>
-  <w:style w:type="table" w:styleId="95">
+  <w:style w:type="table" w:styleId="786">
     <w:name w:val="List Table 5 Dark"/>
-    <w:basedOn w:val="10"/>
+    <w:basedOn w:val="701"/>
     <w:uiPriority w:val="99"/>
     <w:pPr>
       <w:pBdr/>
@@ -20450,9 +20520,9 @@
       </w:tcPr>
     </w:tblStylePr>
   </w:style>
-  <w:style w:type="table" w:styleId="96">
+  <w:style w:type="table" w:styleId="787">
     <w:name w:val="List Table 5 Dark - Accent 1"/>
-    <w:basedOn w:val="10"/>
+    <w:basedOn w:val="701"/>
     <w:uiPriority w:val="99"/>
     <w:pPr>
       <w:pBdr/>
@@ -20692,9 +20762,9 @@
       </w:tcPr>
     </w:tblStylePr>
   </w:style>
-  <w:style w:type="table" w:styleId="97">
+  <w:style w:type="table" w:styleId="788">
     <w:name w:val="List Table 5 Dark - Accent 2"/>
-    <w:basedOn w:val="10"/>
+    <w:basedOn w:val="701"/>
     <w:uiPriority w:val="99"/>
     <w:pPr>
       <w:pBdr/>
@@ -20934,9 +21004,9 @@
       </w:tcPr>
     </w:tblStylePr>
   </w:style>
-  <w:style w:type="table" w:styleId="98">
+  <w:style w:type="table" w:styleId="789">
     <w:name w:val="List Table 5 Dark - Accent 3"/>
-    <w:basedOn w:val="10"/>
+    <w:basedOn w:val="701"/>
     <w:uiPriority w:val="99"/>
     <w:pPr>
       <w:pBdr/>
@@ -21176,9 +21246,9 @@
       </w:tcPr>
     </w:tblStylePr>
   </w:style>
-  <w:style w:type="table" w:styleId="99">
+  <w:style w:type="table" w:styleId="790">
     <w:name w:val="List Table 5 Dark - Accent 4"/>
-    <w:basedOn w:val="10"/>
+    <w:basedOn w:val="701"/>
     <w:uiPriority w:val="99"/>
     <w:pPr>
       <w:pBdr/>
@@ -21418,9 +21488,9 @@
       </w:tcPr>
     </w:tblStylePr>
   </w:style>
-  <w:style w:type="table" w:styleId="100">
+  <w:style w:type="table" w:styleId="791">
     <w:name w:val="List Table 5 Dark - Accent 5"/>
-    <w:basedOn w:val="10"/>
+    <w:basedOn w:val="701"/>
     <w:uiPriority w:val="99"/>
     <w:pPr>
       <w:pBdr/>
@@ -21660,9 +21730,9 @@
       </w:tcPr>
     </w:tblStylePr>
   </w:style>
-  <w:style w:type="table" w:styleId="101">
+  <w:style w:type="table" w:styleId="792">
     <w:name w:val="List Table 5 Dark - Accent 6"/>
-    <w:basedOn w:val="10"/>
+    <w:basedOn w:val="701"/>
     <w:uiPriority w:val="99"/>
     <w:pPr>
       <w:pBdr/>
@@ -21902,9 +21972,9 @@
       </w:tcPr>
     </w:tblStylePr>
   </w:style>
-  <w:style w:type="table" w:styleId="102">
+  <w:style w:type="table" w:styleId="793">
     <w:name w:val="List Table 6 Colorful"/>
-    <w:basedOn w:val="10"/>
+    <w:basedOn w:val="701"/>
     <w:uiPriority w:val="99"/>
     <w:pPr>
       <w:pBdr/>
@@ -22125,9 +22195,9 @@
       </w:tcPr>
     </w:tblStylePr>
   </w:style>
-  <w:style w:type="table" w:styleId="103">
+  <w:style w:type="table" w:styleId="794">
     <w:name w:val="List Table 6 Colorful - Accent 1"/>
-    <w:basedOn w:val="10"/>
+    <w:basedOn w:val="701"/>
     <w:uiPriority w:val="99"/>
     <w:pPr>
       <w:pBdr/>
@@ -22348,9 +22418,9 @@
       </w:tcPr>
     </w:tblStylePr>
   </w:style>
-  <w:style w:type="table" w:styleId="104">
+  <w:style w:type="table" w:styleId="795">
     <w:name w:val="List Table 6 Colorful - Accent 2"/>
-    <w:basedOn w:val="10"/>
+    <w:basedOn w:val="701"/>
     <w:uiPriority w:val="99"/>
     <w:pPr>
       <w:pBdr/>
@@ -22571,9 +22641,9 @@
       </w:tcPr>
     </w:tblStylePr>
   </w:style>
-  <w:style w:type="table" w:styleId="105">
+  <w:style w:type="table" w:styleId="796">
     <w:name w:val="List Table 6 Colorful - Accent 3"/>
-    <w:basedOn w:val="10"/>
+    <w:basedOn w:val="701"/>
     <w:uiPriority w:val="99"/>
     <w:pPr>
       <w:pBdr/>
@@ -22794,9 +22864,9 @@
       </w:tcPr>
     </w:tblStylePr>
   </w:style>
-  <w:style w:type="table" w:styleId="106">
+  <w:style w:type="table" w:styleId="797">
     <w:name w:val="List Table 6 Colorful - Accent 4"/>
-    <w:basedOn w:val="10"/>
+    <w:basedOn w:val="701"/>
     <w:uiPriority w:val="99"/>
     <w:pPr>
       <w:pBdr/>
@@ -23017,9 +23087,9 @@
       </w:tcPr>
     </w:tblStylePr>
   </w:style>
-  <w:style w:type="table" w:styleId="107">
+  <w:style w:type="table" w:styleId="798">
     <w:name w:val="List Table 6 Colorful - Accent 5"/>
-    <w:basedOn w:val="10"/>
+    <w:basedOn w:val="701"/>
     <w:uiPriority w:val="99"/>
     <w:pPr>
       <w:pBdr/>
@@ -23240,9 +23310,9 @@
       </w:tcPr>
     </w:tblStylePr>
   </w:style>
-  <w:style w:type="table" w:styleId="108">
+  <w:style w:type="table" w:styleId="799">
     <w:name w:val="List Table 6 Colorful - Accent 6"/>
-    <w:basedOn w:val="10"/>
+    <w:basedOn w:val="701"/>
     <w:uiPriority w:val="99"/>
     <w:pPr>
       <w:pBdr/>
@@ -23463,9 +23533,9 @@
       </w:tcPr>
     </w:tblStylePr>
   </w:style>
-  <w:style w:type="table" w:styleId="109">
+  <w:style w:type="table" w:styleId="800">
     <w:name w:val="List Table 7 Colorful"/>
-    <w:basedOn w:val="10"/>
+    <w:basedOn w:val="701"/>
     <w:uiPriority w:val="99"/>
     <w:pPr>
       <w:pBdr/>
@@ -23564,11 +23634,11 @@
         <w:tblBorders/>
       </w:tblPr>
       <w:tcPr>
-        <w:shd w:color="ffffff"/>
+        <w:shd w:val="clear" w:color="ffffff"/>
         <w:tcBorders>
-          <w:top w:val="none"/>
-          <w:left w:val="none"/>
-          <w:bottom w:val="none"/>
+          <w:top w:val="none" w:color="000000" w:sz="4" w:space="0"/>
+          <w:left w:val="none" w:color="000000" w:sz="4" w:space="0"/>
+          <w:bottom w:val="none" w:color="000000" w:sz="4" w:space="0"/>
           <w:right w:val="single" w:color="000000" w:themeColor="text1" w:themeTint="80" w:sz="4" w:space="0"/>
         </w:tcBorders>
       </w:tcPr>
@@ -23591,10 +23661,10 @@
       <w:tcPr>
         <w:shd w:val="clear" w:color="ffffff" w:themeColor="light1" w:fill="ffffff" w:themeFill="light1"/>
         <w:tcBorders>
-          <w:top w:val="none"/>
-          <w:left w:val="none"/>
+          <w:top w:val="none" w:color="000000" w:sz="4" w:space="0"/>
+          <w:left w:val="none" w:color="000000" w:sz="4" w:space="0"/>
           <w:bottom w:val="single" w:color="000000" w:themeColor="text1" w:themeTint="80" w:sz="4" w:space="0"/>
-          <w:right w:val="none"/>
+          <w:right w:val="none" w:color="000000" w:sz="4" w:space="0"/>
         </w:tcBorders>
       </w:tcPr>
     </w:tblStylePr>
@@ -23614,12 +23684,12 @@
         <w:tblBorders/>
       </w:tblPr>
       <w:tcPr>
-        <w:shd w:color="ffffff"/>
+        <w:shd w:val="clear" w:color="ffffff"/>
         <w:tcBorders>
-          <w:top w:val="none"/>
+          <w:top w:val="none" w:color="000000" w:sz="4" w:space="0"/>
           <w:left w:val="single" w:color="000000" w:themeColor="text1" w:themeTint="80" w:sz="4" w:space="0"/>
-          <w:bottom w:val="none"/>
-          <w:right w:val="none"/>
+          <w:bottom w:val="none" w:color="000000" w:sz="4" w:space="0"/>
+          <w:right w:val="none" w:color="000000" w:sz="4" w:space="0"/>
         </w:tcBorders>
       </w:tcPr>
     </w:tblStylePr>
@@ -23642,9 +23712,9 @@
         <w:shd w:val="clear" w:color="ffffff" w:themeColor="light1" w:fill="ffffff" w:themeFill="light1"/>
         <w:tcBorders>
           <w:top w:val="single" w:color="000000" w:themeColor="text1" w:themeTint="80" w:sz="4" w:space="0"/>
-          <w:left w:val="none"/>
-          <w:bottom w:val="none"/>
-          <w:right w:val="none"/>
+          <w:left w:val="none" w:color="000000" w:sz="4" w:space="0"/>
+          <w:bottom w:val="none" w:color="000000" w:sz="4" w:space="0"/>
+          <w:right w:val="none" w:color="000000" w:sz="4" w:space="0"/>
         </w:tcBorders>
       </w:tcPr>
     </w:tblStylePr>
@@ -23719,9 +23789,9 @@
       </w:tcPr>
     </w:tblStylePr>
   </w:style>
-  <w:style w:type="table" w:styleId="110">
+  <w:style w:type="table" w:styleId="801">
     <w:name w:val="List Table 7 Colorful - Accent 1"/>
-    <w:basedOn w:val="10"/>
+    <w:basedOn w:val="701"/>
     <w:uiPriority w:val="99"/>
     <w:pPr>
       <w:pBdr/>
@@ -23820,11 +23890,11 @@
         <w:tblBorders/>
       </w:tblPr>
       <w:tcPr>
-        <w:shd w:color="ffffff"/>
+        <w:shd w:val="clear" w:color="ffffff"/>
         <w:tcBorders>
-          <w:top w:val="none"/>
-          <w:left w:val="none"/>
-          <w:bottom w:val="none"/>
+          <w:top w:val="none" w:color="000000" w:sz="4" w:space="0"/>
+          <w:left w:val="none" w:color="000000" w:sz="4" w:space="0"/>
+          <w:bottom w:val="none" w:color="000000" w:sz="4" w:space="0"/>
           <w:right w:val="single" w:color="000000" w:themeColor="accent1" w:sz="4" w:space="0"/>
         </w:tcBorders>
       </w:tcPr>
@@ -23847,10 +23917,10 @@
       <w:tcPr>
         <w:shd w:val="clear" w:color="ffffff" w:themeColor="light1" w:fill="ffffff" w:themeFill="light1"/>
         <w:tcBorders>
-          <w:top w:val="none"/>
-          <w:left w:val="none"/>
+          <w:top w:val="none" w:color="000000" w:sz="4" w:space="0"/>
+          <w:left w:val="none" w:color="000000" w:sz="4" w:space="0"/>
           <w:bottom w:val="single" w:color="000000" w:themeColor="accent1" w:sz="4" w:space="0"/>
-          <w:right w:val="none"/>
+          <w:right w:val="none" w:color="000000" w:sz="4" w:space="0"/>
         </w:tcBorders>
       </w:tcPr>
     </w:tblStylePr>
@@ -23870,12 +23940,12 @@
         <w:tblBorders/>
       </w:tblPr>
       <w:tcPr>
-        <w:shd w:color="ffffff"/>
+        <w:shd w:val="clear" w:color="ffffff"/>
         <w:tcBorders>
-          <w:top w:val="none"/>
+          <w:top w:val="none" w:color="000000" w:sz="4" w:space="0"/>
           <w:left w:val="single" w:color="000000" w:themeColor="accent1" w:sz="4" w:space="0"/>
-          <w:bottom w:val="none"/>
-          <w:right w:val="none"/>
+          <w:bottom w:val="none" w:color="000000" w:sz="4" w:space="0"/>
+          <w:right w:val="none" w:color="000000" w:sz="4" w:space="0"/>
         </w:tcBorders>
       </w:tcPr>
     </w:tblStylePr>
@@ -23898,9 +23968,9 @@
         <w:shd w:val="clear" w:color="ffffff" w:themeColor="light1" w:fill="ffffff" w:themeFill="light1"/>
         <w:tcBorders>
           <w:top w:val="single" w:color="000000" w:themeColor="accent1" w:sz="4" w:space="0"/>
-          <w:left w:val="none"/>
-          <w:bottom w:val="none"/>
-          <w:right w:val="none"/>
+          <w:left w:val="none" w:color="000000" w:sz="4" w:space="0"/>
+          <w:bottom w:val="none" w:color="000000" w:sz="4" w:space="0"/>
+          <w:right w:val="none" w:color="000000" w:sz="4" w:space="0"/>
         </w:tcBorders>
       </w:tcPr>
     </w:tblStylePr>
@@ -23975,9 +24045,9 @@
       </w:tcPr>
     </w:tblStylePr>
   </w:style>
-  <w:style w:type="table" w:styleId="111">
+  <w:style w:type="table" w:styleId="802">
     <w:name w:val="List Table 7 Colorful - Accent 2"/>
-    <w:basedOn w:val="10"/>
+    <w:basedOn w:val="701"/>
     <w:uiPriority w:val="99"/>
     <w:pPr>
       <w:pBdr/>
@@ -24076,11 +24146,11 @@
         <w:tblBorders/>
       </w:tblPr>
       <w:tcPr>
-        <w:shd w:color="ffffff"/>
+        <w:shd w:val="clear" w:color="ffffff"/>
         <w:tcBorders>
-          <w:top w:val="none"/>
-          <w:left w:val="none"/>
-          <w:bottom w:val="none"/>
+          <w:top w:val="none" w:color="000000" w:sz="4" w:space="0"/>
+          <w:left w:val="none" w:color="000000" w:sz="4" w:space="0"/>
+          <w:bottom w:val="none" w:color="000000" w:sz="4" w:space="0"/>
           <w:right w:val="single" w:color="000000" w:themeColor="accent2" w:themeTint="97" w:sz="4" w:space="0"/>
         </w:tcBorders>
       </w:tcPr>
@@ -24103,10 +24173,10 @@
       <w:tcPr>
         <w:shd w:val="clear" w:color="ffffff" w:themeColor="light1" w:fill="ffffff" w:themeFill="light1"/>
         <w:tcBorders>
-          <w:top w:val="none"/>
-          <w:left w:val="none"/>
+          <w:top w:val="none" w:color="000000" w:sz="4" w:space="0"/>
+          <w:left w:val="none" w:color="000000" w:sz="4" w:space="0"/>
           <w:bottom w:val="single" w:color="000000" w:themeColor="accent2" w:themeTint="97" w:sz="4" w:space="0"/>
-          <w:right w:val="none"/>
+          <w:right w:val="none" w:color="000000" w:sz="4" w:space="0"/>
         </w:tcBorders>
       </w:tcPr>
     </w:tblStylePr>
@@ -24126,12 +24196,12 @@
         <w:tblBorders/>
       </w:tblPr>
       <w:tcPr>
-        <w:shd w:color="ffffff"/>
+        <w:shd w:val="clear" w:color="ffffff"/>
         <w:tcBorders>
-          <w:top w:val="none"/>
+          <w:top w:val="none" w:color="000000" w:sz="4" w:space="0"/>
           <w:left w:val="single" w:color="000000" w:themeColor="accent2" w:themeTint="97" w:sz="4" w:space="0"/>
-          <w:bottom w:val="none"/>
-          <w:right w:val="none"/>
+          <w:bottom w:val="none" w:color="000000" w:sz="4" w:space="0"/>
+          <w:right w:val="none" w:color="000000" w:sz="4" w:space="0"/>
         </w:tcBorders>
       </w:tcPr>
     </w:tblStylePr>
@@ -24154,9 +24224,9 @@
         <w:shd w:val="clear" w:color="ffffff" w:themeColor="light1" w:fill="ffffff" w:themeFill="light1"/>
         <w:tcBorders>
           <w:top w:val="single" w:color="000000" w:themeColor="accent2" w:themeTint="97" w:sz="4" w:space="0"/>
-          <w:left w:val="none"/>
-          <w:bottom w:val="none"/>
-          <w:right w:val="none"/>
+          <w:left w:val="none" w:color="000000" w:sz="4" w:space="0"/>
+          <w:bottom w:val="none" w:color="000000" w:sz="4" w:space="0"/>
+          <w:right w:val="none" w:color="000000" w:sz="4" w:space="0"/>
         </w:tcBorders>
       </w:tcPr>
     </w:tblStylePr>
@@ -24231,9 +24301,9 @@
       </w:tcPr>
     </w:tblStylePr>
   </w:style>
-  <w:style w:type="table" w:styleId="112">
+  <w:style w:type="table" w:styleId="803">
     <w:name w:val="List Table 7 Colorful - Accent 3"/>
-    <w:basedOn w:val="10"/>
+    <w:basedOn w:val="701"/>
     <w:uiPriority w:val="99"/>
     <w:pPr>
       <w:pBdr/>
@@ -24332,11 +24402,11 @@
         <w:tblBorders/>
       </w:tblPr>
       <w:tcPr>
-        <w:shd w:color="ffffff"/>
+        <w:shd w:val="clear" w:color="ffffff"/>
         <w:tcBorders>
-          <w:top w:val="none"/>
-          <w:left w:val="none"/>
-          <w:bottom w:val="none"/>
+          <w:top w:val="none" w:color="000000" w:sz="4" w:space="0"/>
+          <w:left w:val="none" w:color="000000" w:sz="4" w:space="0"/>
+          <w:bottom w:val="none" w:color="000000" w:sz="4" w:space="0"/>
           <w:right w:val="single" w:color="000000" w:themeColor="accent3" w:themeTint="98" w:sz="4" w:space="0"/>
         </w:tcBorders>
       </w:tcPr>
@@ -24359,10 +24429,10 @@
       <w:tcPr>
         <w:shd w:val="clear" w:color="ffffff" w:themeColor="light1" w:fill="ffffff" w:themeFill="light1"/>
         <w:tcBorders>
-          <w:top w:val="none"/>
-          <w:left w:val="none"/>
+          <w:top w:val="none" w:color="000000" w:sz="4" w:space="0"/>
+          <w:left w:val="none" w:color="000000" w:sz="4" w:space="0"/>
           <w:bottom w:val="single" w:color="000000" w:themeColor="accent3" w:themeTint="98" w:sz="4" w:space="0"/>
-          <w:right w:val="none"/>
+          <w:right w:val="none" w:color="000000" w:sz="4" w:space="0"/>
         </w:tcBorders>
       </w:tcPr>
     </w:tblStylePr>
@@ -24382,12 +24452,12 @@
         <w:tblBorders/>
       </w:tblPr>
       <w:tcPr>
-        <w:shd w:color="ffffff"/>
+        <w:shd w:val="clear" w:color="ffffff"/>
         <w:tcBorders>
-          <w:top w:val="none"/>
+          <w:top w:val="none" w:color="000000" w:sz="4" w:space="0"/>
           <w:left w:val="single" w:color="000000" w:themeColor="accent3" w:themeTint="98" w:sz="4" w:space="0"/>
-          <w:bottom w:val="none"/>
-          <w:right w:val="none"/>
+          <w:bottom w:val="none" w:color="000000" w:sz="4" w:space="0"/>
+          <w:right w:val="none" w:color="000000" w:sz="4" w:space="0"/>
         </w:tcBorders>
       </w:tcPr>
     </w:tblStylePr>
@@ -24410,9 +24480,9 @@
         <w:shd w:val="clear" w:color="ffffff" w:themeColor="light1" w:fill="ffffff" w:themeFill="light1"/>
         <w:tcBorders>
           <w:top w:val="single" w:color="000000" w:themeColor="accent3" w:themeTint="98" w:sz="4" w:space="0"/>
-          <w:left w:val="none"/>
-          <w:bottom w:val="none"/>
-          <w:right w:val="none"/>
+          <w:left w:val="none" w:color="000000" w:sz="4" w:space="0"/>
+          <w:bottom w:val="none" w:color="000000" w:sz="4" w:space="0"/>
+          <w:right w:val="none" w:color="000000" w:sz="4" w:space="0"/>
         </w:tcBorders>
       </w:tcPr>
     </w:tblStylePr>
@@ -24487,9 +24557,9 @@
       </w:tcPr>
     </w:tblStylePr>
   </w:style>
-  <w:style w:type="table" w:styleId="113">
+  <w:style w:type="table" w:styleId="804">
     <w:name w:val="List Table 7 Colorful - Accent 4"/>
-    <w:basedOn w:val="10"/>
+    <w:basedOn w:val="701"/>
     <w:uiPriority w:val="99"/>
     <w:pPr>
       <w:pBdr/>
@@ -24588,11 +24658,11 @@
         <w:tblBorders/>
       </w:tblPr>
       <w:tcPr>
-        <w:shd w:color="ffffff"/>
+        <w:shd w:val="clear" w:color="ffffff"/>
         <w:tcBorders>
-          <w:top w:val="none"/>
-          <w:left w:val="none"/>
-          <w:bottom w:val="none"/>
+          <w:top w:val="none" w:color="000000" w:sz="4" w:space="0"/>
+          <w:left w:val="none" w:color="000000" w:sz="4" w:space="0"/>
+          <w:bottom w:val="none" w:color="000000" w:sz="4" w:space="0"/>
           <w:right w:val="single" w:color="000000" w:themeColor="accent4" w:themeTint="9A" w:sz="4" w:space="0"/>
         </w:tcBorders>
       </w:tcPr>
@@ -24615,10 +24685,10 @@
       <w:tcPr>
         <w:shd w:val="clear" w:color="ffffff" w:themeColor="light1" w:fill="ffffff" w:themeFill="light1"/>
         <w:tcBorders>
-          <w:top w:val="none"/>
-          <w:left w:val="none"/>
+          <w:top w:val="none" w:color="000000" w:sz="4" w:space="0"/>
+          <w:left w:val="none" w:color="000000" w:sz="4" w:space="0"/>
           <w:bottom w:val="single" w:color="000000" w:themeColor="accent4" w:themeTint="9A" w:sz="4" w:space="0"/>
-          <w:right w:val="none"/>
+          <w:right w:val="none" w:color="000000" w:sz="4" w:space="0"/>
         </w:tcBorders>
       </w:tcPr>
     </w:tblStylePr>
@@ -24638,12 +24708,12 @@
         <w:tblBorders/>
       </w:tblPr>
       <w:tcPr>
-        <w:shd w:color="ffffff"/>
+        <w:shd w:val="clear" w:color="ffffff"/>
         <w:tcBorders>
-          <w:top w:val="none"/>
+          <w:top w:val="none" w:color="000000" w:sz="4" w:space="0"/>
           <w:left w:val="single" w:color="000000" w:themeColor="accent4" w:themeTint="9A" w:sz="4" w:space="0"/>
-          <w:bottom w:val="none"/>
-          <w:right w:val="none"/>
+          <w:bottom w:val="none" w:color="000000" w:sz="4" w:space="0"/>
+          <w:right w:val="none" w:color="000000" w:sz="4" w:space="0"/>
         </w:tcBorders>
       </w:tcPr>
     </w:tblStylePr>
@@ -24666,9 +24736,9 @@
         <w:shd w:val="clear" w:color="ffffff" w:themeColor="light1" w:fill="ffffff" w:themeFill="light1"/>
         <w:tcBorders>
           <w:top w:val="single" w:color="000000" w:themeColor="accent4" w:themeTint="9A" w:sz="4" w:space="0"/>
-          <w:left w:val="none"/>
-          <w:bottom w:val="none"/>
-          <w:right w:val="none"/>
+          <w:left w:val="none" w:color="000000" w:sz="4" w:space="0"/>
+          <w:bottom w:val="none" w:color="000000" w:sz="4" w:space="0"/>
+          <w:right w:val="none" w:color="000000" w:sz="4" w:space="0"/>
         </w:tcBorders>
       </w:tcPr>
     </w:tblStylePr>
@@ -24743,9 +24813,9 @@
       </w:tcPr>
     </w:tblStylePr>
   </w:style>
-  <w:style w:type="table" w:styleId="114">
+  <w:style w:type="table" w:styleId="805">
     <w:name w:val="List Table 7 Colorful - Accent 5"/>
-    <w:basedOn w:val="10"/>
+    <w:basedOn w:val="701"/>
     <w:uiPriority w:val="99"/>
     <w:pPr>
       <w:pBdr/>
@@ -24844,11 +24914,11 @@
         <w:tblBorders/>
       </w:tblPr>
       <w:tcPr>
-        <w:shd w:color="ffffff"/>
+        <w:shd w:val="clear" w:color="ffffff"/>
         <w:tcBorders>
-          <w:top w:val="none"/>
-          <w:left w:val="none"/>
-          <w:bottom w:val="none"/>
+          <w:top w:val="none" w:color="000000" w:sz="4" w:space="0"/>
+          <w:left w:val="none" w:color="000000" w:sz="4" w:space="0"/>
+          <w:bottom w:val="none" w:color="000000" w:sz="4" w:space="0"/>
           <w:right w:val="single" w:color="000000" w:themeColor="accent5" w:themeTint="9A" w:sz="4" w:space="0"/>
         </w:tcBorders>
       </w:tcPr>
@@ -24871,10 +24941,10 @@
       <w:tcPr>
         <w:shd w:val="clear" w:color="ffffff" w:themeColor="light1" w:fill="ffffff" w:themeFill="light1"/>
         <w:tcBorders>
-          <w:top w:val="none"/>
-          <w:left w:val="none"/>
+          <w:top w:val="none" w:color="000000" w:sz="4" w:space="0"/>
+          <w:left w:val="none" w:color="000000" w:sz="4" w:space="0"/>
           <w:bottom w:val="single" w:color="000000" w:themeColor="accent5" w:themeTint="9A" w:sz="4" w:space="0"/>
-          <w:right w:val="none"/>
+          <w:right w:val="none" w:color="000000" w:sz="4" w:space="0"/>
         </w:tcBorders>
       </w:tcPr>
     </w:tblStylePr>
@@ -24894,12 +24964,12 @@
         <w:tblBorders/>
       </w:tblPr>
       <w:tcPr>
-        <w:shd w:color="ffffff"/>
+        <w:shd w:val="clear" w:color="ffffff"/>
         <w:tcBorders>
-          <w:top w:val="none"/>
+          <w:top w:val="none" w:color="000000" w:sz="4" w:space="0"/>
           <w:left w:val="single" w:color="000000" w:themeColor="accent5" w:themeTint="9A" w:sz="4" w:space="0"/>
-          <w:bottom w:val="none"/>
-          <w:right w:val="none"/>
+          <w:bottom w:val="none" w:color="000000" w:sz="4" w:space="0"/>
+          <w:right w:val="none" w:color="000000" w:sz="4" w:space="0"/>
         </w:tcBorders>
       </w:tcPr>
     </w:tblStylePr>
@@ -24922,9 +24992,9 @@
         <w:shd w:val="clear" w:color="ffffff" w:themeColor="light1" w:fill="ffffff" w:themeFill="light1"/>
         <w:tcBorders>
           <w:top w:val="single" w:color="000000" w:themeColor="accent5" w:themeTint="9A" w:sz="4" w:space="0"/>
-          <w:left w:val="none"/>
-          <w:bottom w:val="none"/>
-          <w:right w:val="none"/>
+          <w:left w:val="none" w:color="000000" w:sz="4" w:space="0"/>
+          <w:bottom w:val="none" w:color="000000" w:sz="4" w:space="0"/>
+          <w:right w:val="none" w:color="000000" w:sz="4" w:space="0"/>
         </w:tcBorders>
       </w:tcPr>
     </w:tblStylePr>
@@ -24999,9 +25069,9 @@
       </w:tcPr>
     </w:tblStylePr>
   </w:style>
-  <w:style w:type="table" w:styleId="115">
+  <w:style w:type="table" w:styleId="806">
     <w:name w:val="List Table 7 Colorful - Accent 6"/>
-    <w:basedOn w:val="10"/>
+    <w:basedOn w:val="701"/>
     <w:uiPriority w:val="99"/>
     <w:pPr>
       <w:pBdr/>
@@ -25100,11 +25170,11 @@
         <w:tblBorders/>
       </w:tblPr>
       <w:tcPr>
-        <w:shd w:color="ffffff"/>
+        <w:shd w:val="clear" w:color="ffffff"/>
         <w:tcBorders>
-          <w:top w:val="none"/>
-          <w:left w:val="none"/>
-          <w:bottom w:val="none"/>
+          <w:top w:val="none" w:color="000000" w:sz="4" w:space="0"/>
+          <w:left w:val="none" w:color="000000" w:sz="4" w:space="0"/>
+          <w:bottom w:val="none" w:color="000000" w:sz="4" w:space="0"/>
           <w:right w:val="single" w:color="000000" w:themeColor="accent6" w:themeTint="98" w:sz="4" w:space="0"/>
         </w:tcBorders>
       </w:tcPr>
@@ -25127,10 +25197,10 @@
       <w:tcPr>
         <w:shd w:val="clear" w:color="ffffff" w:themeColor="light1" w:fill="ffffff" w:themeFill="light1"/>
         <w:tcBorders>
-          <w:top w:val="none"/>
-          <w:left w:val="none"/>
+          <w:top w:val="none" w:color="000000" w:sz="4" w:space="0"/>
+          <w:left w:val="none" w:color="000000" w:sz="4" w:space="0"/>
           <w:bottom w:val="single" w:color="000000" w:themeColor="accent6" w:themeTint="98" w:sz="4" w:space="0"/>
-          <w:right w:val="none"/>
+          <w:right w:val="none" w:color="000000" w:sz="4" w:space="0"/>
         </w:tcBorders>
       </w:tcPr>
     </w:tblStylePr>
@@ -25150,12 +25220,12 @@
         <w:tblBorders/>
       </w:tblPr>
       <w:tcPr>
-        <w:shd w:color="ffffff"/>
+        <w:shd w:val="clear" w:color="ffffff"/>
         <w:tcBorders>
-          <w:top w:val="none"/>
+          <w:top w:val="none" w:color="000000" w:sz="4" w:space="0"/>
           <w:left w:val="single" w:color="000000" w:themeColor="accent6" w:themeTint="98" w:sz="4" w:space="0"/>
-          <w:bottom w:val="none"/>
-          <w:right w:val="none"/>
+          <w:bottom w:val="none" w:color="000000" w:sz="4" w:space="0"/>
+          <w:right w:val="none" w:color="000000" w:sz="4" w:space="0"/>
         </w:tcBorders>
       </w:tcPr>
     </w:tblStylePr>
@@ -25178,9 +25248,9 @@
         <w:shd w:val="clear" w:color="ffffff" w:themeColor="light1" w:fill="ffffff" w:themeFill="light1"/>
         <w:tcBorders>
           <w:top w:val="single" w:color="000000" w:themeColor="accent6" w:themeTint="98" w:sz="4" w:space="0"/>
-          <w:left w:val="none"/>
-          <w:bottom w:val="none"/>
-          <w:right w:val="none"/>
+          <w:left w:val="none" w:color="000000" w:sz="4" w:space="0"/>
+          <w:bottom w:val="none" w:color="000000" w:sz="4" w:space="0"/>
+          <w:right w:val="none" w:color="000000" w:sz="4" w:space="0"/>
         </w:tcBorders>
       </w:tcPr>
     </w:tblStylePr>
@@ -25255,9 +25325,9 @@
       </w:tcPr>
     </w:tblStylePr>
   </w:style>
-  <w:style w:type="table" w:styleId="116">
+  <w:style w:type="table" w:styleId="807">
     <w:name w:val="Lined - Accent"/>
-    <w:basedOn w:val="10"/>
+    <w:basedOn w:val="701"/>
     <w:uiPriority w:val="99"/>
     <w:pPr>
       <w:pBdr/>
@@ -25492,9 +25562,9 @@
       </w:tcPr>
     </w:tblStylePr>
   </w:style>
-  <w:style w:type="table" w:styleId="117">
+  <w:style w:type="table" w:styleId="808">
     <w:name w:val="Lined - Accent 1"/>
-    <w:basedOn w:val="10"/>
+    <w:basedOn w:val="701"/>
     <w:uiPriority w:val="99"/>
     <w:pPr>
       <w:pBdr/>
@@ -25729,9 +25799,9 @@
       </w:tcPr>
     </w:tblStylePr>
   </w:style>
-  <w:style w:type="table" w:styleId="118">
+  <w:style w:type="table" w:styleId="809">
     <w:name w:val="Lined - Accent 2"/>
-    <w:basedOn w:val="10"/>
+    <w:basedOn w:val="701"/>
     <w:uiPriority w:val="99"/>
     <w:pPr>
       <w:pBdr/>
@@ -25966,9 +26036,9 @@
       </w:tcPr>
     </w:tblStylePr>
   </w:style>
-  <w:style w:type="table" w:styleId="119">
+  <w:style w:type="table" w:styleId="810">
     <w:name w:val="Lined - Accent 3"/>
-    <w:basedOn w:val="10"/>
+    <w:basedOn w:val="701"/>
     <w:uiPriority w:val="99"/>
     <w:pPr>
       <w:pBdr/>
@@ -26203,9 +26273,9 @@
       </w:tcPr>
     </w:tblStylePr>
   </w:style>
-  <w:style w:type="table" w:styleId="120">
+  <w:style w:type="table" w:styleId="811">
     <w:name w:val="Lined - Accent 4"/>
-    <w:basedOn w:val="10"/>
+    <w:basedOn w:val="701"/>
     <w:uiPriority w:val="99"/>
     <w:pPr>
       <w:pBdr/>
@@ -26440,9 +26510,9 @@
       </w:tcPr>
     </w:tblStylePr>
   </w:style>
-  <w:style w:type="table" w:styleId="121">
+  <w:style w:type="table" w:styleId="812">
     <w:name w:val="Lined - Accent 5"/>
-    <w:basedOn w:val="10"/>
+    <w:basedOn w:val="701"/>
     <w:uiPriority w:val="99"/>
     <w:pPr>
       <w:pBdr/>
@@ -26677,9 +26747,9 @@
       </w:tcPr>
     </w:tblStylePr>
   </w:style>
-  <w:style w:type="table" w:styleId="122">
+  <w:style w:type="table" w:styleId="813">
     <w:name w:val="Lined - Accent 6"/>
-    <w:basedOn w:val="10"/>
+    <w:basedOn w:val="701"/>
     <w:uiPriority w:val="99"/>
     <w:pPr>
       <w:pBdr/>
@@ -26914,9 +26984,9 @@
       </w:tcPr>
     </w:tblStylePr>
   </w:style>
-  <w:style w:type="table" w:styleId="123">
+  <w:style w:type="table" w:styleId="814">
     <w:name w:val="Bordered &amp; Lined - Accent"/>
-    <w:basedOn w:val="10"/>
+    <w:basedOn w:val="701"/>
     <w:uiPriority w:val="99"/>
     <w:pPr>
       <w:pBdr/>
@@ -27158,9 +27228,9 @@
       </w:tcPr>
     </w:tblStylePr>
   </w:style>
-  <w:style w:type="table" w:styleId="124">
+  <w:style w:type="table" w:styleId="815">
     <w:name w:val="Bordered &amp; Lined - Accent 1"/>
-    <w:basedOn w:val="10"/>
+    <w:basedOn w:val="701"/>
     <w:uiPriority w:val="99"/>
     <w:pPr>
       <w:pBdr/>
@@ -27402,9 +27472,9 @@
       </w:tcPr>
     </w:tblStylePr>
   </w:style>
-  <w:style w:type="table" w:styleId="125">
+  <w:style w:type="table" w:styleId="816">
     <w:name w:val="Bordered &amp; Lined - Accent 2"/>
-    <w:basedOn w:val="10"/>
+    <w:basedOn w:val="701"/>
     <w:uiPriority w:val="99"/>
     <w:pPr>
       <w:pBdr/>
@@ -27646,9 +27716,9 @@
       </w:tcPr>
     </w:tblStylePr>
   </w:style>
-  <w:style w:type="table" w:styleId="126">
+  <w:style w:type="table" w:styleId="817">
     <w:name w:val="Bordered &amp; Lined - Accent 3"/>
-    <w:basedOn w:val="10"/>
+    <w:basedOn w:val="701"/>
     <w:uiPriority w:val="99"/>
     <w:pPr>
       <w:pBdr/>
@@ -27890,9 +27960,9 @@
       </w:tcPr>
     </w:tblStylePr>
   </w:style>
-  <w:style w:type="table" w:styleId="127">
+  <w:style w:type="table" w:styleId="818">
     <w:name w:val="Bordered &amp; Lined - Accent 4"/>
-    <w:basedOn w:val="10"/>
+    <w:basedOn w:val="701"/>
     <w:uiPriority w:val="99"/>
     <w:pPr>
       <w:pBdr/>
@@ -28134,9 +28204,9 @@
       </w:tcPr>
     </w:tblStylePr>
   </w:style>
-  <w:style w:type="table" w:styleId="128">
+  <w:style w:type="table" w:styleId="819">
     <w:name w:val="Bordered &amp; Lined - Accent 5"/>
-    <w:basedOn w:val="10"/>
+    <w:basedOn w:val="701"/>
     <w:uiPriority w:val="99"/>
     <w:pPr>
       <w:pBdr/>
@@ -28378,9 +28448,9 @@
       </w:tcPr>
     </w:tblStylePr>
   </w:style>
-  <w:style w:type="table" w:styleId="129">
+  <w:style w:type="table" w:styleId="820">
     <w:name w:val="Bordered &amp; Lined - Accent 6"/>
-    <w:basedOn w:val="10"/>
+    <w:basedOn w:val="701"/>
     <w:uiPriority w:val="99"/>
     <w:pPr>
       <w:pBdr/>
@@ -28622,9 +28692,9 @@
       </w:tcPr>
     </w:tblStylePr>
   </w:style>
-  <w:style w:type="table" w:styleId="130">
+  <w:style w:type="table" w:styleId="821">
     <w:name w:val="Bordered"/>
-    <w:basedOn w:val="10"/>
+    <w:basedOn w:val="701"/>
     <w:uiPriority w:val="99"/>
     <w:pPr>
       <w:pBdr/>
@@ -28853,9 +28923,9 @@
       </w:tcPr>
     </w:tblStylePr>
   </w:style>
-  <w:style w:type="table" w:styleId="131">
+  <w:style w:type="table" w:styleId="822">
     <w:name w:val="Bordered - Accent 1"/>
-    <w:basedOn w:val="10"/>
+    <w:basedOn w:val="701"/>
     <w:uiPriority w:val="99"/>
     <w:pPr>
       <w:pBdr/>
@@ -29084,9 +29154,9 @@
       </w:tcPr>
     </w:tblStylePr>
   </w:style>
-  <w:style w:type="table" w:styleId="132">
+  <w:style w:type="table" w:styleId="823">
     <w:name w:val="Bordered - Accent 2"/>
-    <w:basedOn w:val="10"/>
+    <w:basedOn w:val="701"/>
     <w:uiPriority w:val="99"/>
     <w:pPr>
       <w:pBdr/>
@@ -29315,9 +29385,9 @@
       </w:tcPr>
     </w:tblStylePr>
   </w:style>
-  <w:style w:type="table" w:styleId="133">
+  <w:style w:type="table" w:styleId="824">
     <w:name w:val="Bordered - Accent 3"/>
-    <w:basedOn w:val="10"/>
+    <w:basedOn w:val="701"/>
     <w:uiPriority w:val="99"/>
     <w:pPr>
       <w:pBdr/>
@@ -29546,9 +29616,9 @@
       </w:tcPr>
     </w:tblStylePr>
   </w:style>
-  <w:style w:type="table" w:styleId="134">
+  <w:style w:type="table" w:styleId="825">
     <w:name w:val="Bordered - Accent 4"/>
-    <w:basedOn w:val="10"/>
+    <w:basedOn w:val="701"/>
     <w:uiPriority w:val="99"/>
     <w:pPr>
       <w:pBdr/>
@@ -29777,9 +29847,9 @@
       </w:tcPr>
     </w:tblStylePr>
   </w:style>
-  <w:style w:type="table" w:styleId="135">
+  <w:style w:type="table" w:styleId="826">
     <w:name w:val="Bordered - Accent 5"/>
-    <w:basedOn w:val="10"/>
+    <w:basedOn w:val="701"/>
     <w:uiPriority w:val="99"/>
     <w:pPr>
       <w:pBdr/>
@@ -30008,9 +30078,9 @@
       </w:tcPr>
     </w:tblStylePr>
   </w:style>
-  <w:style w:type="table" w:styleId="136">
+  <w:style w:type="table" w:styleId="827">
     <w:name w:val="Bordered - Accent 6"/>
-    <w:basedOn w:val="10"/>
+    <w:basedOn w:val="701"/>
     <w:uiPriority w:val="99"/>
     <w:pPr>
       <w:pBdr/>
@@ -30239,11 +30309,11 @@
       </w:tcPr>
     </w:tblStylePr>
   </w:style>
-  <w:style w:type="paragraph" w:styleId="138">
+  <w:style w:type="paragraph" w:styleId="828">
     <w:name w:val="Heading 1"/>
-    <w:basedOn w:val="660"/>
-    <w:next w:val="660"/>
-    <w:link w:val="149"/>
+    <w:basedOn w:val="886"/>
+    <w:next w:val="886"/>
+    <w:link w:val="839"/>
     <w:uiPriority w:val="9"/>
     <w:qFormat/>
     <w:pPr>
@@ -30261,11 +30331,11 @@
       <w:szCs w:val="40"/>
     </w:rPr>
   </w:style>
-  <w:style w:type="paragraph" w:styleId="139">
+  <w:style w:type="paragraph" w:styleId="829">
     <w:name w:val="Heading 2"/>
-    <w:basedOn w:val="660"/>
-    <w:next w:val="660"/>
-    <w:link w:val="150"/>
+    <w:basedOn w:val="886"/>
+    <w:next w:val="886"/>
+    <w:link w:val="840"/>
     <w:uiPriority w:val="9"/>
     <w:unhideWhenUsed/>
     <w:qFormat/>
@@ -30284,11 +30354,11 @@
       <w:szCs w:val="32"/>
     </w:rPr>
   </w:style>
-  <w:style w:type="paragraph" w:styleId="140">
+  <w:style w:type="paragraph" w:styleId="830">
     <w:name w:val="Heading 3"/>
-    <w:basedOn w:val="660"/>
-    <w:next w:val="660"/>
-    <w:link w:val="151"/>
+    <w:basedOn w:val="886"/>
+    <w:next w:val="886"/>
+    <w:link w:val="841"/>
     <w:uiPriority w:val="9"/>
     <w:unhideWhenUsed/>
     <w:qFormat/>
@@ -30307,11 +30377,11 @@
       <w:szCs w:val="28"/>
     </w:rPr>
   </w:style>
-  <w:style w:type="paragraph" w:styleId="141">
+  <w:style w:type="paragraph" w:styleId="831">
     <w:name w:val="Heading 4"/>
-    <w:basedOn w:val="660"/>
-    <w:next w:val="660"/>
-    <w:link w:val="152"/>
+    <w:basedOn w:val="886"/>
+    <w:next w:val="886"/>
+    <w:link w:val="842"/>
     <w:uiPriority w:val="9"/>
     <w:unhideWhenUsed/>
     <w:qFormat/>
@@ -30330,11 +30400,11 @@
       <w:color w:val="0f4761" w:themeColor="accent1" w:themeShade="BF"/>
     </w:rPr>
   </w:style>
-  <w:style w:type="paragraph" w:styleId="142">
+  <w:style w:type="paragraph" w:styleId="832">
     <w:name w:val="Heading 5"/>
-    <w:basedOn w:val="660"/>
-    <w:next w:val="660"/>
-    <w:link w:val="153"/>
+    <w:basedOn w:val="886"/>
+    <w:next w:val="886"/>
+    <w:link w:val="843"/>
     <w:uiPriority w:val="9"/>
     <w:unhideWhenUsed/>
     <w:qFormat/>
@@ -30351,11 +30421,11 @@
       <w:color w:val="0f4761" w:themeColor="accent1" w:themeShade="BF"/>
     </w:rPr>
   </w:style>
-  <w:style w:type="paragraph" w:styleId="143">
+  <w:style w:type="paragraph" w:styleId="833">
     <w:name w:val="Heading 6"/>
-    <w:basedOn w:val="660"/>
-    <w:next w:val="660"/>
-    <w:link w:val="154"/>
+    <w:basedOn w:val="886"/>
+    <w:next w:val="886"/>
+    <w:link w:val="844"/>
     <w:uiPriority w:val="9"/>
     <w:unhideWhenUsed/>
     <w:qFormat/>
@@ -30374,11 +30444,11 @@
       <w:color w:val="595959" w:themeColor="text1" w:themeTint="A6"/>
     </w:rPr>
   </w:style>
-  <w:style w:type="paragraph" w:styleId="144">
+  <w:style w:type="paragraph" w:styleId="834">
     <w:name w:val="Heading 7"/>
-    <w:basedOn w:val="660"/>
-    <w:next w:val="660"/>
-    <w:link w:val="155"/>
+    <w:basedOn w:val="886"/>
+    <w:next w:val="886"/>
+    <w:link w:val="845"/>
     <w:uiPriority w:val="9"/>
     <w:unhideWhenUsed/>
     <w:qFormat/>
@@ -30395,11 +30465,11 @@
       <w:color w:val="595959" w:themeColor="text1" w:themeTint="A6"/>
     </w:rPr>
   </w:style>
-  <w:style w:type="paragraph" w:styleId="145">
+  <w:style w:type="paragraph" w:styleId="835">
     <w:name w:val="Heading 8"/>
-    <w:basedOn w:val="660"/>
-    <w:next w:val="660"/>
-    <w:link w:val="156"/>
+    <w:basedOn w:val="886"/>
+    <w:next w:val="886"/>
+    <w:link w:val="846"/>
     <w:uiPriority w:val="9"/>
     <w:unhideWhenUsed/>
     <w:qFormat/>
@@ -30418,11 +30488,11 @@
       <w:color w:val="272727" w:themeColor="text1" w:themeTint="D8"/>
     </w:rPr>
   </w:style>
-  <w:style w:type="paragraph" w:styleId="146">
+  <w:style w:type="paragraph" w:styleId="836">
     <w:name w:val="Heading 9"/>
-    <w:basedOn w:val="660"/>
-    <w:next w:val="660"/>
-    <w:link w:val="157"/>
+    <w:basedOn w:val="886"/>
+    <w:next w:val="886"/>
+    <w:link w:val="847"/>
     <w:uiPriority w:val="9"/>
     <w:unhideWhenUsed/>
     <w:qFormat/>
@@ -30441,7 +30511,7 @@
       <w:color w:val="272727" w:themeColor="text1" w:themeTint="D8"/>
     </w:rPr>
   </w:style>
-  <w:style w:type="character" w:styleId="147" w:default="1">
+  <w:style w:type="character" w:styleId="837" w:default="1">
     <w:name w:val="Default Paragraph Font"/>
     <w:uiPriority w:val="1"/>
     <w:semiHidden/>
@@ -30452,7 +30522,7 @@
       <w:ind/>
     </w:pPr>
   </w:style>
-  <w:style w:type="numbering" w:styleId="148" w:default="1">
+  <w:style w:type="numbering" w:styleId="838" w:default="1">
     <w:name w:val="No List"/>
     <w:uiPriority w:val="99"/>
     <w:semiHidden/>
@@ -30463,10 +30533,10 @@
       <w:ind/>
     </w:pPr>
   </w:style>
-  <w:style w:type="character" w:styleId="149">
+  <w:style w:type="character" w:styleId="839">
     <w:name w:val="Heading 1 Char"/>
-    <w:basedOn w:val="147"/>
-    <w:link w:val="138"/>
+    <w:basedOn w:val="837"/>
+    <w:link w:val="828"/>
     <w:uiPriority w:val="9"/>
     <w:pPr>
       <w:pBdr/>
@@ -30480,10 +30550,10 @@
       <w:szCs w:val="40"/>
     </w:rPr>
   </w:style>
-  <w:style w:type="character" w:styleId="150">
+  <w:style w:type="character" w:styleId="840">
     <w:name w:val="Heading 2 Char"/>
-    <w:basedOn w:val="147"/>
-    <w:link w:val="139"/>
+    <w:basedOn w:val="837"/>
+    <w:link w:val="829"/>
     <w:uiPriority w:val="9"/>
     <w:pPr>
       <w:pBdr/>
@@ -30497,10 +30567,10 @@
       <w:szCs w:val="32"/>
     </w:rPr>
   </w:style>
-  <w:style w:type="character" w:styleId="151">
+  <w:style w:type="character" w:styleId="841">
     <w:name w:val="Heading 3 Char"/>
-    <w:basedOn w:val="147"/>
-    <w:link w:val="140"/>
+    <w:basedOn w:val="837"/>
+    <w:link w:val="830"/>
     <w:uiPriority w:val="9"/>
     <w:pPr>
       <w:pBdr/>
@@ -30514,10 +30584,10 @@
       <w:szCs w:val="28"/>
     </w:rPr>
   </w:style>
-  <w:style w:type="character" w:styleId="152">
+  <w:style w:type="character" w:styleId="842">
     <w:name w:val="Heading 4 Char"/>
-    <w:basedOn w:val="147"/>
-    <w:link w:val="141"/>
+    <w:basedOn w:val="837"/>
+    <w:link w:val="831"/>
     <w:uiPriority w:val="9"/>
     <w:pPr>
       <w:pBdr/>
@@ -30531,10 +30601,10 @@
       <w:color w:val="0f4761" w:themeColor="accent1" w:themeShade="BF"/>
     </w:rPr>
   </w:style>
-  <w:style w:type="character" w:styleId="153">
+  <w:style w:type="character" w:styleId="843">
     <w:name w:val="Heading 5 Char"/>
-    <w:basedOn w:val="147"/>
-    <w:link w:val="142"/>
+    <w:basedOn w:val="837"/>
+    <w:link w:val="832"/>
     <w:uiPriority w:val="9"/>
     <w:pPr>
       <w:pBdr/>
@@ -30546,10 +30616,10 @@
       <w:color w:val="0f4761" w:themeColor="accent1" w:themeShade="BF"/>
     </w:rPr>
   </w:style>
-  <w:style w:type="character" w:styleId="154">
+  <w:style w:type="character" w:styleId="844">
     <w:name w:val="Heading 6 Char"/>
-    <w:basedOn w:val="147"/>
-    <w:link w:val="143"/>
+    <w:basedOn w:val="837"/>
+    <w:link w:val="833"/>
     <w:uiPriority w:val="9"/>
     <w:pPr>
       <w:pBdr/>
@@ -30563,10 +30633,10 @@
       <w:color w:val="595959" w:themeColor="text1" w:themeTint="A6"/>
     </w:rPr>
   </w:style>
-  <w:style w:type="character" w:styleId="155">
+  <w:style w:type="character" w:styleId="845">
     <w:name w:val="Heading 7 Char"/>
-    <w:basedOn w:val="147"/>
-    <w:link w:val="144"/>
+    <w:basedOn w:val="837"/>
+    <w:link w:val="834"/>
     <w:uiPriority w:val="9"/>
     <w:pPr>
       <w:pBdr/>
@@ -30578,10 +30648,10 @@
       <w:color w:val="595959" w:themeColor="text1" w:themeTint="A6"/>
     </w:rPr>
   </w:style>
-  <w:style w:type="character" w:styleId="156">
+  <w:style w:type="character" w:styleId="846">
     <w:name w:val="Heading 8 Char"/>
-    <w:basedOn w:val="147"/>
-    <w:link w:val="145"/>
+    <w:basedOn w:val="837"/>
+    <w:link w:val="835"/>
     <w:uiPriority w:val="9"/>
     <w:pPr>
       <w:pBdr/>
@@ -30595,10 +30665,10 @@
       <w:color w:val="272727" w:themeColor="text1" w:themeTint="D8"/>
     </w:rPr>
   </w:style>
-  <w:style w:type="character" w:styleId="157">
+  <w:style w:type="character" w:styleId="847">
     <w:name w:val="Heading 9 Char"/>
-    <w:basedOn w:val="147"/>
-    <w:link w:val="146"/>
+    <w:basedOn w:val="837"/>
+    <w:link w:val="836"/>
     <w:uiPriority w:val="9"/>
     <w:pPr>
       <w:pBdr/>
@@ -30612,11 +30682,11 @@
       <w:color w:val="272727" w:themeColor="text1" w:themeTint="D8"/>
     </w:rPr>
   </w:style>
-  <w:style w:type="paragraph" w:styleId="158">
+  <w:style w:type="paragraph" w:styleId="848">
     <w:name w:val="Title"/>
-    <w:basedOn w:val="660"/>
-    <w:next w:val="660"/>
-    <w:link w:val="159"/>
+    <w:basedOn w:val="886"/>
+    <w:next w:val="886"/>
+    <w:link w:val="849"/>
     <w:uiPriority w:val="10"/>
     <w:qFormat/>
     <w:pPr>
@@ -30632,10 +30702,10 @@
       <w:szCs w:val="56"/>
     </w:rPr>
   </w:style>
-  <w:style w:type="character" w:styleId="159">
+  <w:style w:type="character" w:styleId="849">
     <w:name w:val="Title Char"/>
-    <w:basedOn w:val="147"/>
-    <w:link w:val="158"/>
+    <w:basedOn w:val="837"/>
+    <w:link w:val="848"/>
     <w:uiPriority w:val="10"/>
     <w:pPr>
       <w:pBdr/>
@@ -30649,11 +30719,11 @@
       <w:szCs w:val="56"/>
     </w:rPr>
   </w:style>
-  <w:style w:type="paragraph" w:styleId="160">
+  <w:style w:type="paragraph" w:styleId="850">
     <w:name w:val="Subtitle"/>
-    <w:basedOn w:val="660"/>
-    <w:next w:val="660"/>
-    <w:link w:val="161"/>
+    <w:basedOn w:val="886"/>
+    <w:next w:val="886"/>
+    <w:link w:val="851"/>
     <w:uiPriority w:val="11"/>
     <w:qFormat/>
     <w:pPr>
@@ -30671,10 +30741,10 @@
       <w:szCs w:val="28"/>
     </w:rPr>
   </w:style>
-  <w:style w:type="character" w:styleId="161">
+  <w:style w:type="character" w:styleId="851">
     <w:name w:val="Subtitle Char"/>
-    <w:basedOn w:val="147"/>
-    <w:link w:val="160"/>
+    <w:basedOn w:val="837"/>
+    <w:link w:val="850"/>
     <w:uiPriority w:val="11"/>
     <w:pPr>
       <w:pBdr/>
@@ -30688,11 +30758,11 @@
       <w:szCs w:val="28"/>
     </w:rPr>
   </w:style>
-  <w:style w:type="paragraph" w:styleId="162">
+  <w:style w:type="paragraph" w:styleId="852">
     <w:name w:val="Quote"/>
-    <w:basedOn w:val="660"/>
-    <w:next w:val="660"/>
-    <w:link w:val="163"/>
+    <w:basedOn w:val="886"/>
+    <w:next w:val="886"/>
+    <w:link w:val="853"/>
     <w:uiPriority w:val="29"/>
     <w:qFormat/>
     <w:pPr>
@@ -30707,10 +30777,10 @@
       <w:color w:val="404040" w:themeColor="text1" w:themeTint="BF"/>
     </w:rPr>
   </w:style>
-  <w:style w:type="character" w:styleId="163">
+  <w:style w:type="character" w:styleId="853">
     <w:name w:val="Quote Char"/>
-    <w:basedOn w:val="147"/>
-    <w:link w:val="162"/>
+    <w:basedOn w:val="837"/>
+    <w:link w:val="852"/>
     <w:uiPriority w:val="29"/>
     <w:pPr>
       <w:pBdr/>
@@ -30723,9 +30793,9 @@
       <w:color w:val="404040" w:themeColor="text1" w:themeTint="BF"/>
     </w:rPr>
   </w:style>
-  <w:style w:type="paragraph" w:styleId="164">
+  <w:style w:type="paragraph" w:styleId="854">
     <w:name w:val="List Paragraph"/>
-    <w:basedOn w:val="660"/>
+    <w:basedOn w:val="886"/>
     <w:uiPriority w:val="34"/>
     <w:qFormat/>
     <w:pPr>
@@ -30735,9 +30805,9 @@
       <w:contextualSpacing w:val="true"/>
     </w:pPr>
   </w:style>
-  <w:style w:type="character" w:styleId="165">
+  <w:style w:type="character" w:styleId="855">
     <w:name w:val="Intense Emphasis"/>
-    <w:basedOn w:val="147"/>
+    <w:basedOn w:val="837"/>
     <w:uiPriority w:val="21"/>
     <w:qFormat/>
     <w:pPr>
@@ -30751,11 +30821,11 @@
       <w:color w:val="0f4761" w:themeColor="accent1" w:themeShade="BF"/>
     </w:rPr>
   </w:style>
-  <w:style w:type="paragraph" w:styleId="166">
+  <w:style w:type="paragraph" w:styleId="856">
     <w:name w:val="Intense Quote"/>
-    <w:basedOn w:val="660"/>
-    <w:next w:val="660"/>
-    <w:link w:val="167"/>
+    <w:basedOn w:val="886"/>
+    <w:next w:val="886"/>
+    <w:link w:val="857"/>
     <w:uiPriority w:val="30"/>
     <w:qFormat/>
     <w:pPr>
@@ -30773,10 +30843,10 @@
       <w:color w:val="0f4761" w:themeColor="accent1" w:themeShade="BF"/>
     </w:rPr>
   </w:style>
-  <w:style w:type="character" w:styleId="167">
+  <w:style w:type="character" w:styleId="857">
     <w:name w:val="Intense Quote Char"/>
-    <w:basedOn w:val="147"/>
-    <w:link w:val="166"/>
+    <w:basedOn w:val="837"/>
+    <w:link w:val="856"/>
     <w:uiPriority w:val="30"/>
     <w:pPr>
       <w:pBdr/>
@@ -30789,9 +30859,9 @@
       <w:color w:val="0f4761" w:themeColor="accent1" w:themeShade="BF"/>
     </w:rPr>
   </w:style>
-  <w:style w:type="character" w:styleId="168">
+  <w:style w:type="character" w:styleId="858">
     <w:name w:val="Intense Reference"/>
-    <w:basedOn w:val="147"/>
+    <w:basedOn w:val="837"/>
     <w:uiPriority w:val="32"/>
     <w:qFormat/>
     <w:pPr>
@@ -30807,9 +30877,9 @@
       <w:spacing w:val="5"/>
     </w:rPr>
   </w:style>
-  <w:style w:type="paragraph" w:styleId="169">
+  <w:style w:type="paragraph" w:styleId="859">
     <w:name w:val="No Spacing"/>
-    <w:basedOn w:val="660"/>
+    <w:basedOn w:val="886"/>
     <w:uiPriority w:val="1"/>
     <w:qFormat/>
     <w:pPr>
@@ -30818,9 +30888,9 @@
       <w:ind/>
     </w:pPr>
   </w:style>
-  <w:style w:type="character" w:styleId="170">
+  <w:style w:type="character" w:styleId="860">
     <w:name w:val="Subtle Emphasis"/>
-    <w:basedOn w:val="147"/>
+    <w:basedOn w:val="837"/>
     <w:uiPriority w:val="19"/>
     <w:qFormat/>
     <w:pPr>
@@ -30834,9 +30904,9 @@
       <w:color w:val="404040" w:themeColor="text1" w:themeTint="BF"/>
     </w:rPr>
   </w:style>
-  <w:style w:type="character" w:styleId="171">
+  <w:style w:type="character" w:styleId="861">
     <w:name w:val="Emphasis"/>
-    <w:basedOn w:val="147"/>
+    <w:basedOn w:val="837"/>
     <w:uiPriority w:val="20"/>
     <w:qFormat/>
     <w:pPr>
@@ -30849,9 +30919,9 @@
       <w:iCs/>
     </w:rPr>
   </w:style>
-  <w:style w:type="character" w:styleId="172">
+  <w:style w:type="character" w:styleId="862">
     <w:name w:val="Strong"/>
-    <w:basedOn w:val="147"/>
+    <w:basedOn w:val="837"/>
     <w:uiPriority w:val="22"/>
     <w:qFormat/>
     <w:pPr>
@@ -30864,9 +30934,9 @@
       <w:bCs/>
     </w:rPr>
   </w:style>
-  <w:style w:type="character" w:styleId="173">
+  <w:style w:type="character" w:styleId="863">
     <w:name w:val="Subtle Reference"/>
-    <w:basedOn w:val="147"/>
+    <w:basedOn w:val="837"/>
     <w:uiPriority w:val="31"/>
     <w:qFormat/>
     <w:pPr>
@@ -30879,9 +30949,9 @@
       <w:color w:val="5a5a5a" w:themeColor="text1" w:themeTint="A5"/>
     </w:rPr>
   </w:style>
-  <w:style w:type="character" w:styleId="174">
+  <w:style w:type="character" w:styleId="864">
     <w:name w:val="Book Title"/>
-    <w:basedOn w:val="147"/>
+    <w:basedOn w:val="837"/>
     <w:uiPriority w:val="33"/>
     <w:qFormat/>
     <w:pPr>
@@ -30897,10 +30967,10 @@
       <w:spacing w:val="5"/>
     </w:rPr>
   </w:style>
-  <w:style w:type="paragraph" w:styleId="175">
+  <w:style w:type="paragraph" w:styleId="865">
     <w:name w:val="Header"/>
-    <w:basedOn w:val="660"/>
-    <w:link w:val="176"/>
+    <w:basedOn w:val="886"/>
+    <w:link w:val="866"/>
     <w:uiPriority w:val="99"/>
     <w:unhideWhenUsed/>
     <w:pPr>
@@ -30913,10 +30983,10 @@
       <w:ind/>
     </w:pPr>
   </w:style>
-  <w:style w:type="character" w:styleId="176">
+  <w:style w:type="character" w:styleId="866">
     <w:name w:val="Header Char"/>
-    <w:basedOn w:val="147"/>
-    <w:link w:val="175"/>
+    <w:basedOn w:val="837"/>
+    <w:link w:val="865"/>
     <w:uiPriority w:val="99"/>
     <w:pPr>
       <w:pBdr/>
@@ -30924,10 +30994,10 @@
       <w:ind/>
     </w:pPr>
   </w:style>
-  <w:style w:type="paragraph" w:styleId="177">
+  <w:style w:type="paragraph" w:styleId="867">
     <w:name w:val="Footer"/>
-    <w:basedOn w:val="660"/>
-    <w:link w:val="178"/>
+    <w:basedOn w:val="886"/>
+    <w:link w:val="868"/>
     <w:uiPriority w:val="99"/>
     <w:unhideWhenUsed/>
     <w:pPr>
@@ -30940,10 +31010,10 @@
       <w:ind/>
     </w:pPr>
   </w:style>
-  <w:style w:type="character" w:styleId="178">
+  <w:style w:type="character" w:styleId="868">
     <w:name w:val="Footer Char"/>
-    <w:basedOn w:val="147"/>
-    <w:link w:val="177"/>
+    <w:basedOn w:val="837"/>
+    <w:link w:val="867"/>
     <w:uiPriority w:val="99"/>
     <w:pPr>
       <w:pBdr/>
@@ -30951,10 +31021,10 @@
       <w:ind/>
     </w:pPr>
   </w:style>
-  <w:style w:type="paragraph" w:styleId="180">
+  <w:style w:type="paragraph" w:styleId="869">
     <w:name w:val="footnote text"/>
-    <w:basedOn w:val="660"/>
-    <w:link w:val="181"/>
+    <w:basedOn w:val="886"/>
+    <w:link w:val="870"/>
     <w:uiPriority w:val="99"/>
     <w:semiHidden/>
     <w:unhideWhenUsed/>
@@ -30968,10 +31038,10 @@
       <w:szCs w:val="20"/>
     </w:rPr>
   </w:style>
-  <w:style w:type="character" w:styleId="181">
+  <w:style w:type="character" w:styleId="870">
     <w:name w:val="Footnote Text Char"/>
-    <w:basedOn w:val="147"/>
-    <w:link w:val="180"/>
+    <w:basedOn w:val="837"/>
+    <w:link w:val="869"/>
     <w:uiPriority w:val="99"/>
     <w:semiHidden/>
     <w:pPr>
@@ -30984,9 +31054,9 @@
       <w:szCs w:val="20"/>
     </w:rPr>
   </w:style>
-  <w:style w:type="character" w:styleId="182">
+  <w:style w:type="character" w:styleId="871">
     <w:name w:val="footnote reference"/>
-    <w:basedOn w:val="147"/>
+    <w:basedOn w:val="837"/>
     <w:uiPriority w:val="99"/>
     <w:semiHidden/>
     <w:unhideWhenUsed/>
@@ -30999,10 +31069,10 @@
       <w:vertAlign w:val="superscript"/>
     </w:rPr>
   </w:style>
-  <w:style w:type="paragraph" w:styleId="183">
+  <w:style w:type="paragraph" w:styleId="872">
     <w:name w:val="endnote text"/>
-    <w:basedOn w:val="660"/>
-    <w:link w:val="184"/>
+    <w:basedOn w:val="886"/>
+    <w:link w:val="873"/>
     <w:uiPriority w:val="99"/>
     <w:semiHidden/>
     <w:unhideWhenUsed/>
@@ -31016,10 +31086,10 @@
       <w:szCs w:val="20"/>
     </w:rPr>
   </w:style>
-  <w:style w:type="character" w:styleId="184">
+  <w:style w:type="character" w:styleId="873">
     <w:name w:val="Endnote Text Char"/>
-    <w:basedOn w:val="147"/>
-    <w:link w:val="183"/>
+    <w:basedOn w:val="837"/>
+    <w:link w:val="872"/>
     <w:uiPriority w:val="99"/>
     <w:semiHidden/>
     <w:pPr>
@@ -31032,9 +31102,9 @@
       <w:szCs w:val="20"/>
     </w:rPr>
   </w:style>
-  <w:style w:type="character" w:styleId="185">
+  <w:style w:type="character" w:styleId="874">
     <w:name w:val="endnote reference"/>
-    <w:basedOn w:val="147"/>
+    <w:basedOn w:val="837"/>
     <w:uiPriority w:val="99"/>
     <w:semiHidden/>
     <w:unhideWhenUsed/>
@@ -31047,10 +31117,10 @@
       <w:vertAlign w:val="superscript"/>
     </w:rPr>
   </w:style>
-  <w:style w:type="paragraph" w:styleId="188">
+  <w:style w:type="paragraph" w:styleId="875">
     <w:name w:val="toc 1"/>
-    <w:basedOn w:val="660"/>
-    <w:next w:val="660"/>
+    <w:basedOn w:val="886"/>
+    <w:next w:val="886"/>
     <w:uiPriority w:val="39"/>
     <w:unhideWhenUsed/>
     <w:pPr>
@@ -31059,10 +31129,10 @@
       <w:ind/>
     </w:pPr>
   </w:style>
-  <w:style w:type="paragraph" w:styleId="189">
+  <w:style w:type="paragraph" w:styleId="876">
     <w:name w:val="toc 2"/>
-    <w:basedOn w:val="660"/>
-    <w:next w:val="660"/>
+    <w:basedOn w:val="886"/>
+    <w:next w:val="886"/>
     <w:uiPriority w:val="39"/>
     <w:unhideWhenUsed/>
     <w:pPr>
@@ -31071,10 +31141,10 @@
       <w:ind w:left="220"/>
     </w:pPr>
   </w:style>
-  <w:style w:type="paragraph" w:styleId="190">
+  <w:style w:type="paragraph" w:styleId="877">
     <w:name w:val="toc 3"/>
-    <w:basedOn w:val="660"/>
-    <w:next w:val="660"/>
+    <w:basedOn w:val="886"/>
+    <w:next w:val="886"/>
     <w:uiPriority w:val="39"/>
     <w:unhideWhenUsed/>
     <w:pPr>
@@ -31083,10 +31153,10 @@
       <w:ind w:left="440"/>
     </w:pPr>
   </w:style>
-  <w:style w:type="paragraph" w:styleId="191">
+  <w:style w:type="paragraph" w:styleId="878">
     <w:name w:val="toc 4"/>
-    <w:basedOn w:val="660"/>
-    <w:next w:val="660"/>
+    <w:basedOn w:val="886"/>
+    <w:next w:val="886"/>
     <w:uiPriority w:val="39"/>
     <w:unhideWhenUsed/>
     <w:pPr>
@@ -31095,10 +31165,10 @@
       <w:ind w:left="660"/>
     </w:pPr>
   </w:style>
-  <w:style w:type="paragraph" w:styleId="192">
+  <w:style w:type="paragraph" w:styleId="879">
     <w:name w:val="toc 5"/>
-    <w:basedOn w:val="660"/>
-    <w:next w:val="660"/>
+    <w:basedOn w:val="886"/>
+    <w:next w:val="886"/>
     <w:uiPriority w:val="39"/>
     <w:unhideWhenUsed/>
     <w:pPr>
@@ -31107,10 +31177,10 @@
       <w:ind w:left="880"/>
     </w:pPr>
   </w:style>
-  <w:style w:type="paragraph" w:styleId="193">
+  <w:style w:type="paragraph" w:styleId="880">
     <w:name w:val="toc 6"/>
-    <w:basedOn w:val="660"/>
-    <w:next w:val="660"/>
+    <w:basedOn w:val="886"/>
+    <w:next w:val="886"/>
     <w:uiPriority w:val="39"/>
     <w:unhideWhenUsed/>
     <w:pPr>
@@ -31119,10 +31189,10 @@
       <w:ind w:left="1100"/>
     </w:pPr>
   </w:style>
-  <w:style w:type="paragraph" w:styleId="194">
+  <w:style w:type="paragraph" w:styleId="881">
     <w:name w:val="toc 7"/>
-    <w:basedOn w:val="660"/>
-    <w:next w:val="660"/>
+    <w:basedOn w:val="886"/>
+    <w:next w:val="886"/>
     <w:uiPriority w:val="39"/>
     <w:unhideWhenUsed/>
     <w:pPr>
@@ -31131,10 +31201,10 @@
       <w:ind w:left="1320"/>
     </w:pPr>
   </w:style>
-  <w:style w:type="paragraph" w:styleId="195">
+  <w:style w:type="paragraph" w:styleId="882">
     <w:name w:val="toc 8"/>
-    <w:basedOn w:val="660"/>
-    <w:next w:val="660"/>
+    <w:basedOn w:val="886"/>
+    <w:next w:val="886"/>
     <w:uiPriority w:val="39"/>
     <w:unhideWhenUsed/>
     <w:pPr>
@@ -31143,10 +31213,10 @@
       <w:ind w:left="1540"/>
     </w:pPr>
   </w:style>
-  <w:style w:type="paragraph" w:styleId="196">
+  <w:style w:type="paragraph" w:styleId="883">
     <w:name w:val="toc 9"/>
-    <w:basedOn w:val="660"/>
-    <w:next w:val="660"/>
+    <w:basedOn w:val="886"/>
+    <w:next w:val="886"/>
     <w:uiPriority w:val="39"/>
     <w:unhideWhenUsed/>
     <w:pPr>
@@ -31155,7 +31225,7 @@
       <w:ind w:left="1760"/>
     </w:pPr>
   </w:style>
-  <w:style w:type="paragraph" w:styleId="206">
+  <w:style w:type="paragraph" w:styleId="884">
     <w:name w:val="TOC Heading"/>
     <w:uiPriority w:val="39"/>
     <w:unhideWhenUsed/>
@@ -31165,10 +31235,10 @@
       <w:ind/>
     </w:pPr>
   </w:style>
-  <w:style w:type="paragraph" w:styleId="207">
+  <w:style w:type="paragraph" w:styleId="885">
     <w:name w:val="table of figures"/>
-    <w:basedOn w:val="660"/>
-    <w:next w:val="660"/>
+    <w:basedOn w:val="886"/>
+    <w:next w:val="886"/>
     <w:uiPriority w:val="99"/>
     <w:unhideWhenUsed/>
     <w:pPr>
@@ -31177,7 +31247,7 @@
       <w:ind/>
     </w:pPr>
   </w:style>
-  <w:style w:type="paragraph" w:styleId="660" w:default="1">
+  <w:style w:type="paragraph" w:styleId="886" w:default="1">
     <w:name w:val="Normal"/>
     <w:qFormat/>
     <w:pPr>
@@ -31196,7 +31266,7 @@
       <w:lang w:val="en-US" w:eastAsia="zh-CN" w:bidi="hi-IN"/>
     </w:rPr>
   </w:style>
-  <w:style w:type="character" w:styleId="661">
+  <w:style w:type="character" w:styleId="887">
     <w:name w:val="Hyperlink"/>
     <w:pPr>
       <w:pBdr/>
@@ -31208,7 +31278,7 @@
       <w:u w:val="single"/>
     </w:rPr>
   </w:style>
-  <w:style w:type="character" w:styleId="662">
+  <w:style w:type="character" w:styleId="888">
     <w:name w:val="FollowedHyperlink"/>
     <w:pPr>
       <w:pBdr/>
@@ -31220,10 +31290,10 @@
       <w:u w:val="single"/>
     </w:rPr>
   </w:style>
-  <w:style w:type="paragraph" w:styleId="663">
+  <w:style w:type="paragraph" w:styleId="889">
     <w:name w:val="Heading"/>
-    <w:basedOn w:val="660"/>
-    <w:next w:val="664"/>
+    <w:basedOn w:val="886"/>
+    <w:next w:val="890"/>
     <w:qFormat/>
     <w:pPr>
       <w:keepNext w:val="true"/>
@@ -31237,18 +31307,18 @@
       <w:szCs w:val="28"/>
     </w:rPr>
   </w:style>
-  <w:style w:type="paragraph" w:styleId="664">
+  <w:style w:type="paragraph" w:styleId="890">
     <w:name w:val="Body Text"/>
-    <w:basedOn w:val="660"/>
+    <w:basedOn w:val="886"/>
     <w:pPr>
       <w:pBdr/>
       <w:spacing w:after="140" w:before="0" w:line="276" w:lineRule="auto"/>
       <w:ind/>
     </w:pPr>
   </w:style>
-  <w:style w:type="paragraph" w:styleId="665">
+  <w:style w:type="paragraph" w:styleId="891">
     <w:name w:val="List"/>
-    <w:basedOn w:val="664"/>
+    <w:basedOn w:val="890"/>
     <w:pPr>
       <w:pBdr/>
       <w:spacing/>
@@ -31258,9 +31328,9 @@
       <w:rFonts w:cs="Lohit Devanagari"/>
     </w:rPr>
   </w:style>
-  <w:style w:type="paragraph" w:styleId="666">
+  <w:style w:type="paragraph" w:styleId="892">
     <w:name w:val="Caption"/>
-    <w:basedOn w:val="660"/>
+    <w:basedOn w:val="886"/>
     <w:qFormat/>
     <w:pPr>
       <w:suppressLineNumbers w:val="true"/>
@@ -31276,9 +31346,9 @@
       <w:szCs w:val="24"/>
     </w:rPr>
   </w:style>
-  <w:style w:type="paragraph" w:styleId="667">
+  <w:style w:type="paragraph" w:styleId="893">
     <w:name w:val="Index"/>
-    <w:basedOn w:val="660"/>
+    <w:basedOn w:val="886"/>
     <w:qFormat/>
     <w:pPr>
       <w:suppressLineNumbers w:val="true"/>

</xml_diff>